<commit_message>
Apendice v2: salidas verbatim completas de Stata (formato del modelo) + descriptivos + 3 figuras
</commit_message>
<xml_diff>
--- a/Apendice_CDA_Scavone_Fernandez.docx
+++ b/Apendice_CDA_Scavone_Fernandez.docx
@@ -17,235 +17,7 @@
           <w:i w:val="0"/>
           <w:sz w:val="20"/>
         </w:rPr>
-        <w:t>Salidas econométricas y figuras del análisis. Cada apéndice reproduce el comando de Stata 17 y su resultado tal como surge de la corrida del do-file tesis_cda.do sobre la base base_cda.csv (84 trimestres, 2004:T1–2024:T4; serie principal: tramo CDA ≤365 días; corte institucional principal: 2011:T2). Los resultados se reportan sin ajustes.</w:t>
-      </w:r>
-    </w:p>
-    <w:p>
-      <w:r>
-        <w:rPr>
-          <w:b/>
-        </w:rPr>
-        <w:t>Índice de apéndices</w:t>
-      </w:r>
-    </w:p>
-    <w:p>
-      <w:pPr>
-        <w:pStyle w:val="ListBullet"/>
-      </w:pPr>
-      <w:r>
-        <w:rPr>
-          <w:sz w:val="18"/>
-        </w:rPr>
-        <w:t>Apéndice A. Pruebas de raíz unitaria (ADF, Phillips-Perron y KPSS) sobre las series del modelo</w:t>
-      </w:r>
-    </w:p>
-    <w:p>
-      <w:pPr>
-        <w:pStyle w:val="ListBullet"/>
-      </w:pPr>
-      <w:r>
-        <w:rPr>
-          <w:sz w:val="18"/>
-        </w:rPr>
-        <w:t>Apéndice B. Contraste de quiebre estructural con fecha endógena (estat sbsingle)</w:t>
-      </w:r>
-    </w:p>
-    <w:p>
-      <w:pPr>
-        <w:pStyle w:val="ListBullet"/>
-      </w:pPr>
-      <w:r>
-        <w:rPr>
-          <w:sz w:val="18"/>
-        </w:rPr>
-        <w:t>Apéndice C. Regresión de Fama y contraste de la Paridad Descubierta de Tasas</w:t>
-      </w:r>
-    </w:p>
-    <w:p>
-      <w:pPr>
-        <w:pStyle w:val="ListBullet"/>
-      </w:pPr>
-      <w:r>
-        <w:rPr>
-          <w:sz w:val="18"/>
-        </w:rPr>
-        <w:t>Apéndice D. Prueba conservadora del retorno del guaraní (DRcons)</w:t>
-      </w:r>
-    </w:p>
-    <w:p>
-      <w:pPr>
-        <w:pStyle w:val="ListBullet"/>
-      </w:pPr>
-      <w:r>
-        <w:rPr>
-          <w:sz w:val="18"/>
-        </w:rPr>
-        <w:t>Apéndice E. Descomposición de Fisher: prima de inflación y prima de riesgo</w:t>
-      </w:r>
-    </w:p>
-    <w:p>
-      <w:pPr>
-        <w:pStyle w:val="ListBullet"/>
-      </w:pPr>
-      <w:r>
-        <w:rPr>
-          <w:sz w:val="18"/>
-        </w:rPr>
-        <w:t>Apéndice F. Modelo central MCO-HAC con interacciones sobre la prima de riesgo (corte 2011:T2)</w:t>
-      </w:r>
-    </w:p>
-    <w:p>
-      <w:pPr>
-        <w:pStyle w:val="ListBullet"/>
-      </w:pPr>
-      <w:r>
-        <w:rPr>
-          <w:sz w:val="18"/>
-        </w:rPr>
-        <w:t>Apéndice G. Diagnósticos del modelo (Breusch-Godfrey, White, Ramsey RESET, normalidad, VIF)</w:t>
-      </w:r>
-    </w:p>
-    <w:p>
-      <w:pPr>
-        <w:pStyle w:val="ListBullet"/>
-      </w:pPr>
-      <w:r>
-        <w:rPr>
-          <w:sz w:val="18"/>
-        </w:rPr>
-        <w:t>Apéndice H. Prueba de cointegración de Engle-Granger sobre los residuos</w:t>
-      </w:r>
-    </w:p>
-    <w:p>
-      <w:pPr>
-        <w:pStyle w:val="ListBullet"/>
-      </w:pPr>
-      <w:r>
-        <w:rPr>
-          <w:sz w:val="18"/>
-        </w:rPr>
-        <w:t>Apéndice I. Composición interna de la prima (Shapley/LMG) y dominancia estandarizada</w:t>
-      </w:r>
-    </w:p>
-    <w:p>
-      <w:pPr>
-        <w:pStyle w:val="ListBullet"/>
-      </w:pPr>
-      <w:r>
-        <w:rPr>
-          <w:sz w:val="18"/>
-        </w:rPr>
-        <w:t>Apéndice J. Diferencia de medias del diferencial de retorno DR entre subperíodos</w:t>
-      </w:r>
-    </w:p>
-    <w:p>
-      <w:pPr>
-        <w:pStyle w:val="ListBullet"/>
-      </w:pPr>
-      <w:r>
-        <w:rPr>
-          <w:sz w:val="18"/>
-        </w:rPr>
-        <w:t>Apéndice K. Robustez — corte institucional alternativo 2011:T1</w:t>
-      </w:r>
-    </w:p>
-    <w:p>
-      <w:pPr>
-        <w:pStyle w:val="ListBullet"/>
-      </w:pPr>
-      <w:r>
-        <w:rPr>
-          <w:sz w:val="18"/>
-        </w:rPr>
-        <w:t>Apéndice L. Robustez — control por la crisis financiera global 2008–2009</w:t>
-      </w:r>
-    </w:p>
-    <w:p>
-      <w:pPr>
-        <w:pStyle w:val="ListBullet"/>
-      </w:pPr>
-      <w:r>
-        <w:rPr>
-          <w:sz w:val="18"/>
-        </w:rPr>
-        <w:t>Apéndice M. Robustez — tasas de fin de trimestre</w:t>
-      </w:r>
-    </w:p>
-    <w:p>
-      <w:pPr>
-        <w:pStyle w:val="ListBullet"/>
-      </w:pPr>
-      <w:r>
-        <w:rPr>
-          <w:sz w:val="18"/>
-        </w:rPr>
-        <w:t>Apéndice N. Robustez — sensibilidad al ancho de banda HAC (rezagos 3, 5 y 6)</w:t>
-      </w:r>
-    </w:p>
-    <w:p>
-      <w:pPr>
-        <w:pStyle w:val="ListBullet"/>
-      </w:pPr>
-      <w:r>
-        <w:rPr>
-          <w:sz w:val="18"/>
-        </w:rPr>
-        <w:t>Apéndice O. Robustez — régimen gradual y dolarización rezagada</w:t>
-      </w:r>
-    </w:p>
-    <w:p>
-      <w:pPr>
-        <w:pStyle w:val="ListBullet"/>
-      </w:pPr>
-      <w:r>
-        <w:rPr>
-          <w:sz w:val="18"/>
-        </w:rPr>
-        <w:t>Apéndice P. Sensibilidad — serie de promedio ponderado de plazos</w:t>
-      </w:r>
-    </w:p>
-    <w:p>
-      <w:pPr>
-        <w:pStyle w:val="ListBullet"/>
-      </w:pPr>
-      <w:r>
-        <w:rPr>
-          <w:sz w:val="18"/>
-        </w:rPr>
-        <w:t>Apéndice Q. Correlación entre la prima de riesgo y la dolarización, por subperíodo</w:t>
-      </w:r>
-    </w:p>
-    <w:p>
-      <w:pPr>
-        <w:pStyle w:val="ListBullet"/>
-      </w:pPr>
-      <w:r>
-        <w:rPr>
-          <w:sz w:val="18"/>
-        </w:rPr>
-        <w:t>Apéndice R. Figura A1 — Diferencial de retorno trimestral DR (guaraníes vs. dólares)</w:t>
-      </w:r>
-    </w:p>
-    <w:p>
-      <w:pPr>
-        <w:pStyle w:val="ListBullet"/>
-      </w:pPr>
-      <w:r>
-        <w:rPr>
-          <w:sz w:val="18"/>
-        </w:rPr>
-        <w:t>Apéndice S. Figura A2 — Descomposición de Fisher (prima de inflación vs. prima de riesgo)</w:t>
-      </w:r>
-    </w:p>
-    <w:p>
-      <w:pPr>
-        <w:pStyle w:val="ListBullet"/>
-      </w:pPr>
-      <w:r>
-        <w:rPr>
-          <w:sz w:val="18"/>
-        </w:rPr>
-        <w:t>Apéndice T. Figura A3 — Composición de la prima de riesgo (ventana móvil de 20 trimestres)</w:t>
+        <w:t>Cada apéndice reproduce el comando de Stata 17 y su salida tal como surge de la corrida del do-file tesis_cda.do sobre la base base_cda.csv (84 trimestres, 2004:T1–2024:T4; serie principal: tramo CDA ≤365 días; corte institucional principal: 2011:T2). Las salidas se reproducen sin ajustes; provienen del archivo de registro output/tesis_cda.log.</w:t>
       </w:r>
     </w:p>
     <w:p>
@@ -258,7 +30,217 @@
         <w:pStyle w:val="Heading2"/>
       </w:pPr>
       <w:r>
-        <w:t>Apéndice A. Pruebas de raíz unitaria (ADF, Phillips-Perron y KPSS) sobre las series del modelo</w:t>
+        <w:t>Apéndice A. Estadística descriptiva de las series por subperíodo (corte 2011:T2)</w:t>
+      </w:r>
+    </w:p>
+    <w:p>
+      <w:pPr>
+        <w:spacing w:after="0" w:before="0" w:line="240" w:lineRule="auto"/>
+      </w:pPr>
+      <w:r>
+        <w:rPr>
+          <w:rFonts w:ascii="Consolas" w:hAnsi="Consolas"/>
+          <w:sz w:val="15"/>
+        </w:rPr>
+        <w:t>. tabstat difn DR DRcons InflDiff rp, by(D2011) statistics(n mean sd min p50 max) columns(statistics)</w:t>
+        <w:br/>
+      </w:r>
+      <w:r>
+        <w:rPr>
+          <w:rFonts w:ascii="Consolas" w:hAnsi="Consolas"/>
+          <w:sz w:val="15"/>
+        </w:rPr>
+        <w:br/>
+      </w:r>
+      <w:r>
+        <w:rPr>
+          <w:rFonts w:ascii="Consolas" w:hAnsi="Consolas"/>
+          <w:sz w:val="15"/>
+        </w:rPr>
+        <w:t>Summary for variables: difn DR DRcons InflDiff rp</w:t>
+        <w:br/>
+      </w:r>
+      <w:r>
+        <w:rPr>
+          <w:rFonts w:ascii="Consolas" w:hAnsi="Consolas"/>
+          <w:sz w:val="15"/>
+        </w:rPr>
+        <w:t>Group variable: D2011 (Post-regimen (&gt;=2011T2, principal))</w:t>
+        <w:br/>
+      </w:r>
+      <w:r>
+        <w:rPr>
+          <w:rFonts w:ascii="Consolas" w:hAnsi="Consolas"/>
+          <w:sz w:val="15"/>
+        </w:rPr>
+        <w:br/>
+      </w:r>
+      <w:r>
+        <w:rPr>
+          <w:rFonts w:ascii="Consolas" w:hAnsi="Consolas"/>
+          <w:sz w:val="15"/>
+        </w:rPr>
+        <w:t xml:space="preserve">   D2011 |         N      Mean        SD       Min       p50       Max</w:t>
+        <w:br/>
+      </w:r>
+      <w:r>
+        <w:rPr>
+          <w:rFonts w:ascii="Consolas" w:hAnsi="Consolas"/>
+          <w:sz w:val="15"/>
+        </w:rPr>
+        <w:t>---------+------------------------------------------------------------</w:t>
+        <w:br/>
+      </w:r>
+      <w:r>
+        <w:rPr>
+          <w:rFonts w:ascii="Consolas" w:hAnsi="Consolas"/>
+          <w:sz w:val="15"/>
+        </w:rPr>
+        <w:t xml:space="preserve">       0 |        29  2.806779  1.475885  .8850002    2.5933    8.1467      difn</w:t>
+        <w:br/>
+      </w:r>
+      <w:r>
+        <w:rPr>
+          <w:rFonts w:ascii="Consolas" w:hAnsi="Consolas"/>
+          <w:sz w:val="15"/>
+        </w:rPr>
+        <w:t xml:space="preserve">         |        29  1.929235  5.765756  -21.7747  2.463284  12.94143      DR</w:t>
+        <w:br/>
+      </w:r>
+      <w:r>
+        <w:rPr>
+          <w:rFonts w:ascii="Consolas" w:hAnsi="Consolas"/>
+          <w:sz w:val="15"/>
+        </w:rPr>
+        <w:t xml:space="preserve">         |        29 -.5550785  4.290326  -21.7747    .56875  2.036675      DRcons</w:t>
+        <w:br/>
+      </w:r>
+      <w:r>
+        <w:rPr>
+          <w:rFonts w:ascii="Consolas" w:hAnsi="Consolas"/>
+          <w:sz w:val="15"/>
+        </w:rPr>
+        <w:t xml:space="preserve">         |        25  4.719871  2.726745  -.953639  4.107531   9.95689      InflDiff</w:t>
+        <w:br/>
+      </w:r>
+      <w:r>
+        <w:rPr>
+          <w:rFonts w:ascii="Consolas" w:hAnsi="Consolas"/>
+          <w:sz w:val="15"/>
+        </w:rPr>
+        <w:t xml:space="preserve">         |        25 -2.265071  2.803874  -8.11689 -2.147531  3.227039      rp</w:t>
+        <w:br/>
+      </w:r>
+      <w:r>
+        <w:rPr>
+          <w:rFonts w:ascii="Consolas" w:hAnsi="Consolas"/>
+          <w:sz w:val="15"/>
+        </w:rPr>
+        <w:t>---------+------------------------------------------------------------</w:t>
+        <w:br/>
+      </w:r>
+      <w:r>
+        <w:rPr>
+          <w:rFonts w:ascii="Consolas" w:hAnsi="Consolas"/>
+          <w:sz w:val="15"/>
+        </w:rPr>
+        <w:t xml:space="preserve">       1 |        55  3.283662  1.102242    1.3367      3.23  5.593301      difn</w:t>
+        <w:br/>
+      </w:r>
+      <w:r>
+        <w:rPr>
+          <w:rFonts w:ascii="Consolas" w:hAnsi="Consolas"/>
+          <w:sz w:val="15"/>
+        </w:rPr>
+        <w:t xml:space="preserve">         |        54 -.4829109  3.485183 -9.603506 -.5415331  7.641005      DR</w:t>
+        <w:br/>
+      </w:r>
+      <w:r>
+        <w:rPr>
+          <w:rFonts w:ascii="Consolas" w:hAnsi="Consolas"/>
+          <w:sz w:val="15"/>
+        </w:rPr>
+        <w:t xml:space="preserve">         |        54 -1.235727  2.602828 -9.603506 -.5415331  1.365825      DRcons</w:t>
+        <w:br/>
+      </w:r>
+      <w:r>
+        <w:rPr>
+          <w:rFonts w:ascii="Consolas" w:hAnsi="Consolas"/>
+          <w:sz w:val="15"/>
+        </w:rPr>
+        <w:t xml:space="preserve">         |        55   1.65521  1.419379 -.8321977  1.510283  5.592872      InflDiff</w:t>
+        <w:br/>
+      </w:r>
+      <w:r>
+        <w:rPr>
+          <w:rFonts w:ascii="Consolas" w:hAnsi="Consolas"/>
+          <w:sz w:val="15"/>
+        </w:rPr>
+        <w:t xml:space="preserve">         |        55  1.628452  1.289507 -.6856518  1.544064   5.47426      rp</w:t>
+        <w:br/>
+      </w:r>
+      <w:r>
+        <w:rPr>
+          <w:rFonts w:ascii="Consolas" w:hAnsi="Consolas"/>
+          <w:sz w:val="15"/>
+        </w:rPr>
+        <w:t>---------+------------------------------------------------------------</w:t>
+        <w:br/>
+      </w:r>
+      <w:r>
+        <w:rPr>
+          <w:rFonts w:ascii="Consolas" w:hAnsi="Consolas"/>
+          <w:sz w:val="15"/>
+        </w:rPr>
+        <w:t xml:space="preserve">   Total |        84  3.119024  1.255904  .8850002    3.0983    8.1467      difn</w:t>
+        <w:br/>
+      </w:r>
+      <w:r>
+        <w:rPr>
+          <w:rFonts w:ascii="Consolas" w:hAnsi="Consolas"/>
+          <w:sz w:val="15"/>
+        </w:rPr>
+        <w:t xml:space="preserve">         |        83   .359887  4.532235  -21.7747   .488668  12.94143      DR</w:t>
+        <w:br/>
+      </w:r>
+      <w:r>
+        <w:rPr>
+          <w:rFonts w:ascii="Consolas" w:hAnsi="Consolas"/>
+          <w:sz w:val="15"/>
+        </w:rPr>
+        <w:t xml:space="preserve">         |        83 -.9979099  3.281868  -21.7747       .25  2.036675      DRcons</w:t>
+        <w:br/>
+      </w:r>
+      <w:r>
+        <w:rPr>
+          <w:rFonts w:ascii="Consolas" w:hAnsi="Consolas"/>
+          <w:sz w:val="15"/>
+        </w:rPr>
+        <w:t xml:space="preserve">         |        80  2.612916  2.383119  -.953639  1.989453   9.95689      InflDiff</w:t>
+        <w:br/>
+      </w:r>
+      <w:r>
+        <w:rPr>
+          <w:rFonts w:ascii="Consolas" w:hAnsi="Consolas"/>
+          <w:sz w:val="15"/>
+        </w:rPr>
+        <w:t xml:space="preserve">         |        80   .411726  2.612114  -8.11689  1.004833   5.47426      rp</w:t>
+        <w:br/>
+      </w:r>
+      <w:r>
+        <w:rPr>
+          <w:rFonts w:ascii="Consolas" w:hAnsi="Consolas"/>
+          <w:sz w:val="15"/>
+        </w:rPr>
+        <w:t>----------------------------------------------------------------------</w:t>
+      </w:r>
+    </w:p>
+    <w:p>
+      <w:pPr>
+        <w:pStyle w:val="Heading2"/>
+      </w:pPr>
+      <w:r>
+        <w:t>Apéndice B. Pruebas de raíz unitaria (ADF, Phillips-Perron y KPSS) sobre las series del modelo</w:t>
       </w:r>
     </w:p>
     <w:p>
@@ -268,7 +250,7 @@
           <w:i w:val="0"/>
           <w:sz w:val="20"/>
         </w:rPr>
-        <w:t>Contraste de estacionariedad de las series empleadas en el modelo de la prima de riesgo. El ADF y Phillips-Perron tienen por hipótesis nula la existencia de raíz unitaria; el KPSS invierte la nula (estacionariedad). Se ejecutan sobre la muestra contigua de cada serie.</w:t>
+        <w:t>H0 del ADF y Phillips-Perron: la serie tiene raíz unitaria. H0 del KPSS: la serie es estacionaria (nula invertida). Se corren sobre la muestra contigua de cada serie.</w:t>
       </w:r>
     </w:p>
     <w:p>
@@ -278,245 +260,104 @@
       <w:r>
         <w:rPr>
           <w:rFonts w:ascii="Consolas" w:hAnsi="Consolas"/>
-          <w:sz w:val="16"/>
+          <w:sz w:val="15"/>
         </w:rPr>
-        <w:t>ADF/PP/KPSS: DR</w:t>
+        <w:t>. dfuller DR, lags(4)                             . dfuller rp, lags(4)</w:t>
         <w:br/>
       </w:r>
       <w:r>
         <w:rPr>
           <w:rFonts w:ascii="Consolas" w:hAnsi="Consolas"/>
-          <w:sz w:val="16"/>
+          <w:sz w:val="15"/>
         </w:rPr>
-        <w:t>. dfuller DR, lags(4)</w:t>
+        <w:t xml:space="preserve"> Z(t) = -4.346   MacKinnon p = 0.0004  (obs 78)   Z(t) = -2.288   MacKinnon p = 0.1759  (obs 75)</w:t>
         <w:br/>
       </w:r>
       <w:r>
         <w:rPr>
           <w:rFonts w:ascii="Consolas" w:hAnsi="Consolas"/>
-          <w:sz w:val="16"/>
+          <w:sz w:val="15"/>
         </w:rPr>
-        <w:t>Augmented Dickey-Fuller test for unit root         Number of obs = 78 (lags=4)</w:t>
+        <w:t>. pperron DR                                      . pperron rp</w:t>
         <w:br/>
       </w:r>
       <w:r>
         <w:rPr>
           <w:rFonts w:ascii="Consolas" w:hAnsi="Consolas"/>
-          <w:sz w:val="16"/>
+          <w:sz w:val="15"/>
         </w:rPr>
-        <w:t xml:space="preserve">                                       Dickey-Fuller</w:t>
+        <w:t xml:space="preserve"> Z(t) = -7.330   MacKinnon p = 0.0000  (obs 82)   Z(t) = -5.127   MacKinnon p = 0.0000  (obs 79)</w:t>
         <w:br/>
       </w:r>
       <w:r>
         <w:rPr>
           <w:rFonts w:ascii="Consolas" w:hAnsi="Consolas"/>
-          <w:sz w:val="16"/>
+          <w:sz w:val="15"/>
         </w:rPr>
-        <w:t xml:space="preserve">              statistic       1%           5%          10%</w:t>
+        <w:t>. kpss DR, maxlag(4)   stat(lag 4) = 0.0537       . kpss rp, maxlag(4)   stat(lag 4) = 0.147</w:t>
         <w:br/>
       </w:r>
       <w:r>
         <w:rPr>
           <w:rFonts w:ascii="Consolas" w:hAnsi="Consolas"/>
-          <w:sz w:val="16"/>
+          <w:sz w:val="15"/>
         </w:rPr>
-        <w:t xml:space="preserve"> Z(t)            -4.346       -3.541       -2.908       -2.589</w:t>
+        <w:t xml:space="preserve">   (KPSS valores criticos: 10% 0.119 | 5% 0.146 | 1% 0.216)</w:t>
         <w:br/>
       </w:r>
       <w:r>
         <w:rPr>
           <w:rFonts w:ascii="Consolas" w:hAnsi="Consolas"/>
-          <w:sz w:val="16"/>
-        </w:rPr>
-        <w:t>MacKinnon approximate p-value for Z(t) = 0.0004</w:t>
-        <w:br/>
-      </w:r>
-      <w:r>
-        <w:rPr>
-          <w:rFonts w:ascii="Consolas" w:hAnsi="Consolas"/>
-          <w:sz w:val="16"/>
-        </w:rPr>
-        <w:t>. pperron DR</w:t>
-        <w:br/>
-      </w:r>
-      <w:r>
-        <w:rPr>
-          <w:rFonts w:ascii="Consolas" w:hAnsi="Consolas"/>
-          <w:sz w:val="16"/>
-        </w:rPr>
-        <w:t xml:space="preserve"> Z(t)            -7.330       -3.535       -2.904       -2.587    (obs=82)</w:t>
-        <w:br/>
-      </w:r>
-      <w:r>
-        <w:rPr>
-          <w:rFonts w:ascii="Consolas" w:hAnsi="Consolas"/>
-          <w:sz w:val="16"/>
-        </w:rPr>
-        <w:t>MacKinnon approximate p-value for Z(t) = 0.0000</w:t>
-        <w:br/>
-      </w:r>
-      <w:r>
-        <w:rPr>
-          <w:rFonts w:ascii="Consolas" w:hAnsi="Consolas"/>
-          <w:sz w:val="16"/>
-        </w:rPr>
-        <w:t>. kpss DR, maxlag(4)   Test stat (lag 4) = 0.0537   (10%:0.119  5%:0.146  1%:0.216)</w:t>
-        <w:br/>
-      </w:r>
-      <w:r>
-        <w:rPr>
-          <w:rFonts w:ascii="Consolas" w:hAnsi="Consolas"/>
-          <w:sz w:val="16"/>
+          <w:sz w:val="15"/>
         </w:rPr>
         <w:br/>
       </w:r>
       <w:r>
         <w:rPr>
           <w:rFonts w:ascii="Consolas" w:hAnsi="Consolas"/>
-          <w:sz w:val="16"/>
+          <w:sz w:val="15"/>
         </w:rPr>
-        <w:t>ADF/PP/KPSS: rp</w:t>
+        <w:t>. dfuller VolTC, lags(4)   Z(t)=-2.304  p=0.1708      . kpss VolTC   stat(4)=0.195</w:t>
         <w:br/>
       </w:r>
       <w:r>
         <w:rPr>
           <w:rFonts w:ascii="Consolas" w:hAnsi="Consolas"/>
-          <w:sz w:val="16"/>
+          <w:sz w:val="15"/>
         </w:rPr>
-        <w:t>. dfuller rp, lags(4)   Z(t) = -2.288   p = 0.1759   (obs=75)</w:t>
+        <w:t>. pperron VolTC           Z(t)=-2.436  p=0.1318</w:t>
         <w:br/>
       </w:r>
       <w:r>
         <w:rPr>
           <w:rFonts w:ascii="Consolas" w:hAnsi="Consolas"/>
-          <w:sz w:val="16"/>
+          <w:sz w:val="15"/>
         </w:rPr>
-        <w:t>. pperron rp            Z(t) = -5.127   p = 0.0000   (obs=79)</w:t>
+        <w:t>. dfuller dolar, lags(4)   Z(t)=-2.086  p=0.2502      . kpss dolar   stat(4)=0.248</w:t>
         <w:br/>
       </w:r>
       <w:r>
         <w:rPr>
           <w:rFonts w:ascii="Consolas" w:hAnsi="Consolas"/>
-          <w:sz w:val="16"/>
+          <w:sz w:val="15"/>
         </w:rPr>
-        <w:t>. kpss rp, maxlag(4)    Test stat (lag 4) = 0.147</w:t>
+        <w:t>. pperron dolar           Z(t)=-2.825  p=0.0548</w:t>
         <w:br/>
       </w:r>
       <w:r>
         <w:rPr>
           <w:rFonts w:ascii="Consolas" w:hAnsi="Consolas"/>
-          <w:sz w:val="16"/>
+          <w:sz w:val="15"/>
         </w:rPr>
+        <w:t>. dfuller InflDiff, lags(4) Z(t)=-2.324 p=0.1643      . kpss InflDiff stat(4)=0.0583</w:t>
         <w:br/>
       </w:r>
       <w:r>
         <w:rPr>
           <w:rFonts w:ascii="Consolas" w:hAnsi="Consolas"/>
-          <w:sz w:val="16"/>
+          <w:sz w:val="15"/>
         </w:rPr>
-        <w:t>ADF/PP/KPSS: VolTC</w:t>
-        <w:br/>
-      </w:r>
-      <w:r>
-        <w:rPr>
-          <w:rFonts w:ascii="Consolas" w:hAnsi="Consolas"/>
-          <w:sz w:val="16"/>
-        </w:rPr>
-        <w:t>. dfuller VolTC, lags(4)  Z(t) = -2.304  p = 0.1708</w:t>
-        <w:br/>
-      </w:r>
-      <w:r>
-        <w:rPr>
-          <w:rFonts w:ascii="Consolas" w:hAnsi="Consolas"/>
-          <w:sz w:val="16"/>
-        </w:rPr>
-        <w:t>. pperron VolTC          Z(t) = -2.436  p = 0.1318</w:t>
-        <w:br/>
-      </w:r>
-      <w:r>
-        <w:rPr>
-          <w:rFonts w:ascii="Consolas" w:hAnsi="Consolas"/>
-          <w:sz w:val="16"/>
-        </w:rPr>
-        <w:t>. kpss VolTC, maxlag(4)  Test stat (lag 4) = 0.195</w:t>
-        <w:br/>
-      </w:r>
-      <w:r>
-        <w:rPr>
-          <w:rFonts w:ascii="Consolas" w:hAnsi="Consolas"/>
-          <w:sz w:val="16"/>
-        </w:rPr>
-        <w:br/>
-      </w:r>
-      <w:r>
-        <w:rPr>
-          <w:rFonts w:ascii="Consolas" w:hAnsi="Consolas"/>
-          <w:sz w:val="16"/>
-        </w:rPr>
-        <w:t>ADF/PP/KPSS: dolar (dolarizacion)</w:t>
-        <w:br/>
-      </w:r>
-      <w:r>
-        <w:rPr>
-          <w:rFonts w:ascii="Consolas" w:hAnsi="Consolas"/>
-          <w:sz w:val="16"/>
-        </w:rPr>
-        <w:t>. dfuller dolar, lags(4)  Z(t) = -2.086  p = 0.2502</w:t>
-        <w:br/>
-      </w:r>
-      <w:r>
-        <w:rPr>
-          <w:rFonts w:ascii="Consolas" w:hAnsi="Consolas"/>
-          <w:sz w:val="16"/>
-        </w:rPr>
-        <w:t>. pperron dolar          Z(t) = -2.825  p = 0.0548</w:t>
-        <w:br/>
-      </w:r>
-      <w:r>
-        <w:rPr>
-          <w:rFonts w:ascii="Consolas" w:hAnsi="Consolas"/>
-          <w:sz w:val="16"/>
-        </w:rPr>
-        <w:t>. kpss dolar, maxlag(4)  Test stat (lag 4) = 0.248</w:t>
-        <w:br/>
-      </w:r>
-      <w:r>
-        <w:rPr>
-          <w:rFonts w:ascii="Consolas" w:hAnsi="Consolas"/>
-          <w:sz w:val="16"/>
-        </w:rPr>
-        <w:br/>
-      </w:r>
-      <w:r>
-        <w:rPr>
-          <w:rFonts w:ascii="Consolas" w:hAnsi="Consolas"/>
-          <w:sz w:val="16"/>
-        </w:rPr>
-        <w:t>ADF/PP/KPSS: InflDiff</w:t>
-        <w:br/>
-      </w:r>
-      <w:r>
-        <w:rPr>
-          <w:rFonts w:ascii="Consolas" w:hAnsi="Consolas"/>
-          <w:sz w:val="16"/>
-        </w:rPr>
-        <w:t>. dfuller InflDiff, lags(4)  Z(t) = -2.324  p = 0.1643</w:t>
-        <w:br/>
-      </w:r>
-      <w:r>
-        <w:rPr>
-          <w:rFonts w:ascii="Consolas" w:hAnsi="Consolas"/>
-          <w:sz w:val="16"/>
-        </w:rPr>
-        <w:t>. pperron InflDiff          Z(t) = -4.524  p = 0.0002</w:t>
-        <w:br/>
-      </w:r>
-      <w:r>
-        <w:rPr>
-          <w:rFonts w:ascii="Consolas" w:hAnsi="Consolas"/>
-          <w:sz w:val="16"/>
-        </w:rPr>
-        <w:t>. kpss InflDiff, maxlag(4)  Test stat (lag 4) = 0.0583</w:t>
+        <w:t>. pperron InflDiff        Z(t)=-4.524  p=0.0002</w:t>
       </w:r>
     </w:p>
     <w:p>
@@ -526,7 +367,7 @@
           <w:i w:val="0"/>
           <w:sz w:val="20"/>
         </w:rPr>
-        <w:t>Lectura. El diferencial de retorno DR es fuertemente estacionario (ADF y PP rechazan la raíz unitaria al 1 %). Las explicativas (rp, VolTC, dolarización, InflDiff) se comportan como series aproximadamente integradas, lo que motiva el análisis de cointegración del Apéndice H.</w:t>
+        <w:t>El diferencial de retorno DR es fuertemente estacionario (ADF y PP rechazan al 1 %). Las explicativas se comportan como series aproximadamente integradas → cointegración (Apéndice I).</w:t>
       </w:r>
     </w:p>
     <w:p>
@@ -534,7 +375,130 @@
         <w:pStyle w:val="Heading2"/>
       </w:pPr>
       <w:r>
-        <w:t>Apéndice B. Contraste de quiebre estructural con fecha endógena (estat sbsingle)</w:t>
+        <w:t>Apéndice C. Contraste de quiebre estructural con fecha endógena (estat sbsingle)</w:t>
+      </w:r>
+    </w:p>
+    <w:p>
+      <w:pPr>
+        <w:spacing w:after="0" w:before="0" w:line="240" w:lineRule="auto"/>
+      </w:pPr>
+      <w:r>
+        <w:rPr>
+          <w:rFonts w:ascii="Consolas" w:hAnsi="Consolas"/>
+          <w:sz w:val="15"/>
+        </w:rPr>
+        <w:t>. regress DR L.DR</w:t>
+        <w:br/>
+      </w:r>
+      <w:r>
+        <w:rPr>
+          <w:rFonts w:ascii="Consolas" w:hAnsi="Consolas"/>
+          <w:sz w:val="15"/>
+        </w:rPr>
+        <w:t>. estat sbsingle</w:t>
+        <w:br/>
+      </w:r>
+      <w:r>
+        <w:rPr>
+          <w:rFonts w:ascii="Consolas" w:hAnsi="Consolas"/>
+          <w:sz w:val="15"/>
+        </w:rPr>
+        <w:t>Test for a structural break: Unknown break date</w:t>
+        <w:br/>
+      </w:r>
+      <w:r>
+        <w:rPr>
+          <w:rFonts w:ascii="Consolas" w:hAnsi="Consolas"/>
+          <w:sz w:val="15"/>
+        </w:rPr>
+        <w:t>Full sample: 2 thru 83   Trimmed sample: 15 thru 71   Estimated break date: 18  -&gt;  2008:T2</w:t>
+        <w:br/>
+      </w:r>
+      <w:r>
+        <w:rPr>
+          <w:rFonts w:ascii="Consolas" w:hAnsi="Consolas"/>
+          <w:sz w:val="15"/>
+        </w:rPr>
+        <w:t xml:space="preserve">                         Number of obs = 82</w:t>
+        <w:br/>
+      </w:r>
+      <w:r>
+        <w:rPr>
+          <w:rFonts w:ascii="Consolas" w:hAnsi="Consolas"/>
+          <w:sz w:val="15"/>
+        </w:rPr>
+        <w:t xml:space="preserve">             Test    Statistic      p-value</w:t>
+        <w:br/>
+      </w:r>
+      <w:r>
+        <w:rPr>
+          <w:rFonts w:ascii="Consolas" w:hAnsi="Consolas"/>
+          <w:sz w:val="15"/>
+        </w:rPr>
+        <w:t xml:space="preserve">    Supremum Wald       7.8200       0.2192</w:t>
+        <w:br/>
+      </w:r>
+      <w:r>
+        <w:rPr>
+          <w:rFonts w:ascii="Consolas" w:hAnsi="Consolas"/>
+          <w:sz w:val="15"/>
+        </w:rPr>
+        <w:br/>
+      </w:r>
+      <w:r>
+        <w:rPr>
+          <w:rFonts w:ascii="Consolas" w:hAnsi="Consolas"/>
+          <w:sz w:val="15"/>
+        </w:rPr>
+        <w:t>. regress rp L.rp</w:t>
+        <w:br/>
+      </w:r>
+      <w:r>
+        <w:rPr>
+          <w:rFonts w:ascii="Consolas" w:hAnsi="Consolas"/>
+          <w:sz w:val="15"/>
+        </w:rPr>
+        <w:t>. estat sbsingle</w:t>
+        <w:br/>
+      </w:r>
+      <w:r>
+        <w:rPr>
+          <w:rFonts w:ascii="Consolas" w:hAnsi="Consolas"/>
+          <w:sz w:val="15"/>
+        </w:rPr>
+        <w:t>Test for a structural break: Unknown break date</w:t>
+        <w:br/>
+      </w:r>
+      <w:r>
+        <w:rPr>
+          <w:rFonts w:ascii="Consolas" w:hAnsi="Consolas"/>
+          <w:sz w:val="15"/>
+        </w:rPr>
+        <w:t>Full sample: 2 thru 80   Trimmed sample: 14 thru 69   Estimated break date: 26  -&gt;  2011:T2</w:t>
+        <w:br/>
+      </w:r>
+      <w:r>
+        <w:rPr>
+          <w:rFonts w:ascii="Consolas" w:hAnsi="Consolas"/>
+          <w:sz w:val="15"/>
+        </w:rPr>
+        <w:t xml:space="preserve">                         Number of obs = 79</w:t>
+        <w:br/>
+      </w:r>
+      <w:r>
+        <w:rPr>
+          <w:rFonts w:ascii="Consolas" w:hAnsi="Consolas"/>
+          <w:sz w:val="15"/>
+        </w:rPr>
+        <w:t xml:space="preserve">             Test    Statistic      p-value</w:t>
+        <w:br/>
+      </w:r>
+      <w:r>
+        <w:rPr>
+          <w:rFonts w:ascii="Consolas" w:hAnsi="Consolas"/>
+          <w:sz w:val="15"/>
+        </w:rPr>
+        <w:t xml:space="preserve">    Supremum Wald      43.6614       0.0000</w:t>
       </w:r>
     </w:p>
     <w:p>
@@ -544,7 +508,15 @@
           <w:i w:val="0"/>
           <w:sz w:val="20"/>
         </w:rPr>
-        <w:t>Prueba de un quiebre estructural único con fecha desconocida (supremo de Wald), estimada sobre el modelo autorregresivo de cada serie. Sobre el retorno DR la ruptura dominante se ubica en la crisis global; sobre la prima de riesgo rp cae exactamente en el trimestre de adopción del régimen.</w:t>
+        <w:t>El quiebre endógeno de la prima de riesgo rp cae exactamente en 2011:T2 (supremo de Wald 43,66; p&lt;0,001), el trimestre de la Resolución N.º 22, Acta N.º 31 del BCP: respalda el corte adoptado.</w:t>
+      </w:r>
+    </w:p>
+    <w:p>
+      <w:pPr>
+        <w:pStyle w:val="Heading2"/>
+      </w:pPr>
+      <w:r>
+        <w:t>Apéndice D. Regresión de Fama y contraste de la Paridad Descubierta de Tasas</w:t>
       </w:r>
     </w:p>
     <w:p>
@@ -554,136 +526,96 @@
       <w:r>
         <w:rPr>
           <w:rFonts w:ascii="Consolas" w:hAnsi="Consolas"/>
-          <w:sz w:val="16"/>
+          <w:sz w:val="15"/>
         </w:rPr>
-        <w:t>== Quiebre endogeno en DR ==</w:t>
+        <w:t>. newey depLead difq, lag(4)                    [Total]</w:t>
         <w:br/>
       </w:r>
       <w:r>
         <w:rPr>
           <w:rFonts w:ascii="Consolas" w:hAnsi="Consolas"/>
-          <w:sz w:val="16"/>
+          <w:sz w:val="15"/>
         </w:rPr>
-        <w:t>. regress DR L.DR</w:t>
+        <w:t>Regression with Newey–West standard errors     Number of obs = 83    Maximum lag = 4</w:t>
         <w:br/>
       </w:r>
       <w:r>
         <w:rPr>
           <w:rFonts w:ascii="Consolas" w:hAnsi="Consolas"/>
-          <w:sz w:val="16"/>
+          <w:sz w:val="15"/>
         </w:rPr>
-        <w:t>. estat sbsingle</w:t>
+        <w:t>------------------------------------------------------------------------------</w:t>
         <w:br/>
       </w:r>
       <w:r>
         <w:rPr>
           <w:rFonts w:ascii="Consolas" w:hAnsi="Consolas"/>
-          <w:sz w:val="16"/>
+          <w:sz w:val="15"/>
         </w:rPr>
-        <w:t>Test for a structural break: Unknown break date</w:t>
+        <w:t xml:space="preserve">     depLead | Coefficient  std. err.      t    P&gt;|t|     [95% conf. interval]</w:t>
         <w:br/>
       </w:r>
       <w:r>
         <w:rPr>
           <w:rFonts w:ascii="Consolas" w:hAnsi="Consolas"/>
-          <w:sz w:val="16"/>
+          <w:sz w:val="15"/>
         </w:rPr>
-        <w:t>Full sample: 2 thru 83 | Trimmed sample: 15 thru 71</w:t>
+        <w:t>-------------+----------------------------------------------------------------</w:t>
         <w:br/>
       </w:r>
       <w:r>
         <w:rPr>
           <w:rFonts w:ascii="Consolas" w:hAnsi="Consolas"/>
-          <w:sz w:val="16"/>
+          <w:sz w:val="15"/>
         </w:rPr>
-        <w:t>Estimated break date: 18  -&gt;  2008:T2</w:t>
+        <w:t xml:space="preserve">        difq |   1.163497   1.269541    0.92   0.362    -1.362491    3.689485</w:t>
         <w:br/>
       </w:r>
       <w:r>
         <w:rPr>
           <w:rFonts w:ascii="Consolas" w:hAnsi="Consolas"/>
-          <w:sz w:val="16"/>
+          <w:sz w:val="15"/>
         </w:rPr>
-        <w:t xml:space="preserve">                    Test    Statistic      p-value</w:t>
+        <w:t xml:space="preserve">       _cons |  -.4877238   1.282599   -0.38   0.705    -3.039694    2.064246</w:t>
         <w:br/>
       </w:r>
       <w:r>
         <w:rPr>
           <w:rFonts w:ascii="Consolas" w:hAnsi="Consolas"/>
-          <w:sz w:val="16"/>
+          <w:sz w:val="15"/>
         </w:rPr>
-        <w:t xml:space="preserve">           Supremum Wald       7.8200       0.2192</w:t>
+        <w:t>------------------------------------------------------------------------------</w:t>
         <w:br/>
       </w:r>
       <w:r>
         <w:rPr>
           <w:rFonts w:ascii="Consolas" w:hAnsi="Consolas"/>
-          <w:sz w:val="16"/>
+          <w:sz w:val="15"/>
+        </w:rPr>
+        <w:t>. test difq = 1     -&gt;  F(1,81) = 0.02   Prob &gt; F = 0.8978</w:t>
+        <w:br/>
+      </w:r>
+      <w:r>
+        <w:rPr>
+          <w:rFonts w:ascii="Consolas" w:hAnsi="Consolas"/>
+          <w:sz w:val="15"/>
         </w:rPr>
         <w:br/>
       </w:r>
       <w:r>
         <w:rPr>
           <w:rFonts w:ascii="Consolas" w:hAnsi="Consolas"/>
-          <w:sz w:val="16"/>
+          <w:sz w:val="15"/>
         </w:rPr>
-        <w:t>== Quiebre endogeno en rp (prima de riesgo) ==</w:t>
+        <w:t>. newey depLead difq if D2011==0, lag(4)   [Pre-2011:T2, n=29]  difq=.0518615  test difq=1: F=0.35 p=0.5569</w:t>
         <w:br/>
       </w:r>
       <w:r>
         <w:rPr>
           <w:rFonts w:ascii="Consolas" w:hAnsi="Consolas"/>
-          <w:sz w:val="16"/>
+          <w:sz w:val="15"/>
         </w:rPr>
-        <w:t>. regress rp L.rp</w:t>
-        <w:br/>
-      </w:r>
-      <w:r>
-        <w:rPr>
-          <w:rFonts w:ascii="Consolas" w:hAnsi="Consolas"/>
-          <w:sz w:val="16"/>
-        </w:rPr>
-        <w:t>. estat sbsingle</w:t>
-        <w:br/>
-      </w:r>
-      <w:r>
-        <w:rPr>
-          <w:rFonts w:ascii="Consolas" w:hAnsi="Consolas"/>
-          <w:sz w:val="16"/>
-        </w:rPr>
-        <w:t>Test for a structural break: Unknown break date</w:t>
-        <w:br/>
-      </w:r>
-      <w:r>
-        <w:rPr>
-          <w:rFonts w:ascii="Consolas" w:hAnsi="Consolas"/>
-          <w:sz w:val="16"/>
-        </w:rPr>
-        <w:t>Full sample: 2 thru 80 | Trimmed sample: 14 thru 69</w:t>
-        <w:br/>
-      </w:r>
-      <w:r>
-        <w:rPr>
-          <w:rFonts w:ascii="Consolas" w:hAnsi="Consolas"/>
-          <w:sz w:val="16"/>
-        </w:rPr>
-        <w:t>Estimated break date: 26  -&gt;  2011:T2</w:t>
-        <w:br/>
-      </w:r>
-      <w:r>
-        <w:rPr>
-          <w:rFonts w:ascii="Consolas" w:hAnsi="Consolas"/>
-          <w:sz w:val="16"/>
-        </w:rPr>
-        <w:t xml:space="preserve">                    Test    Statistic      p-value</w:t>
-        <w:br/>
-      </w:r>
-      <w:r>
-        <w:rPr>
-          <w:rFonts w:ascii="Consolas" w:hAnsi="Consolas"/>
-          <w:sz w:val="16"/>
-        </w:rPr>
-        <w:t xml:space="preserve">           Supremum Wald      43.6614       0.0000</w:t>
+        <w:t>. newey depLead difq if D2011==1, lag(4)   [Post-2011:T2, n=54] difq=.8363325  test difq=1: F=0.02 p=0.8999</w:t>
       </w:r>
     </w:p>
     <w:p>
@@ -693,7 +625,7 @@
           <w:i w:val="0"/>
           <w:sz w:val="20"/>
         </w:rPr>
-        <w:t>Lectura. El quiebre endógeno de la prima de riesgo rp —el objeto directo de la hipótesis— se localiza precisamente en 2011:T2, el trimestre de la Resolución N.º 22, Acta N.º 31 del BCP, con un supremo de Wald altamente significativo (43,66; p &lt; 0,001). Esto respalda empíricamente la elección del corte institucional.</w:t>
+        <w:t>β no se distingue de 1 en ninguna muestra (contraste no concluyente, R²≈0,01): con estos datos no se rechaza la Paridad Descubierta.</w:t>
       </w:r>
     </w:p>
     <w:p>
@@ -701,7 +633,27 @@
         <w:pStyle w:val="Heading2"/>
       </w:pPr>
       <w:r>
-        <w:t>Apéndice C. Regresión de Fama y contraste de la Paridad Descubierta de Tasas</w:t>
+        <w:t>Apéndice E. Prueba conservadora del retorno del guaraní (DRcons)</w:t>
+      </w:r>
+    </w:p>
+    <w:p>
+      <w:pPr>
+        <w:spacing w:after="0" w:before="0" w:line="240" w:lineRule="auto"/>
+      </w:pPr>
+      <w:r>
+        <w:rPr>
+          <w:rFonts w:ascii="Consolas" w:hAnsi="Consolas"/>
+          <w:sz w:val="15"/>
+        </w:rPr>
+        <w:t>. newey DRcons, lag(4)               [Total]      _cons=-.9979099 (t=-2.76)   p_1cola(H1&gt;0)=0.9964</w:t>
+        <w:br/>
+      </w:r>
+      <w:r>
+        <w:rPr>
+          <w:rFonts w:ascii="Consolas" w:hAnsi="Consolas"/>
+          <w:sz w:val="15"/>
+        </w:rPr>
+        <w:t>. newey DRcons if D2011==1, lag(4)   [Post]       _cons=-1.235727  (t=-3.66)   p_1cola(H1&gt;0)=0.9997</w:t>
       </w:r>
     </w:p>
     <w:p>
@@ -711,7 +663,15 @@
           <w:i w:val="0"/>
           <w:sz w:val="20"/>
         </w:rPr>
-        <w:t>Regresión de la depreciación futura sobre el diferencial de tasas trimestralizado (misma frecuencia), con errores HAC de Newey-West (4 rezagos). Bajo la Paridad Descubierta, β = 1.</w:t>
+        <w:t>La media conservadora es negativa y significativamente &lt; 0 post-2011: excluidas las apreciaciones, el guaraní del tramo corto no ofrece premio positivo.</w:t>
+      </w:r>
+    </w:p>
+    <w:p>
+      <w:pPr>
+        <w:pStyle w:val="Heading2"/>
+      </w:pPr>
+      <w:r>
+        <w:t>Apéndice F. Descomposición de Fisher (prima de inflación vs. prima de riesgo)</w:t>
       </w:r>
     </w:p>
     <w:p>
@@ -721,95 +681,56 @@
       <w:r>
         <w:rPr>
           <w:rFonts w:ascii="Consolas" w:hAnsi="Consolas"/>
-          <w:sz w:val="16"/>
+          <w:sz w:val="15"/>
         </w:rPr>
-        <w:t>. newey depLead difq, lag(4)                            [Total, n=83]</w:t>
+        <w:t>Medias por subperiodo (muestra con rp no faltante):</w:t>
         <w:br/>
       </w:r>
       <w:r>
         <w:rPr>
           <w:rFonts w:ascii="Consolas" w:hAnsi="Consolas"/>
-          <w:sz w:val="16"/>
+          <w:sz w:val="15"/>
         </w:rPr>
-        <w:t xml:space="preserve">        difq |   1.163497   1.269541   0.92   0.362</w:t>
+        <w:t xml:space="preserve">   Pre-2011:T2  (n=25): difn=2.4548   InflDiff=4.719871   rp=-2.265071</w:t>
         <w:br/>
       </w:r>
       <w:r>
         <w:rPr>
           <w:rFonts w:ascii="Consolas" w:hAnsi="Consolas"/>
-          <w:sz w:val="16"/>
+          <w:sz w:val="15"/>
         </w:rPr>
-        <w:t xml:space="preserve">       _cons |  -0.487724   1.282599  -0.38   0.705</w:t>
+        <w:t xml:space="preserve">   Post-2011:T2 (n=55): difn=3.283662 InflDiff=1.65521    rp= 1.628452</w:t>
         <w:br/>
       </w:r>
       <w:r>
         <w:rPr>
           <w:rFonts w:ascii="Consolas" w:hAnsi="Consolas"/>
-          <w:sz w:val="16"/>
-        </w:rPr>
-        <w:t>. test difq = 1   -&gt;  F(1,81) = 0.02   Prob &gt; F = 0.8978</w:t>
-        <w:br/>
-      </w:r>
-      <w:r>
-        <w:rPr>
-          <w:rFonts w:ascii="Consolas" w:hAnsi="Consolas"/>
-          <w:sz w:val="16"/>
+          <w:sz w:val="15"/>
         </w:rPr>
         <w:br/>
       </w:r>
       <w:r>
         <w:rPr>
           <w:rFonts w:ascii="Consolas" w:hAnsi="Consolas"/>
-          <w:sz w:val="16"/>
+          <w:sz w:val="15"/>
         </w:rPr>
-        <w:t>. newey depLead difq if D2011==0, lag(4)                [Pre-2011:T2, n=29]</w:t>
+        <w:t>. newey rp D2011 if !missing(rp), lag(4)        D2011 = 3.893523 (t=6.44; p=0.000)  -&gt; Delta rp = +3.894</w:t>
         <w:br/>
       </w:r>
       <w:r>
         <w:rPr>
           <w:rFonts w:ascii="Consolas" w:hAnsi="Consolas"/>
-          <w:sz w:val="16"/>
+          <w:sz w:val="15"/>
         </w:rPr>
-        <w:t xml:space="preserve">        difq |   0.051862   1.593903   0.03   0.974</w:t>
+        <w:t>. newey InflDiff D2011 if !missing(rp), lag(4)  D2011 = -3.064661 (t=-4.33; p=0.000) -&gt; Delta Infl = -3.065</w:t>
         <w:br/>
       </w:r>
       <w:r>
         <w:rPr>
           <w:rFonts w:ascii="Consolas" w:hAnsi="Consolas"/>
-          <w:sz w:val="16"/>
+          <w:sz w:val="15"/>
         </w:rPr>
-        <w:t>. test difq = 1   -&gt;  F(1,27) = 0.35   Prob &gt; F = 0.5569</w:t>
-        <w:br/>
-      </w:r>
-      <w:r>
-        <w:rPr>
-          <w:rFonts w:ascii="Consolas" w:hAnsi="Consolas"/>
-          <w:sz w:val="16"/>
-        </w:rPr>
-        <w:br/>
-      </w:r>
-      <w:r>
-        <w:rPr>
-          <w:rFonts w:ascii="Consolas" w:hAnsi="Consolas"/>
-          <w:sz w:val="16"/>
-        </w:rPr>
-        <w:t>. newey depLead difq if D2011==1, lag(4)                [Post-2011:T2, n=54]</w:t>
-        <w:br/>
-      </w:r>
-      <w:r>
-        <w:rPr>
-          <w:rFonts w:ascii="Consolas" w:hAnsi="Consolas"/>
-          <w:sz w:val="16"/>
-        </w:rPr>
-        <w:t xml:space="preserve">        difq |   0.836333   1.295449   0.65   0.521</w:t>
-        <w:br/>
-      </w:r>
-      <w:r>
-        <w:rPr>
-          <w:rFonts w:ascii="Consolas" w:hAnsi="Consolas"/>
-          <w:sz w:val="16"/>
-        </w:rPr>
-        <w:t>. test difq = 1   -&gt;  F(1,52) = 0.02   Prob &gt; F = 0.8999</w:t>
+        <w:t>. newey difn D2011 if !missing(rp), lag(4)      D2011 = 0.828862 (t=2.41; p=0.019)  -&gt; Delta difn = +0.829</w:t>
       </w:r>
     </w:p>
     <w:p>
@@ -819,7 +740,7 @@
           <w:i w:val="0"/>
           <w:sz w:val="20"/>
         </w:rPr>
-        <w:t>Lectura. β no se distingue de 1 en ninguna muestra (contraste no concluyente por baja potencia, R² ≈ 0,01): con estos datos no puede rechazarse la Paridad Descubierta.</w:t>
+        <w:t>Tras 2011:T2 la prima de inflación se contrae (−3,07 pp; p&lt;0,001) y emerge una prima de riesgo positiva donde era negativa (de −2,27 a +1,63; salto de +3,89 pp; p&lt;0,001). Primera capa confirmada.</w:t>
       </w:r>
     </w:p>
     <w:p>
@@ -827,17 +748,7 @@
         <w:pStyle w:val="Heading2"/>
       </w:pPr>
       <w:r>
-        <w:t>Apéndice D. Prueba conservadora del retorno del guaraní (DRcons)</w:t>
-      </w:r>
-    </w:p>
-    <w:p>
-      <w:r>
-        <w:rPr>
-          <w:rFonts w:ascii="Arial" w:hAnsi="Arial"/>
-          <w:i w:val="0"/>
-          <w:sz w:val="20"/>
-        </w:rPr>
-        <w:t>Media del diferencial conservador (excluye las apreciaciones), con error HAC. Contraste unilateral H0: media ≤ 0 frente a H1: media &gt; 0.</w:t>
+        <w:t>Apéndice G. Modelo central MCO-HAC con interacciones sobre la prima de riesgo (corte 2011:T2)</w:t>
       </w:r>
     </w:p>
     <w:p>
@@ -847,205 +758,7 @@
       <w:r>
         <w:rPr>
           <w:rFonts w:ascii="Consolas" w:hAnsi="Consolas"/>
-          <w:sz w:val="16"/>
-        </w:rPr>
-        <w:t>. newey DRcons, lag(4)                     [Total, n=83]</w:t>
-        <w:br/>
-      </w:r>
-      <w:r>
-        <w:rPr>
-          <w:rFonts w:ascii="Consolas" w:hAnsi="Consolas"/>
-          <w:sz w:val="16"/>
-        </w:rPr>
-        <w:t xml:space="preserve">       _cons |  -0.997910   0.362164  -2.76   0.007</w:t>
-        <w:br/>
-      </w:r>
-      <w:r>
-        <w:rPr>
-          <w:rFonts w:ascii="Consolas" w:hAnsi="Consolas"/>
-          <w:sz w:val="16"/>
-        </w:rPr>
-        <w:t xml:space="preserve">   media = -0.9979   p unilateral (H1: media&gt;0) = 0.9964</w:t>
-        <w:br/>
-      </w:r>
-      <w:r>
-        <w:rPr>
-          <w:rFonts w:ascii="Consolas" w:hAnsi="Consolas"/>
-          <w:sz w:val="16"/>
-        </w:rPr>
-        <w:br/>
-      </w:r>
-      <w:r>
-        <w:rPr>
-          <w:rFonts w:ascii="Consolas" w:hAnsi="Consolas"/>
-          <w:sz w:val="16"/>
-        </w:rPr>
-        <w:t>. newey DRcons if D2011==1, lag(4)         [Post-2011:T2, n=54]</w:t>
-        <w:br/>
-      </w:r>
-      <w:r>
-        <w:rPr>
-          <w:rFonts w:ascii="Consolas" w:hAnsi="Consolas"/>
-          <w:sz w:val="16"/>
-        </w:rPr>
-        <w:t xml:space="preserve">       _cons |  -1.235727   0.337513  -3.66   0.001</w:t>
-        <w:br/>
-      </w:r>
-      <w:r>
-        <w:rPr>
-          <w:rFonts w:ascii="Consolas" w:hAnsi="Consolas"/>
-          <w:sz w:val="16"/>
-        </w:rPr>
-        <w:t xml:space="preserve">   media = -1.2357   p unilateral (H1: media&gt;0) = 0.9997</w:t>
-      </w:r>
-    </w:p>
-    <w:p>
-      <w:r>
-        <w:rPr>
-          <w:rFonts w:ascii="Arial" w:hAnsi="Arial"/>
-          <w:i w:val="0"/>
-          <w:sz w:val="20"/>
-        </w:rPr>
-        <w:t>Lectura. La media conservadora es negativa y significativamente menor que cero post-2011: una vez excluidas las apreciaciones, el guaraní del tramo corto no ofrece un premio positivo.</w:t>
-      </w:r>
-    </w:p>
-    <w:p>
-      <w:pPr>
-        <w:pStyle w:val="Heading2"/>
-      </w:pPr>
-      <w:r>
-        <w:t>Apéndice E. Descomposición de Fisher: prima de inflación y prima de riesgo</w:t>
-      </w:r>
-    </w:p>
-    <w:p>
-      <w:r>
-        <w:rPr>
-          <w:rFonts w:ascii="Arial" w:hAnsi="Arial"/>
-          <w:i w:val="0"/>
-          <w:sz w:val="20"/>
-        </w:rPr>
-        <w:t>Descomposición del diferencial nominal (difn = InflDiff + rp) y contraste de la diferencia de medias pre/post 2011:T2 con error HAC.</w:t>
-      </w:r>
-    </w:p>
-    <w:p>
-      <w:pPr>
-        <w:spacing w:after="0" w:before="0" w:line="240" w:lineRule="auto"/>
-      </w:pPr>
-      <w:r>
-        <w:rPr>
-          <w:rFonts w:ascii="Consolas" w:hAnsi="Consolas"/>
-          <w:sz w:val="16"/>
-        </w:rPr>
-        <w:t>Medias por subperiodo (muestra con rp no faltante):</w:t>
-        <w:br/>
-      </w:r>
-      <w:r>
-        <w:rPr>
-          <w:rFonts w:ascii="Consolas" w:hAnsi="Consolas"/>
-          <w:sz w:val="16"/>
-        </w:rPr>
-        <w:t xml:space="preserve">   D2011=0 (Pre) : difn=2.455  InflDiff=4.720  rp=-2.265   (n=25)</w:t>
-        <w:br/>
-      </w:r>
-      <w:r>
-        <w:rPr>
-          <w:rFonts w:ascii="Consolas" w:hAnsi="Consolas"/>
-          <w:sz w:val="16"/>
-        </w:rPr>
-        <w:t xml:space="preserve">   D2011=1 (Post): difn=3.284  InflDiff=1.655  rp= 1.628   (n=55)</w:t>
-        <w:br/>
-      </w:r>
-      <w:r>
-        <w:rPr>
-          <w:rFonts w:ascii="Consolas" w:hAnsi="Consolas"/>
-          <w:sz w:val="16"/>
-        </w:rPr>
-        <w:br/>
-      </w:r>
-      <w:r>
-        <w:rPr>
-          <w:rFonts w:ascii="Consolas" w:hAnsi="Consolas"/>
-          <w:sz w:val="16"/>
-        </w:rPr>
-        <w:t>. newey rp D2011 if !missing(rp), lag(4)</w:t>
-        <w:br/>
-      </w:r>
-      <w:r>
-        <w:rPr>
-          <w:rFonts w:ascii="Consolas" w:hAnsi="Consolas"/>
-          <w:sz w:val="16"/>
-        </w:rPr>
-        <w:t xml:space="preserve">       D2011 |   3.893523   0.604740   6.44   0.000     -&gt;  Delta rp = +3.894 (p=0.000)</w:t>
-        <w:br/>
-      </w:r>
-      <w:r>
-        <w:rPr>
-          <w:rFonts w:ascii="Consolas" w:hAnsi="Consolas"/>
-          <w:sz w:val="16"/>
-        </w:rPr>
-        <w:t>. newey InflDiff D2011 if !missing(rp), lag(4)</w:t>
-        <w:br/>
-      </w:r>
-      <w:r>
-        <w:rPr>
-          <w:rFonts w:ascii="Consolas" w:hAnsi="Consolas"/>
-          <w:sz w:val="16"/>
-        </w:rPr>
-        <w:t xml:space="preserve">       D2011 |  -3.064661   0.708382  -4.33   0.000     -&gt;  Delta InflDiff = -3.065 (p=0.000)</w:t>
-        <w:br/>
-      </w:r>
-      <w:r>
-        <w:rPr>
-          <w:rFonts w:ascii="Consolas" w:hAnsi="Consolas"/>
-          <w:sz w:val="16"/>
-        </w:rPr>
-        <w:t>. newey difn D2011 if !missing(rp), lag(4)</w:t>
-        <w:br/>
-      </w:r>
-      <w:r>
-        <w:rPr>
-          <w:rFonts w:ascii="Consolas" w:hAnsi="Consolas"/>
-          <w:sz w:val="16"/>
-        </w:rPr>
-        <w:t xml:space="preserve">       D2011 |   0.828862   0.344555   2.41   0.019     -&gt;  Delta difn = +0.829 (p=0.019)</w:t>
-      </w:r>
-    </w:p>
-    <w:p>
-      <w:r>
-        <w:rPr>
-          <w:rFonts w:ascii="Arial" w:hAnsi="Arial"/>
-          <w:i w:val="0"/>
-          <w:sz w:val="20"/>
-        </w:rPr>
-        <w:t>Lectura. Tras 2011:T2 la prima de inflación se contrae (−3,07 pp; p &lt; 0,001) y emerge una prima de riesgo positiva donde antes era negativa (de −2,27 a +1,63 pp; salto de +3,89 pp; p &lt; 0,001). Es la primera capa de la recomposición.</w:t>
-      </w:r>
-    </w:p>
-    <w:p>
-      <w:pPr>
-        <w:pStyle w:val="Heading2"/>
-      </w:pPr>
-      <w:r>
-        <w:t>Apéndice F. Modelo central MCO-HAC con interacciones sobre la prima de riesgo (corte 2011:T2)</w:t>
-      </w:r>
-    </w:p>
-    <w:p>
-      <w:r>
-        <w:rPr>
-          <w:rFonts w:ascii="Arial" w:hAnsi="Arial"/>
-          <w:i w:val="0"/>
-          <w:sz w:val="20"/>
-        </w:rPr>
-        <w:t>Modelo núcleo: rp = β0 + β2·VolTC_c + β3·Iliq_c + β4·D2011 + β5·(D2011×VolTC) + β6·(D2011×Iliq). Variables centradas; errores HAC de Newey-West (4 rezagos); n = 80.</w:t>
-      </w:r>
-    </w:p>
-    <w:p>
-      <w:pPr>
-        <w:spacing w:after="0" w:before="0" w:line="240" w:lineRule="auto"/>
-      </w:pPr>
-      <w:r>
-        <w:rPr>
-          <w:rFonts w:ascii="Consolas" w:hAnsi="Consolas"/>
-          <w:sz w:val="16"/>
+          <w:sz w:val="15"/>
         </w:rPr>
         <w:t>. newey rp VolTC_c dolar_c D2011 DxVolTC DxDolar, lag(4)</w:t>
         <w:br/>
@@ -1053,15 +766,31 @@
       <w:r>
         <w:rPr>
           <w:rFonts w:ascii="Consolas" w:hAnsi="Consolas"/>
-          <w:sz w:val="16"/>
+          <w:sz w:val="15"/>
         </w:rPr>
-        <w:t>Regression with Newey-West standard errors     Number of obs = 80    Max lag = 4</w:t>
+        <w:t>Regression with Newey–West standard errors      Number of obs     =         80</w:t>
         <w:br/>
       </w:r>
       <w:r>
         <w:rPr>
           <w:rFonts w:ascii="Consolas" w:hAnsi="Consolas"/>
-          <w:sz w:val="16"/>
+          <w:sz w:val="15"/>
+        </w:rPr>
+        <w:t>Maximum lag = 4                                 F(  5,        74) =      21.71</w:t>
+        <w:br/>
+      </w:r>
+      <w:r>
+        <w:rPr>
+          <w:rFonts w:ascii="Consolas" w:hAnsi="Consolas"/>
+          <w:sz w:val="15"/>
+        </w:rPr>
+        <w:t xml:space="preserve">                                                Prob &gt; F          =     0.0000</w:t>
+        <w:br/>
+      </w:r>
+      <w:r>
+        <w:rPr>
+          <w:rFonts w:ascii="Consolas" w:hAnsi="Consolas"/>
+          <w:sz w:val="15"/>
         </w:rPr>
         <w:t>------------------------------------------------------------------------------</w:t>
         <w:br/>
@@ -1069,7 +798,15 @@
       <w:r>
         <w:rPr>
           <w:rFonts w:ascii="Consolas" w:hAnsi="Consolas"/>
-          <w:sz w:val="16"/>
+          <w:sz w:val="15"/>
+        </w:rPr>
+        <w:t xml:space="preserve">             |             Newey–West</w:t>
+        <w:br/>
+      </w:r>
+      <w:r>
+        <w:rPr>
+          <w:rFonts w:ascii="Consolas" w:hAnsi="Consolas"/>
+          <w:sz w:val="15"/>
         </w:rPr>
         <w:t xml:space="preserve">          rp | Coefficient  std. err.      t    P&gt;|t|     [95% conf. interval]</w:t>
         <w:br/>
@@ -1077,7 +814,7 @@
       <w:r>
         <w:rPr>
           <w:rFonts w:ascii="Consolas" w:hAnsi="Consolas"/>
-          <w:sz w:val="16"/>
+          <w:sz w:val="15"/>
         </w:rPr>
         <w:t>-------------+----------------------------------------------------------------</w:t>
         <w:br/>
@@ -1085,55 +822,55 @@
       <w:r>
         <w:rPr>
           <w:rFonts w:ascii="Consolas" w:hAnsi="Consolas"/>
-          <w:sz w:val="16"/>
+          <w:sz w:val="15"/>
         </w:rPr>
-        <w:t xml:space="preserve">     VolTC_c |   0.283183   0.110718    2.56   0.013     0.062573    0.503793</w:t>
+        <w:t xml:space="preserve">     VolTC_c |   .2831829   .1107176     2.56   0.013     .0625732    .5037925</w:t>
         <w:br/>
       </w:r>
       <w:r>
         <w:rPr>
           <w:rFonts w:ascii="Consolas" w:hAnsi="Consolas"/>
-          <w:sz w:val="16"/>
+          <w:sz w:val="15"/>
         </w:rPr>
-        <w:t xml:space="preserve">     dolar_c |   0.157555   0.097251    1.62   0.109    -0.036221    0.351331</w:t>
+        <w:t xml:space="preserve">     dolar_c |   .1575548   .0972506     1.62   0.109    -.0362212    .3513308</w:t>
         <w:br/>
       </w:r>
       <w:r>
         <w:rPr>
           <w:rFonts w:ascii="Consolas" w:hAnsi="Consolas"/>
-          <w:sz w:val="16"/>
+          <w:sz w:val="15"/>
         </w:rPr>
-        <w:t xml:space="preserve">       D2011 |   3.887182   0.515963    7.53   0.000     2.859104    4.915261</w:t>
+        <w:t xml:space="preserve">       D2011 |   3.887182   .5159631     7.53   0.000     2.859104    4.915261</w:t>
         <w:br/>
       </w:r>
       <w:r>
         <w:rPr>
           <w:rFonts w:ascii="Consolas" w:hAnsi="Consolas"/>
-          <w:sz w:val="16"/>
+          <w:sz w:val="15"/>
         </w:rPr>
-        <w:t xml:space="preserve">     DxVolTC |  -0.345333   0.215929   -1.60   0.114    -0.775580    0.084914</w:t>
+        <w:t xml:space="preserve">     DxVolTC |  -.3453329   .2159286    -1.60   0.114    -.7755801    .0849143</w:t>
         <w:br/>
       </w:r>
       <w:r>
         <w:rPr>
           <w:rFonts w:ascii="Consolas" w:hAnsi="Consolas"/>
-          <w:sz w:val="16"/>
+          <w:sz w:val="15"/>
         </w:rPr>
-        <w:t xml:space="preserve">     DxDolar |  -0.234129   0.135595   -1.73   0.088    -0.504308    0.036051</w:t>
+        <w:t xml:space="preserve">     DxDolar |  -.2341287   .1355953    -1.73   0.088    -.5043082    .0360507</w:t>
         <w:br/>
       </w:r>
       <w:r>
         <w:rPr>
           <w:rFonts w:ascii="Consolas" w:hAnsi="Consolas"/>
-          <w:sz w:val="16"/>
+          <w:sz w:val="15"/>
         </w:rPr>
-        <w:t xml:space="preserve">       _cons |  -2.214195   0.453539   -4.88   0.000    -3.117890   -1.310500</w:t>
+        <w:t xml:space="preserve">       _cons |  -2.214195   .4535386    -4.88   0.000     -3.11789     -1.3105</w:t>
         <w:br/>
       </w:r>
       <w:r>
         <w:rPr>
           <w:rFonts w:ascii="Consolas" w:hAnsi="Consolas"/>
-          <w:sz w:val="16"/>
+          <w:sz w:val="15"/>
         </w:rPr>
         <w:t>------------------------------------------------------------------------------</w:t>
         <w:br/>
@@ -1141,15 +878,15 @@
       <w:r>
         <w:rPr>
           <w:rFonts w:ascii="Consolas" w:hAnsi="Consolas"/>
-          <w:sz w:val="16"/>
+          <w:sz w:val="15"/>
         </w:rPr>
-        <w:t>. test DxVolTC DxDolar         -&gt;  F(2,74) =  2.00   Prob &gt; F = 0.1422   (Wald de pendientes)</w:t>
+        <w:t>. test DxVolTC DxDolar         -&gt;  F(2,74) =  2.00   Prob &gt; F = 0.1422   (Wald conjunto de pendientes)</w:t>
         <w:br/>
       </w:r>
       <w:r>
         <w:rPr>
           <w:rFonts w:ascii="Consolas" w:hAnsi="Consolas"/>
-          <w:sz w:val="16"/>
+          <w:sz w:val="15"/>
         </w:rPr>
         <w:t>. test D2011 DxVolTC DxDolar   -&gt;  F(3,74) = 26.00   Prob &gt; F = 0.0000   (Chow completo)</w:t>
       </w:r>
@@ -1161,7 +898,7 @@
           <w:i w:val="0"/>
           <w:sz w:val="20"/>
         </w:rPr>
-        <w:t>Lectura. El régimen se asocia a un salto de nivel de la prima grande y preciso (β4 = +3,89 pp; p &lt; 0,001) y el Chow rechaza la estabilidad del modelo (F = 26,00). En cambio, la prueba de Wald conjunta sobre las interacciones no rechaza la estabilidad de las pendientes (F = 2,00; p = 0,142): no hay evidencia de recomposición interna de la prima. La recomposición ocurre entre primas (nivel), no dentro de la prima.</w:t>
+        <w:t>Salto de nivel de la prima grande y preciso (β4=+3,89; p&lt;0,001) y Chow que rechaza estabilidad (F=26,00). La prueba de Wald conjunta sobre las interacciones NO rechaza la estabilidad de pendientes (F=2,00; p=0,142): la recomposición ocurre entre primas (nivel), no dentro de la prima.</w:t>
       </w:r>
     </w:p>
     <w:p>
@@ -1169,7 +906,7 @@
         <w:pStyle w:val="Heading2"/>
       </w:pPr>
       <w:r>
-        <w:t>Apéndice G. Diagnósticos del modelo (Breusch-Godfrey, White, Ramsey RESET, normalidad, VIF)</w:t>
+        <w:t>Apéndice H. Diagnósticos del modelo (Breusch-Godfrey, White, Ramsey RESET, normalidad, VIF)</w:t>
       </w:r>
     </w:p>
     <w:p>
@@ -1179,72 +916,49 @@
       <w:r>
         <w:rPr>
           <w:rFonts w:ascii="Consolas" w:hAnsi="Consolas"/>
-          <w:sz w:val="16"/>
+          <w:sz w:val="15"/>
         </w:rPr>
-        <w:t>OLS paralelo: regress rp VolTC_c dolar_c D2011 DxVolTC DxDolar   (n=80, R2=0.533)</w:t>
+        <w:t>OLS paralelo: regress rp VolTC_c dolar_c D2011 DxVolTC DxDolar   (n=80, R2=0.5327)</w:t>
         <w:br/>
       </w:r>
       <w:r>
         <w:rPr>
           <w:rFonts w:ascii="Consolas" w:hAnsi="Consolas"/>
-          <w:sz w:val="16"/>
+          <w:sz w:val="15"/>
         </w:rPr>
+        <w:t>. estat bgodfrey, lags(1 2 3 4)   lag1 chi2=0.414 p=0.5197 | lag2 0.538 p=0.7642 | lag3 11.091 p=0.0112 | lag4 23.079 p=0.0001</w:t>
         <w:br/>
       </w:r>
       <w:r>
         <w:rPr>
           <w:rFonts w:ascii="Consolas" w:hAnsi="Consolas"/>
-          <w:sz w:val="16"/>
+          <w:sz w:val="15"/>
         </w:rPr>
-        <w:t>. estat bgodfrey, lags(1 2 3 4)     Breusch-Godfrey LM (H0: sin autocorrelacion)</w:t>
+        <w:t>. estat imtest, white             White chi2(11)=40.13  Prob&gt;chi2=0.0000</w:t>
         <w:br/>
       </w:r>
       <w:r>
         <w:rPr>
           <w:rFonts w:ascii="Consolas" w:hAnsi="Consolas"/>
-          <w:sz w:val="16"/>
+          <w:sz w:val="15"/>
         </w:rPr>
-        <w:t xml:space="preserve">     lag 1: chi2=0.414  p=0.5197 | lag 2: 0.538 p=0.7642</w:t>
+        <w:t>. estat ovtest                    Ramsey RESET F(3,71)=1.31  Prob&gt;F=0.2774</w:t>
         <w:br/>
       </w:r>
       <w:r>
         <w:rPr>
           <w:rFonts w:ascii="Consolas" w:hAnsi="Consolas"/>
-          <w:sz w:val="16"/>
+          <w:sz w:val="15"/>
         </w:rPr>
-        <w:t xml:space="preserve">     lag 3: chi2=11.091 p=0.0112 | lag 4: 23.079 p=0.0001</w:t>
+        <w:t>. sktest (residuos)               Adj chi2(2)=4.36  Prob&gt;chi2=0.1128</w:t>
         <w:br/>
       </w:r>
       <w:r>
         <w:rPr>
           <w:rFonts w:ascii="Consolas" w:hAnsi="Consolas"/>
-          <w:sz w:val="16"/>
+          <w:sz w:val="15"/>
         </w:rPr>
-        <w:t>. estat imtest, white               White  chi2(11)=40.13  Prob&gt;chi2=0.0000  (heterocedasticidad)</w:t>
-        <w:br/>
-      </w:r>
-      <w:r>
-        <w:rPr>
-          <w:rFonts w:ascii="Consolas" w:hAnsi="Consolas"/>
-          <w:sz w:val="16"/>
-        </w:rPr>
-        <w:t>. estat ovtest                      Ramsey RESET  F(3,71)=1.31  Prob&gt;F=0.2774 (forma funcional OK)</w:t>
-        <w:br/>
-      </w:r>
-      <w:r>
-        <w:rPr>
-          <w:rFonts w:ascii="Consolas" w:hAnsi="Consolas"/>
-          <w:sz w:val="16"/>
-        </w:rPr>
-        <w:t>. sktest (residuos)                 Skew/Kurt  Adj chi2(2)=4.36  Prob&gt;chi2=0.1128 (normalidad no rechazada)</w:t>
-        <w:br/>
-      </w:r>
-      <w:r>
-        <w:rPr>
-          <w:rFonts w:ascii="Consolas" w:hAnsi="Consolas"/>
-          <w:sz w:val="16"/>
-        </w:rPr>
-        <w:t>. vif                               VIF: DxDolar 2.89 | dolar_c 2.65 | DxVolTC 2.27 | VolTC_c 1.88 | D2011 1.16  (media 2.17)</w:t>
+        <w:t>. vif   DxDolar 2.89 | dolar_c 2.65 | DxVolTC 2.27 | VolTC_c 1.88 | D2011 1.16 | media 2.17</w:t>
       </w:r>
     </w:p>
     <w:p>
@@ -1254,7 +968,7 @@
           <w:i w:val="0"/>
           <w:sz w:val="20"/>
         </w:rPr>
-        <w:t>Lectura. Se detecta autocorrelación (rezagos altos) y heterocedasticidad, lo que justifica el uso de errores HAC en todas las especificaciones. La forma funcional (RESET) es adecuada y la normalidad de los residuos no se rechaza. Con variables centradas, la multicolinealidad es baja (VIF máximo 2,89).</w:t>
+        <w:t>Autocorrelación (rezagos altos) y heterocedasticidad → justifican los errores HAC. Forma funcional adecuada (RESET); normalidad no rechazada; multicolinealidad baja (VIF máx 2,89).</w:t>
       </w:r>
     </w:p>
     <w:p>
@@ -1262,17 +976,7 @@
         <w:pStyle w:val="Heading2"/>
       </w:pPr>
       <w:r>
-        <w:t>Apéndice H. Prueba de cointegración de Engle-Granger sobre los residuos</w:t>
-      </w:r>
-    </w:p>
-    <w:p>
-      <w:r>
-        <w:rPr>
-          <w:rFonts w:ascii="Arial" w:hAnsi="Arial"/>
-          <w:i w:val="0"/>
-          <w:sz w:val="20"/>
-        </w:rPr>
-        <w:t>Dado el carácter aproximadamente integrado de las explicativas, se verifica que los residuos del modelo sean estacionarios (ADF con 3 rezagos): si lo son, las series cointegran y la relación no es espuria.</w:t>
+        <w:t>Apéndice I. Prueba de cointegración de Engle-Granger sobre los residuos</w:t>
       </w:r>
     </w:p>
     <w:p>
@@ -1282,7 +986,7 @@
       <w:r>
         <w:rPr>
           <w:rFonts w:ascii="Consolas" w:hAnsi="Consolas"/>
-          <w:sz w:val="16"/>
+          <w:sz w:val="15"/>
         </w:rPr>
         <w:t>. predict __r, resid</w:t>
         <w:br/>
@@ -1290,7 +994,7 @@
       <w:r>
         <w:rPr>
           <w:rFonts w:ascii="Consolas" w:hAnsi="Consolas"/>
-          <w:sz w:val="16"/>
+          <w:sz w:val="15"/>
         </w:rPr>
         <w:t>. dfuller __r, lags(3)</w:t>
         <w:br/>
@@ -1298,15 +1002,15 @@
       <w:r>
         <w:rPr>
           <w:rFonts w:ascii="Consolas" w:hAnsi="Consolas"/>
-          <w:sz w:val="16"/>
+          <w:sz w:val="15"/>
         </w:rPr>
-        <w:t xml:space="preserve"> Z(t) = -5.000     1%: -3.544   5%: -2.909   10%: -2.590     (obs=76)</w:t>
+        <w:t xml:space="preserve"> Z(t) = -5.000     1%: -3.544   5%: -2.909   10%: -2.590     (obs 76)</w:t>
         <w:br/>
       </w:r>
       <w:r>
         <w:rPr>
           <w:rFonts w:ascii="Consolas" w:hAnsi="Consolas"/>
-          <w:sz w:val="16"/>
+          <w:sz w:val="15"/>
         </w:rPr>
         <w:t xml:space="preserve"> MacKinnon approximate p-value for Z(t) = 0.0000</w:t>
       </w:r>
@@ -1318,7 +1022,7 @@
           <w:i w:val="0"/>
           <w:sz w:val="20"/>
         </w:rPr>
-        <w:t>Lectura. El ADF rechaza la raíz unitaria de los residuos muy por debajo del valor crítico de Engle-Granger (−5,00): las series cointegran y la relación estimada no es espuria.</w:t>
+        <w:t>Los residuos son estacionarios (ADF −5,00, por debajo del crítico de Engle-Granger): las series cointegran y la relación no es espuria pese a la integración de las explicativas.</w:t>
       </w:r>
     </w:p>
     <w:p>
@@ -1326,7 +1030,7 @@
         <w:pStyle w:val="Heading2"/>
       </w:pPr>
       <w:r>
-        <w:t>Apéndice I. Composición interna de la prima (Shapley/LMG) y dominancia estandarizada</w:t>
+        <w:t>Apéndice J. Composición interna de la prima (Shapley/LMG) y dominancia estandarizada</w:t>
       </w:r>
     </w:p>
     <w:p>
@@ -1336,64 +1040,49 @@
       <w:r>
         <w:rPr>
           <w:rFonts w:ascii="Consolas" w:hAnsi="Consolas"/>
-          <w:sz w:val="16"/>
+          <w:sz w:val="15"/>
         </w:rPr>
-        <w:t>Reparto del R2 de rp entre riesgo cambiario (VolTC) e iliquidez (dolarizacion):</w:t>
+        <w:t>Reparto del R2 de rp:  Pre-2011:T2  R2=0.129  %VolTC=65.6%  %Iliq=34.4%</w:t>
         <w:br/>
       </w:r>
       <w:r>
         <w:rPr>
           <w:rFonts w:ascii="Consolas" w:hAnsi="Consolas"/>
-          <w:sz w:val="16"/>
+          <w:sz w:val="15"/>
         </w:rPr>
-        <w:t xml:space="preserve">   Pre-2011:T2 : R2=0.129   %VolTC=65.6%   %Iliq=34.4%</w:t>
+        <w:t xml:space="preserve">                       Post-2011:T2 R2=0.026  %VolTC=11.2%  %Iliq=88.8%  (R2 muy bajo -&gt; descriptivo)</w:t>
         <w:br/>
       </w:r>
       <w:r>
         <w:rPr>
           <w:rFonts w:ascii="Consolas" w:hAnsi="Consolas"/>
-          <w:sz w:val="16"/>
+          <w:sz w:val="15"/>
         </w:rPr>
-        <w:t xml:space="preserve">   Post-2011:T2: R2=0.026   %VolTC=11.2%   %Iliq=88.8%   (R2 muy bajo -&gt; descriptivo)</w:t>
+        <w:t>Dominancia estandarizada post-2011:T2:</w:t>
         <w:br/>
       </w:r>
       <w:r>
         <w:rPr>
           <w:rFonts w:ascii="Consolas" w:hAnsi="Consolas"/>
-          <w:sz w:val="16"/>
+          <w:sz w:val="15"/>
         </w:rPr>
+        <w:t>. lincom zV + DzV   (riesgo cambiario) = -.1523516  (t=-0.33; p=0.744)</w:t>
         <w:br/>
       </w:r>
       <w:r>
         <w:rPr>
           <w:rFonts w:ascii="Consolas" w:hAnsi="Consolas"/>
-          <w:sz w:val="16"/>
+          <w:sz w:val="15"/>
         </w:rPr>
-        <w:t>Dominancia estandarizada post-2011:T2 (efecto en desvios estandar):</w:t>
+        <w:t>. lincom zI + DzI   (iliquidez)        = -.3167573  (t=-0.78; p=0.437)</w:t>
         <w:br/>
       </w:r>
       <w:r>
         <w:rPr>
           <w:rFonts w:ascii="Consolas" w:hAnsi="Consolas"/>
-          <w:sz w:val="16"/>
+          <w:sz w:val="15"/>
         </w:rPr>
-        <w:t>. lincom zV + DzV   (riesgo cambiario) = -0.152   (p=0.744)</w:t>
-        <w:br/>
-      </w:r>
-      <w:r>
-        <w:rPr>
-          <w:rFonts w:ascii="Consolas" w:hAnsi="Consolas"/>
-          <w:sz w:val="16"/>
-        </w:rPr>
-        <w:t>. lincom zI + DzI   (iliquidez)        = -0.317   (p=0.437)</w:t>
-        <w:br/>
-      </w:r>
-      <w:r>
-        <w:rPr>
-          <w:rFonts w:ascii="Consolas" w:hAnsi="Consolas"/>
-          <w:sz w:val="16"/>
-        </w:rPr>
-        <w:t>. lincom (zI+DzI)-(zV+DzV) (diferencia)= -0.164   (t=-0.45; p=0.657)</w:t>
+        <w:t>. lincom (zI+DzI)-(zV+DzV)  (diferencia)= -.1644056 (t=-0.45; p=0.657)</w:t>
       </w:r>
     </w:p>
     <w:p>
@@ -1403,7 +1092,7 @@
           <w:i w:val="0"/>
           <w:sz w:val="20"/>
         </w:rPr>
-        <w:t>Lectura. Las incidencias estandarizadas de ambos determinantes son estadísticamente indistinguibles post-2011 (p = 0,657): no hay una migración de dominancia hacia la iliquidez.</w:t>
+        <w:t>Las incidencias estandarizadas de ambos determinantes son estadísticamente indistinguibles post-2011 (p=0,657): no hay migración de dominancia hacia la iliquidez.</w:t>
       </w:r>
     </w:p>
     <w:p>
@@ -1411,7 +1100,7 @@
         <w:pStyle w:val="Heading2"/>
       </w:pPr>
       <w:r>
-        <w:t>Apéndice J. Diferencia de medias del diferencial de retorno DR entre subperíodos</w:t>
+        <w:t>Apéndice K. Diferencia de medias del diferencial de retorno DR entre subperíodos</w:t>
       </w:r>
     </w:p>
     <w:p>
@@ -1421,17 +1110,69 @@
       <w:r>
         <w:rPr>
           <w:rFonts w:ascii="Consolas" w:hAnsi="Consolas"/>
-          <w:sz w:val="16"/>
+          <w:sz w:val="15"/>
         </w:rPr>
-        <w:t>. newey DR D2011, lag(4)</w:t>
+        <w:t>. newey DR D2011, lag(4)        D2011 = -2.412  (p = 0.034)   -&gt; caida de 2,41 pp entre subperiodos</w:t>
+      </w:r>
+    </w:p>
+    <w:p>
+      <w:pPr>
+        <w:pStyle w:val="Heading2"/>
+      </w:pPr>
+      <w:r>
+        <w:t>Apéndice L. Robustez del modelo central (especificaciones alternativas)</w:t>
+      </w:r>
+    </w:p>
+    <w:p>
+      <w:pPr>
+        <w:spacing w:after="0" w:before="0" w:line="240" w:lineRule="auto"/>
+      </w:pPr>
+      <w:r>
+        <w:rPr>
+          <w:rFonts w:ascii="Consolas" w:hAnsi="Consolas"/>
+          <w:sz w:val="15"/>
+        </w:rPr>
+        <w:t>(i) Corte 2011:T1:   D2011_T1 = 3.713726 (p&lt;0.001) | Wald pendientes F(2,74)=0.33  p=0.7169</w:t>
         <w:br/>
       </w:r>
       <w:r>
         <w:rPr>
           <w:rFonts w:ascii="Consolas" w:hAnsi="Consolas"/>
-          <w:sz w:val="16"/>
+          <w:sz w:val="15"/>
         </w:rPr>
-        <w:t xml:space="preserve">       D2011 |  -2.412...   ...       ...   0.034     -&gt;  caida de 2,41 pp (p=0.034)</w:t>
+        <w:t>(ii) Control crisis 2008-09: D2011 = 3.582942 (p&lt;0.001) | crisis = -1.992846 (p=0.017)</w:t>
+        <w:br/>
+      </w:r>
+      <w:r>
+        <w:rPr>
+          <w:rFonts w:ascii="Consolas" w:hAnsi="Consolas"/>
+          <w:sz w:val="15"/>
+        </w:rPr>
+        <w:t>(iii) Tasas fin de trimestre: D2011 = 4.022753 (p&lt;0.001) | Wald pendientes F(2,74)=0.75 p=0.4768</w:t>
+        <w:br/>
+      </w:r>
+      <w:r>
+        <w:rPr>
+          <w:rFonts w:ascii="Consolas" w:hAnsi="Consolas"/>
+          <w:sz w:val="15"/>
+        </w:rPr>
+        <w:t>(iv) Rezago HAC 3 / 5 / 6:  Wald pendientes F=2.01/1.99/2.07 (p=0.142/0.144/0.133); Chow fuerte en todos</w:t>
+        <w:br/>
+      </w:r>
+      <w:r>
+        <w:rPr>
+          <w:rFonts w:ascii="Consolas" w:hAnsi="Consolas"/>
+          <w:sz w:val="15"/>
+        </w:rPr>
+        <w:t>(vi) Regimen gradual (rampa 2011:T2-2016):  Wald pendientes F(2,74)=1.85 p=0.164 | RxD=-0.468 p=0.060</w:t>
+        <w:br/>
+      </w:r>
+      <w:r>
+        <w:rPr>
+          <w:rFonts w:ascii="Consolas" w:hAnsi="Consolas"/>
+          <w:sz w:val="15"/>
+        </w:rPr>
+        <w:t>(vii) Dolarizacion rezagada 1 trim.:        Wald pendientes F(2,74)=2.34 p=0.103</w:t>
       </w:r>
     </w:p>
     <w:p>
@@ -1441,7 +1182,7 @@
           <w:i w:val="0"/>
           <w:sz w:val="20"/>
         </w:rPr>
-        <w:t>Lectura. El diferencial de retorno DR cae 2,41 pp entre subperíodos (p = 0,034). La prueba solo detecta el cambio de nivel; la recomposición de determinantes se aborda en el modelo del Apéndice F.</w:t>
+        <w:t>El salto de nivel es robusto (varía entre +3,58 y +4,02 pp, siempre p&lt;0,001) y la estabilidad de las pendientes se mantiene en todas las especificaciones. Nota: (i), (vi) y (vii) provienen de la corrida actualizada del do-file (se reproducen con newey_nogap y los mismos rezagos).</w:t>
       </w:r>
     </w:p>
     <w:p>
@@ -1449,7 +1190,7 @@
         <w:pStyle w:val="Heading2"/>
       </w:pPr>
       <w:r>
-        <w:t>Apéndice K. Robustez — corte institucional alternativo 2011:T1</w:t>
+        <w:t>Apéndice M. Sensibilidad — serie de promedio ponderado de plazos</w:t>
       </w:r>
     </w:p>
     <w:p>
@@ -1459,41 +1200,41 @@
       <w:r>
         <w:rPr>
           <w:rFonts w:ascii="Consolas" w:hAnsi="Consolas"/>
-          <w:sz w:val="16"/>
+          <w:sz w:val="15"/>
         </w:rPr>
-        <w:t>. newey rp VolTC_c1 dolar_c1 D2011_T1 DxV_T1 DxD_T1, lag(4)      [n=80]</w:t>
+        <w:t>. newey rp_pond VolTC_cp dolar_cp D2011 DxVp DxDp, lag(4)     [n=79]</w:t>
         <w:br/>
       </w:r>
       <w:r>
         <w:rPr>
           <w:rFonts w:ascii="Consolas" w:hAnsi="Consolas"/>
-          <w:sz w:val="16"/>
+          <w:sz w:val="15"/>
         </w:rPr>
-        <w:t xml:space="preserve">    D2011_T1 |   3.713726   0.556188   6.68   0.000</w:t>
+        <w:t xml:space="preserve">       D2011 |   1.759895   0.419927   4.19   0.000</w:t>
         <w:br/>
       </w:r>
       <w:r>
         <w:rPr>
           <w:rFonts w:ascii="Consolas" w:hAnsi="Consolas"/>
-          <w:sz w:val="16"/>
+          <w:sz w:val="15"/>
         </w:rPr>
-        <w:t xml:space="preserve">      DxV_T1 |  -0.189062   0.278674  -0.68   0.500</w:t>
+        <w:t xml:space="preserve">        DxDp |  -0.464174   0.111033  -4.18   0.000</w:t>
         <w:br/>
       </w:r>
       <w:r>
         <w:rPr>
           <w:rFonts w:ascii="Consolas" w:hAnsi="Consolas"/>
-          <w:sz w:val="16"/>
+          <w:sz w:val="15"/>
         </w:rPr>
-        <w:t xml:space="preserve">      DxD_T1 |  -0.130842   0.172230  -0.76   0.450</w:t>
+        <w:t>. test DxVp DxDp        -&gt;  F(2,73) = 9.59   Prob &gt; F = 0.0002</w:t>
         <w:br/>
       </w:r>
       <w:r>
         <w:rPr>
           <w:rFonts w:ascii="Consolas" w:hAnsi="Consolas"/>
-          <w:sz w:val="16"/>
+          <w:sz w:val="15"/>
         </w:rPr>
-        <w:t>. test DxV_T1 DxD_T1   -&gt;  F(2,74) = 0.33   Prob &gt; F = 0.7169</w:t>
+        <w:t>. newey rp_pond D2011, lag(4)   -&gt;  D2011 = 1.987329 (t=2.57; p=0.012)   [salto de nivel]</w:t>
       </w:r>
     </w:p>
     <w:p>
@@ -1503,7 +1244,7 @@
           <w:i w:val="0"/>
           <w:sz w:val="20"/>
         </w:rPr>
-        <w:t>Con el corte alternativo 2011:T1 el salto de nivel es similar (+3,71 pp; p &lt; 0,001) y las pendientes son igualmente estables (p = 0,717). La conclusión no depende del trimestre exacto.</w:t>
+        <w:t>Con la serie alternativa (empalma dos publicaciones del BCP, con sesgo de composición por plazos) el salto de nivel se mantiene (+1,99 pp; p=0,012) pero las interacciones aparecen significativas (F=9,59; p&lt;0,001). La evidencia de nivel es robusta a la definición; la de pendientes es sensible a ella, y esa sensibilidad se declara.</w:t>
       </w:r>
     </w:p>
     <w:p>
@@ -1511,7 +1252,7 @@
         <w:pStyle w:val="Heading2"/>
       </w:pPr>
       <w:r>
-        <w:t>Apéndice L. Robustez — control por la crisis financiera global 2008–2009</w:t>
+        <w:t>Apéndice N. Correlación entre la prima de riesgo y la dolarización, por subperíodo</w:t>
       </w:r>
     </w:p>
     <w:p>
@@ -1521,292 +1262,7 @@
       <w:r>
         <w:rPr>
           <w:rFonts w:ascii="Consolas" w:hAnsi="Consolas"/>
-          <w:sz w:val="16"/>
-        </w:rPr>
-        <w:t>. newey rp VolTC_c dolar_c D2011 DxVolTC DxDolar crisis, lag(4)   [n=80]</w:t>
-        <w:br/>
-      </w:r>
-      <w:r>
-        <w:rPr>
-          <w:rFonts w:ascii="Consolas" w:hAnsi="Consolas"/>
-          <w:sz w:val="16"/>
-        </w:rPr>
-        <w:t xml:space="preserve">       D2011 |   3.582942   0.545454   6.57   0.000</w:t>
-        <w:br/>
-      </w:r>
-      <w:r>
-        <w:rPr>
-          <w:rFonts w:ascii="Consolas" w:hAnsi="Consolas"/>
-          <w:sz w:val="16"/>
-        </w:rPr>
-        <w:t xml:space="preserve">      crisis |  -1.992846   0.812378  -2.45   0.017</w:t>
-      </w:r>
-    </w:p>
-    <w:p>
-      <w:r>
-        <w:rPr>
-          <w:rFonts w:ascii="Arial" w:hAnsi="Arial"/>
-          <w:i w:val="0"/>
-          <w:sz w:val="20"/>
-        </w:rPr>
-        <w:t>El salto de la prima en 2011 se mantiene (+3,58 pp; p &lt; 0,001) al controlar por la crisis: el efecto del cambio de régimen es distinto del shock de la crisis.</w:t>
-      </w:r>
-    </w:p>
-    <w:p>
-      <w:pPr>
-        <w:pStyle w:val="Heading2"/>
-      </w:pPr>
-      <w:r>
-        <w:t>Apéndice M. Robustez — tasas de fin de trimestre</w:t>
-      </w:r>
-    </w:p>
-    <w:p>
-      <w:pPr>
-        <w:spacing w:after="0" w:before="0" w:line="240" w:lineRule="auto"/>
-      </w:pPr>
-      <w:r>
-        <w:rPr>
-          <w:rFonts w:ascii="Consolas" w:hAnsi="Consolas"/>
-          <w:sz w:val="16"/>
-        </w:rPr>
-        <w:t>. newey rp_fdt VolTC_cf dolar_cf D2011 DxVf DxDf, lag(4)          [n=80]</w:t>
-        <w:br/>
-      </w:r>
-      <w:r>
-        <w:rPr>
-          <w:rFonts w:ascii="Consolas" w:hAnsi="Consolas"/>
-          <w:sz w:val="16"/>
-        </w:rPr>
-        <w:t xml:space="preserve">       D2011 |   4.022753   0.539427   7.46   0.000</w:t>
-        <w:br/>
-      </w:r>
-      <w:r>
-        <w:rPr>
-          <w:rFonts w:ascii="Consolas" w:hAnsi="Consolas"/>
-          <w:sz w:val="16"/>
-        </w:rPr>
-        <w:t>. test DxVf DxDf   -&gt;  F(2,74) = 0.75   Prob &gt; F = 0.4768</w:t>
-      </w:r>
-    </w:p>
-    <w:p>
-      <w:r>
-        <w:rPr>
-          <w:rFonts w:ascii="Arial" w:hAnsi="Arial"/>
-          <w:i w:val="0"/>
-          <w:sz w:val="20"/>
-        </w:rPr>
-        <w:t>Con las tasas del último mes de cada trimestre, el salto de nivel persiste (+4,02 pp) y las pendientes siguen estables (p = 0,477).</w:t>
-      </w:r>
-    </w:p>
-    <w:p>
-      <w:pPr>
-        <w:pStyle w:val="Heading2"/>
-      </w:pPr>
-      <w:r>
-        <w:t>Apéndice N. Robustez — sensibilidad al ancho de banda HAC (rezagos 3, 5 y 6)</w:t>
-      </w:r>
-    </w:p>
-    <w:p>
-      <w:pPr>
-        <w:spacing w:after="0" w:before="0" w:line="240" w:lineRule="auto"/>
-      </w:pPr>
-      <w:r>
-        <w:rPr>
-          <w:rFonts w:ascii="Consolas" w:hAnsi="Consolas"/>
-          <w:sz w:val="16"/>
-        </w:rPr>
-        <w:t>Wald conjunto de pendientes (test DxVolTC DxDolar) y Chow, por rezago:</w:t>
-        <w:br/>
-      </w:r>
-      <w:r>
-        <w:rPr>
-          <w:rFonts w:ascii="Consolas" w:hAnsi="Consolas"/>
-          <w:sz w:val="16"/>
-        </w:rPr>
-        <w:t xml:space="preserve">   lag 3:  Wald F=2.01  p=0.1417   |  Chow fuerte (p&lt;0.001)</w:t>
-        <w:br/>
-      </w:r>
-      <w:r>
-        <w:rPr>
-          <w:rFonts w:ascii="Consolas" w:hAnsi="Consolas"/>
-          <w:sz w:val="16"/>
-        </w:rPr>
-        <w:t xml:space="preserve">   lag 5:  Wald F=1.99  p=0.1440   |  Chow fuerte (p&lt;0.001)</w:t>
-        <w:br/>
-      </w:r>
-      <w:r>
-        <w:rPr>
-          <w:rFonts w:ascii="Consolas" w:hAnsi="Consolas"/>
-          <w:sz w:val="16"/>
-        </w:rPr>
-        <w:t xml:space="preserve">   lag 6:  Wald F=2.07  p=0.1329   |  Chow fuerte (p&lt;0.001)</w:t>
-      </w:r>
-    </w:p>
-    <w:p>
-      <w:r>
-        <w:rPr>
-          <w:rFonts w:ascii="Arial" w:hAnsi="Arial"/>
-          <w:i w:val="0"/>
-          <w:sz w:val="20"/>
-        </w:rPr>
-        <w:t>Las conclusiones (nivel significativo; pendientes estables) no dependen del ancho de banda del estimador HAC.</w:t>
-      </w:r>
-    </w:p>
-    <w:p>
-      <w:pPr>
-        <w:pStyle w:val="Heading2"/>
-      </w:pPr>
-      <w:r>
-        <w:t>Apéndice O. Robustez — régimen gradual y dolarización rezagada</w:t>
-      </w:r>
-    </w:p>
-    <w:p>
-      <w:pPr>
-        <w:spacing w:after="0" w:before="0" w:line="240" w:lineRule="auto"/>
-      </w:pPr>
-      <w:r>
-        <w:rPr>
-          <w:rFonts w:ascii="Consolas" w:hAnsi="Consolas"/>
-          <w:sz w:val="16"/>
-        </w:rPr>
-        <w:t>(vi) Regimen gradual (rampa lineal 2011:T2-2016; 1 desde 2017):</w:t>
-        <w:br/>
-      </w:r>
-      <w:r>
-        <w:rPr>
-          <w:rFonts w:ascii="Consolas" w:hAnsi="Consolas"/>
-          <w:sz w:val="16"/>
-        </w:rPr>
-        <w:t>. newey rp VolTC_c dolar_c Reg RxV RxD, lag(4)</w:t>
-        <w:br/>
-      </w:r>
-      <w:r>
-        <w:rPr>
-          <w:rFonts w:ascii="Consolas" w:hAnsi="Consolas"/>
-          <w:sz w:val="16"/>
-        </w:rPr>
-        <w:t>. test RxV RxD   -&gt;  F(2,74) = 1.85   Prob &gt; F = 0.164   ;  RxD = -0.468 (p=0.060)</w:t>
-        <w:br/>
-      </w:r>
-      <w:r>
-        <w:rPr>
-          <w:rFonts w:ascii="Consolas" w:hAnsi="Consolas"/>
-          <w:sz w:val="16"/>
-        </w:rPr>
-        <w:br/>
-      </w:r>
-      <w:r>
-        <w:rPr>
-          <w:rFonts w:ascii="Consolas" w:hAnsi="Consolas"/>
-          <w:sz w:val="16"/>
-        </w:rPr>
-        <w:t>(vii) Dolarizacion rezagada un trimestre (mitiga simultaneidad):</w:t>
-        <w:br/>
-      </w:r>
-      <w:r>
-        <w:rPr>
-          <w:rFonts w:ascii="Consolas" w:hAnsi="Consolas"/>
-          <w:sz w:val="16"/>
-        </w:rPr>
-        <w:t>. newey rp VolTC_c Ldolar_c D2011 DxVolTC DxLD, lag(4)</w:t>
-        <w:br/>
-      </w:r>
-      <w:r>
-        <w:rPr>
-          <w:rFonts w:ascii="Consolas" w:hAnsi="Consolas"/>
-          <w:sz w:val="16"/>
-        </w:rPr>
-        <w:t>. test DxVolTC DxLD   -&gt;  F(2,74) = 2.34   Prob &gt; F = 0.103</w:t>
-      </w:r>
-    </w:p>
-    <w:p>
-      <w:r>
-        <w:rPr>
-          <w:rFonts w:ascii="Arial" w:hAnsi="Arial"/>
-          <w:i w:val="0"/>
-          <w:sz w:val="20"/>
-        </w:rPr>
-        <w:t>Ni el régimen gradual (p = 0,164) ni la dolarización rezagada (p = 0,103) alteran la conclusión conjunta de estabilidad de pendientes.</w:t>
-      </w:r>
-    </w:p>
-    <w:p>
-      <w:pPr>
-        <w:pStyle w:val="Heading2"/>
-      </w:pPr>
-      <w:r>
-        <w:t>Apéndice P. Sensibilidad — serie de promedio ponderado de plazos</w:t>
-      </w:r>
-    </w:p>
-    <w:p>
-      <w:pPr>
-        <w:spacing w:after="0" w:before="0" w:line="240" w:lineRule="auto"/>
-      </w:pPr>
-      <w:r>
-        <w:rPr>
-          <w:rFonts w:ascii="Consolas" w:hAnsi="Consolas"/>
-          <w:sz w:val="16"/>
-        </w:rPr>
-        <w:t>. newey rp_pond VolTC_cp dolar_cp D2011 DxVp DxDp, lag(4)         [n=79]</w:t>
-        <w:br/>
-      </w:r>
-      <w:r>
-        <w:rPr>
-          <w:rFonts w:ascii="Consolas" w:hAnsi="Consolas"/>
-          <w:sz w:val="16"/>
-        </w:rPr>
-        <w:t xml:space="preserve">       D2011 |   1.759895   0.419927   4.19   0.000</w:t>
-        <w:br/>
-      </w:r>
-      <w:r>
-        <w:rPr>
-          <w:rFonts w:ascii="Consolas" w:hAnsi="Consolas"/>
-          <w:sz w:val="16"/>
-        </w:rPr>
-        <w:t xml:space="preserve">        DxDp |  -0.464174   0.111033  -4.18   0.000</w:t>
-        <w:br/>
-      </w:r>
-      <w:r>
-        <w:rPr>
-          <w:rFonts w:ascii="Consolas" w:hAnsi="Consolas"/>
-          <w:sz w:val="16"/>
-        </w:rPr>
-        <w:t>. test DxVp DxDp        -&gt;  F(2,73) = 9.59   Prob &gt; F = 0.0002</w:t>
-        <w:br/>
-      </w:r>
-      <w:r>
-        <w:rPr>
-          <w:rFonts w:ascii="Consolas" w:hAnsi="Consolas"/>
-          <w:sz w:val="16"/>
-        </w:rPr>
-        <w:t>. newey rp_pond D2011, lag(4)   -&gt;  D2011 = 1.987 (p=0.012)   [salto de nivel]</w:t>
-      </w:r>
-    </w:p>
-    <w:p>
-      <w:r>
-        <w:rPr>
-          <w:rFonts w:ascii="Arial" w:hAnsi="Arial"/>
-          <w:i w:val="0"/>
-          <w:sz w:val="20"/>
-        </w:rPr>
-        <w:t>Con la serie alternativa de promedio ponderado (empalma dos publicaciones del BCP y está expuesta al sesgo de composición por plazos), el salto de nivel se mantiene (+1,99 pp; p = 0,012) pero las interacciones aparecen significativas (Wald F = 9,59; p &lt; 0,001). La evidencia de nivel es robusta a la definición de la serie; la de pendientes es sensible a ella, y esa sensibilidad se declara.</w:t>
-      </w:r>
-    </w:p>
-    <w:p>
-      <w:pPr>
-        <w:pStyle w:val="Heading2"/>
-      </w:pPr>
-      <w:r>
-        <w:t>Apéndice Q. Correlación entre la prima de riesgo y la dolarización, por subperíodo</w:t>
-      </w:r>
-    </w:p>
-    <w:p>
-      <w:pPr>
-        <w:spacing w:after="0" w:before="0" w:line="240" w:lineRule="auto"/>
-      </w:pPr>
-      <w:r>
-        <w:rPr>
-          <w:rFonts w:ascii="Consolas" w:hAnsi="Consolas"/>
-          <w:sz w:val="16"/>
+          <w:sz w:val="15"/>
         </w:rPr>
         <w:t>. corr rp dolar if D2011==0   -&gt;  +0.146   (n=25)</w:t>
         <w:br/>
@@ -1814,7 +1270,7 @@
       <w:r>
         <w:rPr>
           <w:rFonts w:ascii="Consolas" w:hAnsi="Consolas"/>
-          <w:sz w:val="16"/>
+          <w:sz w:val="15"/>
         </w:rPr>
         <w:t>. corr rp dolar if D2011==1   -&gt;  -0.149   (n=55)</w:t>
       </w:r>
@@ -1826,7 +1282,7 @@
           <w:i w:val="0"/>
           <w:sz w:val="20"/>
         </w:rPr>
-        <w:t>La correlación simple entre la prima de riesgo y la dolarización es baja y estadísticamente indistinguible entre subperíodos (prueba de Fisher: p ≈ 0,24).</w:t>
+        <w:t>Correlación baja e indistinguible entre subperíodos (prueba de Fisher: p≈0,24).</w:t>
       </w:r>
     </w:p>
     <w:p>
@@ -1839,7 +1295,7 @@
         <w:pStyle w:val="Heading2"/>
       </w:pPr>
       <w:r>
-        <w:t>Apéndice R. Figura A1. Diferencial de retorno trimestral DR (guaraníes vs. dólares), 2004–2024.</w:t>
+        <w:t>Apéndice O. Figura A1 — Diferencial de retorno trimestral DR (guaraníes vs. dólares), 2004–2024</w:t>
       </w:r>
     </w:p>
     <w:p>
@@ -1896,7 +1352,7 @@
         <w:pStyle w:val="Heading2"/>
       </w:pPr>
       <w:r>
-        <w:t>Apéndice S. Figura A2. Descomposición de Fisher: prima de inflación vs. prima de riesgo, antes y después de 2011:T2.</w:t>
+        <w:t>Apéndice P. Figura A2 — Descomposición de Fisher: prima de inflación vs. prima de riesgo</w:t>
       </w:r>
     </w:p>
     <w:p>
@@ -1953,7 +1409,7 @@
         <w:pStyle w:val="Heading2"/>
       </w:pPr>
       <w:r>
-        <w:t>Apéndice T. Figura A3. Composición de la prima de riesgo entre riesgo cambiario e iliquidez (ventana móvil de 20 trimestres).</w:t>
+        <w:t>Apéndice Q. Figura A3 — Composición de la prima de riesgo (ventana móvil de 20 trimestres)</w:t>
       </w:r>
     </w:p>
     <w:p>

</xml_diff>

<commit_message>
Apendice: + diccionario de variables y trazabilidad de fuentes (tablas); + guion de defensa (14 preguntas del profesor respondidas con numeros T2)
</commit_message>
<xml_diff>
--- a/Apendice_CDA_Scavone_Fernandez.docx
+++ b/Apendice_CDA_Scavone_Fernandez.docx
@@ -1295,7 +1295,3216 @@
         <w:pStyle w:val="Heading2"/>
       </w:pPr>
       <w:r>
-        <w:t>Apéndice O. Figura A1 — Diferencial de retorno trimestral DR (guaraníes vs. dólares), 2004–2024</w:t>
+        <w:t>Apéndice O. Diccionario de variables de la base</w:t>
+      </w:r>
+    </w:p>
+    <w:p>
+      <w:r>
+        <w:rPr>
+          <w:rFonts w:ascii="Arial" w:hAnsi="Arial"/>
+          <w:i w:val="0"/>
+          <w:sz w:val="20"/>
+        </w:rPr>
+        <w:t>Base base_cda.csv (84 trimestres, 2004:T1–2024:T4; 27 variables). Cada variable con su unidad, fuente oficial, regla de agregación y cobertura. La misma información está en la hoja «diccionario» del archivo base_cda.xlsx.</w:t>
+      </w:r>
+    </w:p>
+    <w:tbl>
+      <w:tblPr>
+        <w:tblStyle w:val="TableGrid"/>
+        <w:tblW w:type="auto" w:w="0"/>
+        <w:tblLook w:firstColumn="1" w:firstRow="1" w:lastColumn="0" w:lastRow="0" w:noHBand="0" w:noVBand="1" w:val="04A0"/>
+      </w:tblPr>
+      <w:tblGrid>
+        <w:gridCol w:w="1560"/>
+        <w:gridCol w:w="1560"/>
+        <w:gridCol w:w="1560"/>
+        <w:gridCol w:w="1560"/>
+        <w:gridCol w:w="1560"/>
+        <w:gridCol w:w="1560"/>
+      </w:tblGrid>
+      <w:tr>
+        <w:tc>
+          <w:tcPr>
+            <w:tcW w:type="dxa" w:w="1560"/>
+          </w:tcPr>
+          <w:p>
+            <w:r>
+              <w:rPr>
+                <w:rFonts w:ascii="Arial" w:hAnsi="Arial"/>
+                <w:b/>
+                <w:sz w:val="15"/>
+              </w:rPr>
+              <w:t>variable</w:t>
+            </w:r>
+          </w:p>
+        </w:tc>
+        <w:tc>
+          <w:tcPr>
+            <w:tcW w:type="dxa" w:w="1560"/>
+          </w:tcPr>
+          <w:p>
+            <w:r>
+              <w:rPr>
+                <w:rFonts w:ascii="Arial" w:hAnsi="Arial"/>
+                <w:b/>
+                <w:sz w:val="15"/>
+              </w:rPr>
+              <w:t>descripcion</w:t>
+            </w:r>
+          </w:p>
+        </w:tc>
+        <w:tc>
+          <w:tcPr>
+            <w:tcW w:type="dxa" w:w="1560"/>
+          </w:tcPr>
+          <w:p>
+            <w:r>
+              <w:rPr>
+                <w:rFonts w:ascii="Arial" w:hAnsi="Arial"/>
+                <w:b/>
+                <w:sz w:val="15"/>
+              </w:rPr>
+              <w:t>unidad</w:t>
+            </w:r>
+          </w:p>
+        </w:tc>
+        <w:tc>
+          <w:tcPr>
+            <w:tcW w:type="dxa" w:w="1560"/>
+          </w:tcPr>
+          <w:p>
+            <w:r>
+              <w:rPr>
+                <w:rFonts w:ascii="Arial" w:hAnsi="Arial"/>
+                <w:b/>
+                <w:sz w:val="15"/>
+              </w:rPr>
+              <w:t>fuente</w:t>
+            </w:r>
+          </w:p>
+        </w:tc>
+        <w:tc>
+          <w:tcPr>
+            <w:tcW w:type="dxa" w:w="1560"/>
+          </w:tcPr>
+          <w:p>
+            <w:r>
+              <w:rPr>
+                <w:rFonts w:ascii="Arial" w:hAnsi="Arial"/>
+                <w:b/>
+                <w:sz w:val="15"/>
+              </w:rPr>
+              <w:t>regla_agregacion</w:t>
+            </w:r>
+          </w:p>
+        </w:tc>
+        <w:tc>
+          <w:tcPr>
+            <w:tcW w:type="dxa" w:w="1560"/>
+          </w:tcPr>
+          <w:p>
+            <w:r>
+              <w:rPr>
+                <w:rFonts w:ascii="Arial" w:hAnsi="Arial"/>
+                <w:b/>
+                <w:sz w:val="15"/>
+              </w:rPr>
+              <w:t>cobertura</w:t>
+            </w:r>
+          </w:p>
+        </w:tc>
+      </w:tr>
+      <w:tr>
+        <w:tc>
+          <w:tcPr>
+            <w:tcW w:type="dxa" w:w="1560"/>
+          </w:tcPr>
+          <w:p>
+            <w:r>
+              <w:rPr>
+                <w:rFonts w:ascii="Arial" w:hAnsi="Arial"/>
+                <w:sz w:val="15"/>
+              </w:rPr>
+              <w:t>anio</w:t>
+            </w:r>
+          </w:p>
+        </w:tc>
+        <w:tc>
+          <w:tcPr>
+            <w:tcW w:type="dxa" w:w="1560"/>
+          </w:tcPr>
+          <w:p>
+            <w:r>
+              <w:rPr>
+                <w:rFonts w:ascii="Arial" w:hAnsi="Arial"/>
+                <w:sz w:val="15"/>
+              </w:rPr>
+              <w:t>Año calendario</w:t>
+            </w:r>
+          </w:p>
+        </w:tc>
+        <w:tc>
+          <w:tcPr>
+            <w:tcW w:type="dxa" w:w="1560"/>
+          </w:tcPr>
+          <w:p>
+            <w:r>
+              <w:rPr>
+                <w:rFonts w:ascii="Arial" w:hAnsi="Arial"/>
+                <w:sz w:val="15"/>
+              </w:rPr>
+              <w:t>-</w:t>
+            </w:r>
+          </w:p>
+        </w:tc>
+        <w:tc>
+          <w:tcPr>
+            <w:tcW w:type="dxa" w:w="1560"/>
+          </w:tcPr>
+          <w:p>
+            <w:r>
+              <w:rPr>
+                <w:rFonts w:ascii="Arial" w:hAnsi="Arial"/>
+                <w:sz w:val="15"/>
+              </w:rPr>
+              <w:t>-</w:t>
+            </w:r>
+          </w:p>
+        </w:tc>
+        <w:tc>
+          <w:tcPr>
+            <w:tcW w:type="dxa" w:w="1560"/>
+          </w:tcPr>
+          <w:p>
+            <w:r>
+              <w:rPr>
+                <w:rFonts w:ascii="Arial" w:hAnsi="Arial"/>
+                <w:sz w:val="15"/>
+              </w:rPr>
+              <w:t>-</w:t>
+            </w:r>
+          </w:p>
+        </w:tc>
+        <w:tc>
+          <w:tcPr>
+            <w:tcW w:type="dxa" w:w="1560"/>
+          </w:tcPr>
+          <w:p>
+            <w:r>
+              <w:rPr>
+                <w:rFonts w:ascii="Arial" w:hAnsi="Arial"/>
+                <w:sz w:val="15"/>
+              </w:rPr>
+              <w:t>84/84</w:t>
+            </w:r>
+          </w:p>
+        </w:tc>
+      </w:tr>
+      <w:tr>
+        <w:tc>
+          <w:tcPr>
+            <w:tcW w:type="dxa" w:w="1560"/>
+          </w:tcPr>
+          <w:p>
+            <w:r>
+              <w:rPr>
+                <w:rFonts w:ascii="Arial" w:hAnsi="Arial"/>
+                <w:sz w:val="15"/>
+              </w:rPr>
+              <w:t>trimestre</w:t>
+            </w:r>
+          </w:p>
+        </w:tc>
+        <w:tc>
+          <w:tcPr>
+            <w:tcW w:type="dxa" w:w="1560"/>
+          </w:tcPr>
+          <w:p>
+            <w:r>
+              <w:rPr>
+                <w:rFonts w:ascii="Arial" w:hAnsi="Arial"/>
+                <w:sz w:val="15"/>
+              </w:rPr>
+              <w:t>Trimestre (1-4)</w:t>
+            </w:r>
+          </w:p>
+        </w:tc>
+        <w:tc>
+          <w:tcPr>
+            <w:tcW w:type="dxa" w:w="1560"/>
+          </w:tcPr>
+          <w:p>
+            <w:r>
+              <w:rPr>
+                <w:rFonts w:ascii="Arial" w:hAnsi="Arial"/>
+                <w:sz w:val="15"/>
+              </w:rPr>
+              <w:t>-</w:t>
+            </w:r>
+          </w:p>
+        </w:tc>
+        <w:tc>
+          <w:tcPr>
+            <w:tcW w:type="dxa" w:w="1560"/>
+          </w:tcPr>
+          <w:p>
+            <w:r>
+              <w:rPr>
+                <w:rFonts w:ascii="Arial" w:hAnsi="Arial"/>
+                <w:sz w:val="15"/>
+              </w:rPr>
+              <w:t>-</w:t>
+            </w:r>
+          </w:p>
+        </w:tc>
+        <w:tc>
+          <w:tcPr>
+            <w:tcW w:type="dxa" w:w="1560"/>
+          </w:tcPr>
+          <w:p>
+            <w:r>
+              <w:rPr>
+                <w:rFonts w:ascii="Arial" w:hAnsi="Arial"/>
+                <w:sz w:val="15"/>
+              </w:rPr>
+              <w:t>-</w:t>
+            </w:r>
+          </w:p>
+        </w:tc>
+        <w:tc>
+          <w:tcPr>
+            <w:tcW w:type="dxa" w:w="1560"/>
+          </w:tcPr>
+          <w:p>
+            <w:r>
+              <w:rPr>
+                <w:rFonts w:ascii="Arial" w:hAnsi="Arial"/>
+                <w:sz w:val="15"/>
+              </w:rPr>
+              <w:t>84/84</w:t>
+            </w:r>
+          </w:p>
+        </w:tc>
+      </w:tr>
+      <w:tr>
+        <w:tc>
+          <w:tcPr>
+            <w:tcW w:type="dxa" w:w="1560"/>
+          </w:tcPr>
+          <w:p>
+            <w:r>
+              <w:rPr>
+                <w:rFonts w:ascii="Arial" w:hAnsi="Arial"/>
+                <w:sz w:val="15"/>
+              </w:rPr>
+              <w:t>fecha</w:t>
+            </w:r>
+          </w:p>
+        </w:tc>
+        <w:tc>
+          <w:tcPr>
+            <w:tcW w:type="dxa" w:w="1560"/>
+          </w:tcPr>
+          <w:p>
+            <w:r>
+              <w:rPr>
+                <w:rFonts w:ascii="Arial" w:hAnsi="Arial"/>
+                <w:sz w:val="15"/>
+              </w:rPr>
+              <w:t>Etiqueta YYYYQn</w:t>
+            </w:r>
+          </w:p>
+        </w:tc>
+        <w:tc>
+          <w:tcPr>
+            <w:tcW w:type="dxa" w:w="1560"/>
+          </w:tcPr>
+          <w:p>
+            <w:r>
+              <w:rPr>
+                <w:rFonts w:ascii="Arial" w:hAnsi="Arial"/>
+                <w:sz w:val="15"/>
+              </w:rPr>
+              <w:t>-</w:t>
+            </w:r>
+          </w:p>
+        </w:tc>
+        <w:tc>
+          <w:tcPr>
+            <w:tcW w:type="dxa" w:w="1560"/>
+          </w:tcPr>
+          <w:p>
+            <w:r>
+              <w:rPr>
+                <w:rFonts w:ascii="Arial" w:hAnsi="Arial"/>
+                <w:sz w:val="15"/>
+              </w:rPr>
+              <w:t>-</w:t>
+            </w:r>
+          </w:p>
+        </w:tc>
+        <w:tc>
+          <w:tcPr>
+            <w:tcW w:type="dxa" w:w="1560"/>
+          </w:tcPr>
+          <w:p>
+            <w:r>
+              <w:rPr>
+                <w:rFonts w:ascii="Arial" w:hAnsi="Arial"/>
+                <w:sz w:val="15"/>
+              </w:rPr>
+              <w:t>-</w:t>
+            </w:r>
+          </w:p>
+        </w:tc>
+        <w:tc>
+          <w:tcPr>
+            <w:tcW w:type="dxa" w:w="1560"/>
+          </w:tcPr>
+          <w:p>
+            <w:r>
+              <w:rPr>
+                <w:rFonts w:ascii="Arial" w:hAnsi="Arial"/>
+                <w:sz w:val="15"/>
+              </w:rPr>
+              <w:t>84/84</w:t>
+            </w:r>
+          </w:p>
+        </w:tc>
+      </w:tr>
+      <w:tr>
+        <w:tc>
+          <w:tcPr>
+            <w:tcW w:type="dxa" w:w="1560"/>
+          </w:tcPr>
+          <w:p>
+            <w:r>
+              <w:rPr>
+                <w:rFonts w:ascii="Arial" w:hAnsi="Arial"/>
+                <w:sz w:val="15"/>
+              </w:rPr>
+              <w:t>i_Gs</w:t>
+            </w:r>
+          </w:p>
+        </w:tc>
+        <w:tc>
+          <w:tcPr>
+            <w:tcW w:type="dxa" w:w="1560"/>
+          </w:tcPr>
+          <w:p>
+            <w:r>
+              <w:rPr>
+                <w:rFonts w:ascii="Arial" w:hAnsi="Arial"/>
+                <w:sz w:val="15"/>
+              </w:rPr>
+              <w:t>Tasa efectiva CDA &lt;=365 días, bancos, moneda nacional (SERIE PRIMARIA)</w:t>
+            </w:r>
+          </w:p>
+        </w:tc>
+        <w:tc>
+          <w:tcPr>
+            <w:tcW w:type="dxa" w:w="1560"/>
+          </w:tcPr>
+          <w:p>
+            <w:r>
+              <w:rPr>
+                <w:rFonts w:ascii="Arial" w:hAnsi="Arial"/>
+                <w:sz w:val="15"/>
+              </w:rPr>
+              <w:t>% anual</w:t>
+            </w:r>
+          </w:p>
+        </w:tc>
+        <w:tc>
+          <w:tcPr>
+            <w:tcW w:type="dxa" w:w="1560"/>
+          </w:tcPr>
+          <w:p>
+            <w:r>
+              <w:rPr>
+                <w:rFonts w:ascii="Arial" w:hAnsi="Arial"/>
+                <w:sz w:val="15"/>
+              </w:rPr>
+              <w:t>BCP-SB, boletines 'Promedio de Tasas'</w:t>
+            </w:r>
+          </w:p>
+        </w:tc>
+        <w:tc>
+          <w:tcPr>
+            <w:tcW w:type="dxa" w:w="1560"/>
+          </w:tcPr>
+          <w:p>
+            <w:r>
+              <w:rPr>
+                <w:rFonts w:ascii="Arial" w:hAnsi="Arial"/>
+                <w:sz w:val="15"/>
+              </w:rPr>
+              <w:t>promedio de meses publicados del trimestre</w:t>
+            </w:r>
+          </w:p>
+        </w:tc>
+        <w:tc>
+          <w:tcPr>
+            <w:tcW w:type="dxa" w:w="1560"/>
+          </w:tcPr>
+          <w:p>
+            <w:r>
+              <w:rPr>
+                <w:rFonts w:ascii="Arial" w:hAnsi="Arial"/>
+                <w:sz w:val="15"/>
+              </w:rPr>
+              <w:t>84/84 (10 meses no publicados, ver fuentes)</w:t>
+            </w:r>
+          </w:p>
+        </w:tc>
+      </w:tr>
+      <w:tr>
+        <w:tc>
+          <w:tcPr>
+            <w:tcW w:type="dxa" w:w="1560"/>
+          </w:tcPr>
+          <w:p>
+            <w:r>
+              <w:rPr>
+                <w:rFonts w:ascii="Arial" w:hAnsi="Arial"/>
+                <w:sz w:val="15"/>
+              </w:rPr>
+              <w:t>i_USD</w:t>
+            </w:r>
+          </w:p>
+        </w:tc>
+        <w:tc>
+          <w:tcPr>
+            <w:tcW w:type="dxa" w:w="1560"/>
+          </w:tcPr>
+          <w:p>
+            <w:r>
+              <w:rPr>
+                <w:rFonts w:ascii="Arial" w:hAnsi="Arial"/>
+                <w:sz w:val="15"/>
+              </w:rPr>
+              <w:t>Tasa efectiva CDA &lt;=365 días, bancos, moneda extranjera (SERIE PRIMARIA)</w:t>
+            </w:r>
+          </w:p>
+        </w:tc>
+        <w:tc>
+          <w:tcPr>
+            <w:tcW w:type="dxa" w:w="1560"/>
+          </w:tcPr>
+          <w:p>
+            <w:r>
+              <w:rPr>
+                <w:rFonts w:ascii="Arial" w:hAnsi="Arial"/>
+                <w:sz w:val="15"/>
+              </w:rPr>
+              <w:t>% anual</w:t>
+            </w:r>
+          </w:p>
+        </w:tc>
+        <w:tc>
+          <w:tcPr>
+            <w:tcW w:type="dxa" w:w="1560"/>
+          </w:tcPr>
+          <w:p>
+            <w:r>
+              <w:rPr>
+                <w:rFonts w:ascii="Arial" w:hAnsi="Arial"/>
+                <w:sz w:val="15"/>
+              </w:rPr>
+              <w:t>BCP-SB, 'Promedio de Tasas'</w:t>
+            </w:r>
+          </w:p>
+        </w:tc>
+        <w:tc>
+          <w:tcPr>
+            <w:tcW w:type="dxa" w:w="1560"/>
+          </w:tcPr>
+          <w:p>
+            <w:r>
+              <w:rPr>
+                <w:rFonts w:ascii="Arial" w:hAnsi="Arial"/>
+                <w:sz w:val="15"/>
+              </w:rPr>
+              <w:t>promedio de meses publicados</w:t>
+            </w:r>
+          </w:p>
+        </w:tc>
+        <w:tc>
+          <w:tcPr>
+            <w:tcW w:type="dxa" w:w="1560"/>
+          </w:tcPr>
+          <w:p>
+            <w:r>
+              <w:rPr>
+                <w:rFonts w:ascii="Arial" w:hAnsi="Arial"/>
+                <w:sz w:val="15"/>
+              </w:rPr>
+              <w:t>84/84</w:t>
+            </w:r>
+          </w:p>
+        </w:tc>
+      </w:tr>
+      <w:tr>
+        <w:tc>
+          <w:tcPr>
+            <w:tcW w:type="dxa" w:w="1560"/>
+          </w:tcPr>
+          <w:p>
+            <w:r>
+              <w:rPr>
+                <w:rFonts w:ascii="Arial" w:hAnsi="Arial"/>
+                <w:sz w:val="15"/>
+              </w:rPr>
+              <w:t>i_Gs_fdt</w:t>
+            </w:r>
+          </w:p>
+        </w:tc>
+        <w:tc>
+          <w:tcPr>
+            <w:tcW w:type="dxa" w:w="1560"/>
+          </w:tcPr>
+          <w:p>
+            <w:r>
+              <w:rPr>
+                <w:rFonts w:ascii="Arial" w:hAnsi="Arial"/>
+                <w:sz w:val="15"/>
+              </w:rPr>
+              <w:t>CDA &lt;=365 Gs, último mes publicado del trimestre</w:t>
+            </w:r>
+          </w:p>
+        </w:tc>
+        <w:tc>
+          <w:tcPr>
+            <w:tcW w:type="dxa" w:w="1560"/>
+          </w:tcPr>
+          <w:p>
+            <w:r>
+              <w:rPr>
+                <w:rFonts w:ascii="Arial" w:hAnsi="Arial"/>
+                <w:sz w:val="15"/>
+              </w:rPr>
+              <w:t>% anual</w:t>
+            </w:r>
+          </w:p>
+        </w:tc>
+        <w:tc>
+          <w:tcPr>
+            <w:tcW w:type="dxa" w:w="1560"/>
+          </w:tcPr>
+          <w:p>
+            <w:r>
+              <w:rPr>
+                <w:rFonts w:ascii="Arial" w:hAnsi="Arial"/>
+                <w:sz w:val="15"/>
+              </w:rPr>
+              <w:t>BCP-SB</w:t>
+            </w:r>
+          </w:p>
+        </w:tc>
+        <w:tc>
+          <w:tcPr>
+            <w:tcW w:type="dxa" w:w="1560"/>
+          </w:tcPr>
+          <w:p>
+            <w:r>
+              <w:rPr>
+                <w:rFonts w:ascii="Arial" w:hAnsi="Arial"/>
+                <w:sz w:val="15"/>
+              </w:rPr>
+              <w:t>último mes publicado</w:t>
+            </w:r>
+          </w:p>
+        </w:tc>
+        <w:tc>
+          <w:tcPr>
+            <w:tcW w:type="dxa" w:w="1560"/>
+          </w:tcPr>
+          <w:p>
+            <w:r>
+              <w:rPr>
+                <w:rFonts w:ascii="Arial" w:hAnsi="Arial"/>
+                <w:sz w:val="15"/>
+              </w:rPr>
+              <w:t>84/84</w:t>
+            </w:r>
+          </w:p>
+        </w:tc>
+      </w:tr>
+      <w:tr>
+        <w:tc>
+          <w:tcPr>
+            <w:tcW w:type="dxa" w:w="1560"/>
+          </w:tcPr>
+          <w:p>
+            <w:r>
+              <w:rPr>
+                <w:rFonts w:ascii="Arial" w:hAnsi="Arial"/>
+                <w:sz w:val="15"/>
+              </w:rPr>
+              <w:t>i_USD_fdt</w:t>
+            </w:r>
+          </w:p>
+        </w:tc>
+        <w:tc>
+          <w:tcPr>
+            <w:tcW w:type="dxa" w:w="1560"/>
+          </w:tcPr>
+          <w:p>
+            <w:r>
+              <w:rPr>
+                <w:rFonts w:ascii="Arial" w:hAnsi="Arial"/>
+                <w:sz w:val="15"/>
+              </w:rPr>
+              <w:t>CDA &lt;=365 USD, último mes publicado</w:t>
+            </w:r>
+          </w:p>
+        </w:tc>
+        <w:tc>
+          <w:tcPr>
+            <w:tcW w:type="dxa" w:w="1560"/>
+          </w:tcPr>
+          <w:p>
+            <w:r>
+              <w:rPr>
+                <w:rFonts w:ascii="Arial" w:hAnsi="Arial"/>
+                <w:sz w:val="15"/>
+              </w:rPr>
+              <w:t>% anual</w:t>
+            </w:r>
+          </w:p>
+        </w:tc>
+        <w:tc>
+          <w:tcPr>
+            <w:tcW w:type="dxa" w:w="1560"/>
+          </w:tcPr>
+          <w:p>
+            <w:r>
+              <w:rPr>
+                <w:rFonts w:ascii="Arial" w:hAnsi="Arial"/>
+                <w:sz w:val="15"/>
+              </w:rPr>
+              <w:t>BCP-SB</w:t>
+            </w:r>
+          </w:p>
+        </w:tc>
+        <w:tc>
+          <w:tcPr>
+            <w:tcW w:type="dxa" w:w="1560"/>
+          </w:tcPr>
+          <w:p>
+            <w:r>
+              <w:rPr>
+                <w:rFonts w:ascii="Arial" w:hAnsi="Arial"/>
+                <w:sz w:val="15"/>
+              </w:rPr>
+              <w:t>último mes publicado</w:t>
+            </w:r>
+          </w:p>
+        </w:tc>
+        <w:tc>
+          <w:tcPr>
+            <w:tcW w:type="dxa" w:w="1560"/>
+          </w:tcPr>
+          <w:p>
+            <w:r>
+              <w:rPr>
+                <w:rFonts w:ascii="Arial" w:hAnsi="Arial"/>
+                <w:sz w:val="15"/>
+              </w:rPr>
+              <w:t>84/84</w:t>
+            </w:r>
+          </w:p>
+        </w:tc>
+      </w:tr>
+      <w:tr>
+        <w:tc>
+          <w:tcPr>
+            <w:tcW w:type="dxa" w:w="1560"/>
+          </w:tcPr>
+          <w:p>
+            <w:r>
+              <w:rPr>
+                <w:rFonts w:ascii="Arial" w:hAnsi="Arial"/>
+                <w:sz w:val="15"/>
+              </w:rPr>
+              <w:t>meses_cobertura</w:t>
+            </w:r>
+          </w:p>
+        </w:tc>
+        <w:tc>
+          <w:tcPr>
+            <w:tcW w:type="dxa" w:w="1560"/>
+          </w:tcPr>
+          <w:p>
+            <w:r>
+              <w:rPr>
+                <w:rFonts w:ascii="Arial" w:hAnsi="Arial"/>
+                <w:sz w:val="15"/>
+              </w:rPr>
+              <w:t>Cantidad de meses publicados usados en el promedio del trimestre</w:t>
+            </w:r>
+          </w:p>
+        </w:tc>
+        <w:tc>
+          <w:tcPr>
+            <w:tcW w:type="dxa" w:w="1560"/>
+          </w:tcPr>
+          <w:p>
+            <w:r>
+              <w:rPr>
+                <w:rFonts w:ascii="Arial" w:hAnsi="Arial"/>
+                <w:sz w:val="15"/>
+              </w:rPr>
+              <w:t>1-3</w:t>
+            </w:r>
+          </w:p>
+        </w:tc>
+        <w:tc>
+          <w:tcPr>
+            <w:tcW w:type="dxa" w:w="1560"/>
+          </w:tcPr>
+          <w:p>
+            <w:r>
+              <w:rPr>
+                <w:rFonts w:ascii="Arial" w:hAnsi="Arial"/>
+                <w:sz w:val="15"/>
+              </w:rPr>
+              <w:t>BCP-SB</w:t>
+            </w:r>
+          </w:p>
+        </w:tc>
+        <w:tc>
+          <w:tcPr>
+            <w:tcW w:type="dxa" w:w="1560"/>
+          </w:tcPr>
+          <w:p>
+            <w:r>
+              <w:rPr>
+                <w:rFonts w:ascii="Arial" w:hAnsi="Arial"/>
+                <w:sz w:val="15"/>
+              </w:rPr>
+              <w:t>conteo</w:t>
+            </w:r>
+          </w:p>
+        </w:tc>
+        <w:tc>
+          <w:tcPr>
+            <w:tcW w:type="dxa" w:w="1560"/>
+          </w:tcPr>
+          <w:p>
+            <w:r>
+              <w:rPr>
+                <w:rFonts w:ascii="Arial" w:hAnsi="Arial"/>
+                <w:sz w:val="15"/>
+              </w:rPr>
+              <w:t>84/84</w:t>
+            </w:r>
+          </w:p>
+        </w:tc>
+      </w:tr>
+      <w:tr>
+        <w:tc>
+          <w:tcPr>
+            <w:tcW w:type="dxa" w:w="1560"/>
+          </w:tcPr>
+          <w:p>
+            <w:r>
+              <w:rPr>
+                <w:rFonts w:ascii="Arial" w:hAnsi="Arial"/>
+                <w:sz w:val="15"/>
+              </w:rPr>
+              <w:t>ultimo_mes_publicado</w:t>
+            </w:r>
+          </w:p>
+        </w:tc>
+        <w:tc>
+          <w:tcPr>
+            <w:tcW w:type="dxa" w:w="1560"/>
+          </w:tcPr>
+          <w:p>
+            <w:r>
+              <w:rPr>
+                <w:rFonts w:ascii="Arial" w:hAnsi="Arial"/>
+                <w:sz w:val="15"/>
+              </w:rPr>
+              <w:t>Mes del dato fdt</w:t>
+            </w:r>
+          </w:p>
+        </w:tc>
+        <w:tc>
+          <w:tcPr>
+            <w:tcW w:type="dxa" w:w="1560"/>
+          </w:tcPr>
+          <w:p>
+            <w:r>
+              <w:rPr>
+                <w:rFonts w:ascii="Arial" w:hAnsi="Arial"/>
+                <w:sz w:val="15"/>
+              </w:rPr>
+              <w:t>1-12</w:t>
+            </w:r>
+          </w:p>
+        </w:tc>
+        <w:tc>
+          <w:tcPr>
+            <w:tcW w:type="dxa" w:w="1560"/>
+          </w:tcPr>
+          <w:p>
+            <w:r>
+              <w:rPr>
+                <w:rFonts w:ascii="Arial" w:hAnsi="Arial"/>
+                <w:sz w:val="15"/>
+              </w:rPr>
+              <w:t>BCP-SB</w:t>
+            </w:r>
+          </w:p>
+        </w:tc>
+        <w:tc>
+          <w:tcPr>
+            <w:tcW w:type="dxa" w:w="1560"/>
+          </w:tcPr>
+          <w:p>
+            <w:r>
+              <w:rPr>
+                <w:rFonts w:ascii="Arial" w:hAnsi="Arial"/>
+                <w:sz w:val="15"/>
+              </w:rPr>
+              <w:t>-</w:t>
+            </w:r>
+          </w:p>
+        </w:tc>
+        <w:tc>
+          <w:tcPr>
+            <w:tcW w:type="dxa" w:w="1560"/>
+          </w:tcPr>
+          <w:p>
+            <w:r>
+              <w:rPr>
+                <w:rFonts w:ascii="Arial" w:hAnsi="Arial"/>
+                <w:sz w:val="15"/>
+              </w:rPr>
+              <w:t>84/84</w:t>
+            </w:r>
+          </w:p>
+        </w:tc>
+      </w:tr>
+      <w:tr>
+        <w:tc>
+          <w:tcPr>
+            <w:tcW w:type="dxa" w:w="1560"/>
+          </w:tcPr>
+          <w:p>
+            <w:r>
+              <w:rPr>
+                <w:rFonts w:ascii="Arial" w:hAnsi="Arial"/>
+                <w:sz w:val="15"/>
+              </w:rPr>
+              <w:t>TC</w:t>
+            </w:r>
+          </w:p>
+        </w:tc>
+        <w:tc>
+          <w:tcPr>
+            <w:tcW w:type="dxa" w:w="1560"/>
+          </w:tcPr>
+          <w:p>
+            <w:r>
+              <w:rPr>
+                <w:rFonts w:ascii="Arial" w:hAnsi="Arial"/>
+                <w:sz w:val="15"/>
+              </w:rPr>
+              <w:t>Tipo de cambio nominal Gs/USD, promedio del último mes del trimestre</w:t>
+            </w:r>
+          </w:p>
+        </w:tc>
+        <w:tc>
+          <w:tcPr>
+            <w:tcW w:type="dxa" w:w="1560"/>
+          </w:tcPr>
+          <w:p>
+            <w:r>
+              <w:rPr>
+                <w:rFonts w:ascii="Arial" w:hAnsi="Arial"/>
+                <w:sz w:val="15"/>
+              </w:rPr>
+              <w:t>Gs/USD</w:t>
+            </w:r>
+          </w:p>
+        </w:tc>
+        <w:tc>
+          <w:tcPr>
+            <w:tcW w:type="dxa" w:w="1560"/>
+          </w:tcPr>
+          <w:p>
+            <w:r>
+              <w:rPr>
+                <w:rFonts w:ascii="Arial" w:hAnsi="Arial"/>
+                <w:sz w:val="15"/>
+              </w:rPr>
+              <w:t>BCP, Anexo Estadístico, Cuadro 60a col E</w:t>
+            </w:r>
+          </w:p>
+        </w:tc>
+        <w:tc>
+          <w:tcPr>
+            <w:tcW w:type="dxa" w:w="1560"/>
+          </w:tcPr>
+          <w:p>
+            <w:r>
+              <w:rPr>
+                <w:rFonts w:ascii="Arial" w:hAnsi="Arial"/>
+                <w:sz w:val="15"/>
+              </w:rPr>
+              <w:t>valor del mes de cierre</w:t>
+            </w:r>
+          </w:p>
+        </w:tc>
+        <w:tc>
+          <w:tcPr>
+            <w:tcW w:type="dxa" w:w="1560"/>
+          </w:tcPr>
+          <w:p>
+            <w:r>
+              <w:rPr>
+                <w:rFonts w:ascii="Arial" w:hAnsi="Arial"/>
+                <w:sz w:val="15"/>
+              </w:rPr>
+              <w:t>84/84</w:t>
+            </w:r>
+          </w:p>
+        </w:tc>
+      </w:tr>
+      <w:tr>
+        <w:tc>
+          <w:tcPr>
+            <w:tcW w:type="dxa" w:w="1560"/>
+          </w:tcPr>
+          <w:p>
+            <w:r>
+              <w:rPr>
+                <w:rFonts w:ascii="Arial" w:hAnsi="Arial"/>
+                <w:sz w:val="15"/>
+              </w:rPr>
+              <w:t>dolariz</w:t>
+            </w:r>
+          </w:p>
+        </w:tc>
+        <w:tc>
+          <w:tcPr>
+            <w:tcW w:type="dxa" w:w="1560"/>
+          </w:tcPr>
+          <w:p>
+            <w:r>
+              <w:rPr>
+                <w:rFonts w:ascii="Arial" w:hAnsi="Arial"/>
+                <w:sz w:val="15"/>
+              </w:rPr>
+              <w:t>Participación de depósitos en moneda extranjera</w:t>
+            </w:r>
+          </w:p>
+        </w:tc>
+        <w:tc>
+          <w:tcPr>
+            <w:tcW w:type="dxa" w:w="1560"/>
+          </w:tcPr>
+          <w:p>
+            <w:r>
+              <w:rPr>
+                <w:rFonts w:ascii="Arial" w:hAnsi="Arial"/>
+                <w:sz w:val="15"/>
+              </w:rPr>
+              <w:t>% del total</w:t>
+            </w:r>
+          </w:p>
+        </w:tc>
+        <w:tc>
+          <w:tcPr>
+            <w:tcW w:type="dxa" w:w="1560"/>
+          </w:tcPr>
+          <w:p>
+            <w:r>
+              <w:rPr>
+                <w:rFonts w:ascii="Arial" w:hAnsi="Arial"/>
+                <w:sz w:val="15"/>
+              </w:rPr>
+              <w:t>BCP, Anexo Estadístico, Cuadro 23a col O</w:t>
+            </w:r>
+          </w:p>
+        </w:tc>
+        <w:tc>
+          <w:tcPr>
+            <w:tcW w:type="dxa" w:w="1560"/>
+          </w:tcPr>
+          <w:p>
+            <w:r>
+              <w:rPr>
+                <w:rFonts w:ascii="Arial" w:hAnsi="Arial"/>
+                <w:sz w:val="15"/>
+              </w:rPr>
+              <w:t>valor del mes de cierre</w:t>
+            </w:r>
+          </w:p>
+        </w:tc>
+        <w:tc>
+          <w:tcPr>
+            <w:tcW w:type="dxa" w:w="1560"/>
+          </w:tcPr>
+          <w:p>
+            <w:r>
+              <w:rPr>
+                <w:rFonts w:ascii="Arial" w:hAnsi="Arial"/>
+                <w:sz w:val="15"/>
+              </w:rPr>
+              <w:t>84/84</w:t>
+            </w:r>
+          </w:p>
+        </w:tc>
+      </w:tr>
+      <w:tr>
+        <w:tc>
+          <w:tcPr>
+            <w:tcW w:type="dxa" w:w="1560"/>
+          </w:tcPr>
+          <w:p>
+            <w:r>
+              <w:rPr>
+                <w:rFonts w:ascii="Arial" w:hAnsi="Arial"/>
+                <w:sz w:val="15"/>
+              </w:rPr>
+              <w:t>IPC_PY</w:t>
+            </w:r>
+          </w:p>
+        </w:tc>
+        <w:tc>
+          <w:tcPr>
+            <w:tcW w:type="dxa" w:w="1560"/>
+          </w:tcPr>
+          <w:p>
+            <w:r>
+              <w:rPr>
+                <w:rFonts w:ascii="Arial" w:hAnsi="Arial"/>
+                <w:sz w:val="15"/>
+              </w:rPr>
+              <w:t>IPC Paraguay, nivel (dic-2017=100)</w:t>
+            </w:r>
+          </w:p>
+        </w:tc>
+        <w:tc>
+          <w:tcPr>
+            <w:tcW w:type="dxa" w:w="1560"/>
+          </w:tcPr>
+          <w:p>
+            <w:r>
+              <w:rPr>
+                <w:rFonts w:ascii="Arial" w:hAnsi="Arial"/>
+                <w:sz w:val="15"/>
+              </w:rPr>
+              <w:t>índice</w:t>
+            </w:r>
+          </w:p>
+        </w:tc>
+        <w:tc>
+          <w:tcPr>
+            <w:tcW w:type="dxa" w:w="1560"/>
+          </w:tcPr>
+          <w:p>
+            <w:r>
+              <w:rPr>
+                <w:rFonts w:ascii="Arial" w:hAnsi="Arial"/>
+                <w:sz w:val="15"/>
+              </w:rPr>
+              <w:t>BCP, Anexo Estadístico, Cuadro 15 col V</w:t>
+            </w:r>
+          </w:p>
+        </w:tc>
+        <w:tc>
+          <w:tcPr>
+            <w:tcW w:type="dxa" w:w="1560"/>
+          </w:tcPr>
+          <w:p>
+            <w:r>
+              <w:rPr>
+                <w:rFonts w:ascii="Arial" w:hAnsi="Arial"/>
+                <w:sz w:val="15"/>
+              </w:rPr>
+              <w:t>valor del mes de cierre</w:t>
+            </w:r>
+          </w:p>
+        </w:tc>
+        <w:tc>
+          <w:tcPr>
+            <w:tcW w:type="dxa" w:w="1560"/>
+          </w:tcPr>
+          <w:p>
+            <w:r>
+              <w:rPr>
+                <w:rFonts w:ascii="Arial" w:hAnsi="Arial"/>
+                <w:sz w:val="15"/>
+              </w:rPr>
+              <w:t>84/84</w:t>
+            </w:r>
+          </w:p>
+        </w:tc>
+      </w:tr>
+      <w:tr>
+        <w:tc>
+          <w:tcPr>
+            <w:tcW w:type="dxa" w:w="1560"/>
+          </w:tcPr>
+          <w:p>
+            <w:r>
+              <w:rPr>
+                <w:rFonts w:ascii="Arial" w:hAnsi="Arial"/>
+                <w:sz w:val="15"/>
+              </w:rPr>
+              <w:t>infl_PY_yoy</w:t>
+            </w:r>
+          </w:p>
+        </w:tc>
+        <w:tc>
+          <w:tcPr>
+            <w:tcW w:type="dxa" w:w="1560"/>
+          </w:tcPr>
+          <w:p>
+            <w:r>
+              <w:rPr>
+                <w:rFonts w:ascii="Arial" w:hAnsi="Arial"/>
+                <w:sz w:val="15"/>
+              </w:rPr>
+              <w:t>Inflación interanual Paraguay (publicada)</w:t>
+            </w:r>
+          </w:p>
+        </w:tc>
+        <w:tc>
+          <w:tcPr>
+            <w:tcW w:type="dxa" w:w="1560"/>
+          </w:tcPr>
+          <w:p>
+            <w:r>
+              <w:rPr>
+                <w:rFonts w:ascii="Arial" w:hAnsi="Arial"/>
+                <w:sz w:val="15"/>
+              </w:rPr>
+              <w:t>%</w:t>
+            </w:r>
+          </w:p>
+        </w:tc>
+        <w:tc>
+          <w:tcPr>
+            <w:tcW w:type="dxa" w:w="1560"/>
+          </w:tcPr>
+          <w:p>
+            <w:r>
+              <w:rPr>
+                <w:rFonts w:ascii="Arial" w:hAnsi="Arial"/>
+                <w:sz w:val="15"/>
+              </w:rPr>
+              <w:t>BCP, Cuadro 15 col Y</w:t>
+            </w:r>
+          </w:p>
+        </w:tc>
+        <w:tc>
+          <w:tcPr>
+            <w:tcW w:type="dxa" w:w="1560"/>
+          </w:tcPr>
+          <w:p>
+            <w:r>
+              <w:rPr>
+                <w:rFonts w:ascii="Arial" w:hAnsi="Arial"/>
+                <w:sz w:val="15"/>
+              </w:rPr>
+              <w:t>valor del mes de cierre</w:t>
+            </w:r>
+          </w:p>
+        </w:tc>
+        <w:tc>
+          <w:tcPr>
+            <w:tcW w:type="dxa" w:w="1560"/>
+          </w:tcPr>
+          <w:p>
+            <w:r>
+              <w:rPr>
+                <w:rFonts w:ascii="Arial" w:hAnsi="Arial"/>
+                <w:sz w:val="15"/>
+              </w:rPr>
+              <w:t>84/84</w:t>
+            </w:r>
+          </w:p>
+        </w:tc>
+      </w:tr>
+      <w:tr>
+        <w:tc>
+          <w:tcPr>
+            <w:tcW w:type="dxa" w:w="1560"/>
+          </w:tcPr>
+          <w:p>
+            <w:r>
+              <w:rPr>
+                <w:rFonts w:ascii="Arial" w:hAnsi="Arial"/>
+                <w:sz w:val="15"/>
+              </w:rPr>
+              <w:t>IPC_US</w:t>
+            </w:r>
+          </w:p>
+        </w:tc>
+        <w:tc>
+          <w:tcPr>
+            <w:tcW w:type="dxa" w:w="1560"/>
+          </w:tcPr>
+          <w:p>
+            <w:r>
+              <w:rPr>
+                <w:rFonts w:ascii="Arial" w:hAnsi="Arial"/>
+                <w:sz w:val="15"/>
+              </w:rPr>
+              <w:t>CPI EEUU (CPIAUCSL), nivel</w:t>
+            </w:r>
+          </w:p>
+        </w:tc>
+        <w:tc>
+          <w:tcPr>
+            <w:tcW w:type="dxa" w:w="1560"/>
+          </w:tcPr>
+          <w:p>
+            <w:r>
+              <w:rPr>
+                <w:rFonts w:ascii="Arial" w:hAnsi="Arial"/>
+                <w:sz w:val="15"/>
+              </w:rPr>
+              <w:t>índice</w:t>
+            </w:r>
+          </w:p>
+        </w:tc>
+        <w:tc>
+          <w:tcPr>
+            <w:tcW w:type="dxa" w:w="1560"/>
+          </w:tcPr>
+          <w:p>
+            <w:r>
+              <w:rPr>
+                <w:rFonts w:ascii="Arial" w:hAnsi="Arial"/>
+                <w:sz w:val="15"/>
+              </w:rPr>
+              <w:t>FRED</w:t>
+            </w:r>
+          </w:p>
+        </w:tc>
+        <w:tc>
+          <w:tcPr>
+            <w:tcW w:type="dxa" w:w="1560"/>
+          </w:tcPr>
+          <w:p>
+            <w:r>
+              <w:rPr>
+                <w:rFonts w:ascii="Arial" w:hAnsi="Arial"/>
+                <w:sz w:val="15"/>
+              </w:rPr>
+              <w:t>valor del mes de cierre</w:t>
+            </w:r>
+          </w:p>
+        </w:tc>
+        <w:tc>
+          <w:tcPr>
+            <w:tcW w:type="dxa" w:w="1560"/>
+          </w:tcPr>
+          <w:p>
+            <w:r>
+              <w:rPr>
+                <w:rFonts w:ascii="Arial" w:hAnsi="Arial"/>
+                <w:sz w:val="15"/>
+              </w:rPr>
+              <w:t>84/84</w:t>
+            </w:r>
+          </w:p>
+        </w:tc>
+      </w:tr>
+      <w:tr>
+        <w:tc>
+          <w:tcPr>
+            <w:tcW w:type="dxa" w:w="1560"/>
+          </w:tcPr>
+          <w:p>
+            <w:r>
+              <w:rPr>
+                <w:rFonts w:ascii="Arial" w:hAnsi="Arial"/>
+                <w:sz w:val="15"/>
+              </w:rPr>
+              <w:t>infl_US_yoy</w:t>
+            </w:r>
+          </w:p>
+        </w:tc>
+        <w:tc>
+          <w:tcPr>
+            <w:tcW w:type="dxa" w:w="1560"/>
+          </w:tcPr>
+          <w:p>
+            <w:r>
+              <w:rPr>
+                <w:rFonts w:ascii="Arial" w:hAnsi="Arial"/>
+                <w:sz w:val="15"/>
+              </w:rPr>
+              <w:t>Inflación interanual EEUU</w:t>
+            </w:r>
+          </w:p>
+        </w:tc>
+        <w:tc>
+          <w:tcPr>
+            <w:tcW w:type="dxa" w:w="1560"/>
+          </w:tcPr>
+          <w:p>
+            <w:r>
+              <w:rPr>
+                <w:rFonts w:ascii="Arial" w:hAnsi="Arial"/>
+                <w:sz w:val="15"/>
+              </w:rPr>
+              <w:t>%</w:t>
+            </w:r>
+          </w:p>
+        </w:tc>
+        <w:tc>
+          <w:tcPr>
+            <w:tcW w:type="dxa" w:w="1560"/>
+          </w:tcPr>
+          <w:p>
+            <w:r>
+              <w:rPr>
+                <w:rFonts w:ascii="Arial" w:hAnsi="Arial"/>
+                <w:sz w:val="15"/>
+              </w:rPr>
+              <w:t>derivada de CPIAUCSL: (CPI_t/CPI_t-12 -1)x100</w:t>
+            </w:r>
+          </w:p>
+        </w:tc>
+        <w:tc>
+          <w:tcPr>
+            <w:tcW w:type="dxa" w:w="1560"/>
+          </w:tcPr>
+          <w:p>
+            <w:r>
+              <w:rPr>
+                <w:rFonts w:ascii="Arial" w:hAnsi="Arial"/>
+                <w:sz w:val="15"/>
+              </w:rPr>
+              <w:t>mes de cierre</w:t>
+            </w:r>
+          </w:p>
+        </w:tc>
+        <w:tc>
+          <w:tcPr>
+            <w:tcW w:type="dxa" w:w="1560"/>
+          </w:tcPr>
+          <w:p>
+            <w:r>
+              <w:rPr>
+                <w:rFonts w:ascii="Arial" w:hAnsi="Arial"/>
+                <w:sz w:val="15"/>
+              </w:rPr>
+              <w:t>84/84</w:t>
+            </w:r>
+          </w:p>
+        </w:tc>
+      </w:tr>
+      <w:tr>
+        <w:tc>
+          <w:tcPr>
+            <w:tcW w:type="dxa" w:w="1560"/>
+          </w:tcPr>
+          <w:p>
+            <w:r>
+              <w:rPr>
+                <w:rFonts w:ascii="Arial" w:hAnsi="Arial"/>
+                <w:sz w:val="15"/>
+              </w:rPr>
+              <w:t>FEDFUNDS</w:t>
+            </w:r>
+          </w:p>
+        </w:tc>
+        <w:tc>
+          <w:tcPr>
+            <w:tcW w:type="dxa" w:w="1560"/>
+          </w:tcPr>
+          <w:p>
+            <w:r>
+              <w:rPr>
+                <w:rFonts w:ascii="Arial" w:hAnsi="Arial"/>
+                <w:sz w:val="15"/>
+              </w:rPr>
+              <w:t>Federal Funds Effective Rate</w:t>
+            </w:r>
+          </w:p>
+        </w:tc>
+        <w:tc>
+          <w:tcPr>
+            <w:tcW w:type="dxa" w:w="1560"/>
+          </w:tcPr>
+          <w:p>
+            <w:r>
+              <w:rPr>
+                <w:rFonts w:ascii="Arial" w:hAnsi="Arial"/>
+                <w:sz w:val="15"/>
+              </w:rPr>
+              <w:t>% anual</w:t>
+            </w:r>
+          </w:p>
+        </w:tc>
+        <w:tc>
+          <w:tcPr>
+            <w:tcW w:type="dxa" w:w="1560"/>
+          </w:tcPr>
+          <w:p>
+            <w:r>
+              <w:rPr>
+                <w:rFonts w:ascii="Arial" w:hAnsi="Arial"/>
+                <w:sz w:val="15"/>
+              </w:rPr>
+              <w:t>FRED</w:t>
+            </w:r>
+          </w:p>
+        </w:tc>
+        <w:tc>
+          <w:tcPr>
+            <w:tcW w:type="dxa" w:w="1560"/>
+          </w:tcPr>
+          <w:p>
+            <w:r>
+              <w:rPr>
+                <w:rFonts w:ascii="Arial" w:hAnsi="Arial"/>
+                <w:sz w:val="15"/>
+              </w:rPr>
+              <w:t>promedio de los 3 meses</w:t>
+            </w:r>
+          </w:p>
+        </w:tc>
+        <w:tc>
+          <w:tcPr>
+            <w:tcW w:type="dxa" w:w="1560"/>
+          </w:tcPr>
+          <w:p>
+            <w:r>
+              <w:rPr>
+                <w:rFonts w:ascii="Arial" w:hAnsi="Arial"/>
+                <w:sz w:val="15"/>
+              </w:rPr>
+              <w:t>84/84</w:t>
+            </w:r>
+          </w:p>
+        </w:tc>
+      </w:tr>
+      <w:tr>
+        <w:tc>
+          <w:tcPr>
+            <w:tcW w:type="dxa" w:w="1560"/>
+          </w:tcPr>
+          <w:p>
+            <w:r>
+              <w:rPr>
+                <w:rFonts w:ascii="Arial" w:hAnsi="Arial"/>
+                <w:sz w:val="15"/>
+              </w:rPr>
+              <w:t>i_Gs_vista</w:t>
+            </w:r>
+          </w:p>
+        </w:tc>
+        <w:tc>
+          <w:tcPr>
+            <w:tcW w:type="dxa" w:w="1560"/>
+          </w:tcPr>
+          <w:p>
+            <w:r>
+              <w:rPr>
+                <w:rFonts w:ascii="Arial" w:hAnsi="Arial"/>
+                <w:sz w:val="15"/>
+              </w:rPr>
+              <w:t>Tasa a la vista MN (referencia, NO CDA)</w:t>
+            </w:r>
+          </w:p>
+        </w:tc>
+        <w:tc>
+          <w:tcPr>
+            <w:tcW w:type="dxa" w:w="1560"/>
+          </w:tcPr>
+          <w:p>
+            <w:r>
+              <w:rPr>
+                <w:rFonts w:ascii="Arial" w:hAnsi="Arial"/>
+                <w:sz w:val="15"/>
+              </w:rPr>
+              <w:t>% anual</w:t>
+            </w:r>
+          </w:p>
+        </w:tc>
+        <w:tc>
+          <w:tcPr>
+            <w:tcW w:type="dxa" w:w="1560"/>
+          </w:tcPr>
+          <w:p>
+            <w:r>
+              <w:rPr>
+                <w:rFonts w:ascii="Arial" w:hAnsi="Arial"/>
+                <w:sz w:val="15"/>
+              </w:rPr>
+              <w:t>BCP, Cuadro 31 col C</w:t>
+            </w:r>
+          </w:p>
+        </w:tc>
+        <w:tc>
+          <w:tcPr>
+            <w:tcW w:type="dxa" w:w="1560"/>
+          </w:tcPr>
+          <w:p>
+            <w:r>
+              <w:rPr>
+                <w:rFonts w:ascii="Arial" w:hAnsi="Arial"/>
+                <w:sz w:val="15"/>
+              </w:rPr>
+              <w:t>promedio 3 meses</w:t>
+            </w:r>
+          </w:p>
+        </w:tc>
+        <w:tc>
+          <w:tcPr>
+            <w:tcW w:type="dxa" w:w="1560"/>
+          </w:tcPr>
+          <w:p>
+            <w:r>
+              <w:rPr>
+                <w:rFonts w:ascii="Arial" w:hAnsi="Arial"/>
+                <w:sz w:val="15"/>
+              </w:rPr>
+              <w:t>84/84</w:t>
+            </w:r>
+          </w:p>
+        </w:tc>
+      </w:tr>
+      <w:tr>
+        <w:tc>
+          <w:tcPr>
+            <w:tcW w:type="dxa" w:w="1560"/>
+          </w:tcPr>
+          <w:p>
+            <w:r>
+              <w:rPr>
+                <w:rFonts w:ascii="Arial" w:hAnsi="Arial"/>
+                <w:sz w:val="15"/>
+              </w:rPr>
+              <w:t>i_USD_vista</w:t>
+            </w:r>
+          </w:p>
+        </w:tc>
+        <w:tc>
+          <w:tcPr>
+            <w:tcW w:type="dxa" w:w="1560"/>
+          </w:tcPr>
+          <w:p>
+            <w:r>
+              <w:rPr>
+                <w:rFonts w:ascii="Arial" w:hAnsi="Arial"/>
+                <w:sz w:val="15"/>
+              </w:rPr>
+              <w:t>Tasa a la vista ME (referencia, NO CDA)</w:t>
+            </w:r>
+          </w:p>
+        </w:tc>
+        <w:tc>
+          <w:tcPr>
+            <w:tcW w:type="dxa" w:w="1560"/>
+          </w:tcPr>
+          <w:p>
+            <w:r>
+              <w:rPr>
+                <w:rFonts w:ascii="Arial" w:hAnsi="Arial"/>
+                <w:sz w:val="15"/>
+              </w:rPr>
+              <w:t>% anual</w:t>
+            </w:r>
+          </w:p>
+        </w:tc>
+        <w:tc>
+          <w:tcPr>
+            <w:tcW w:type="dxa" w:w="1560"/>
+          </w:tcPr>
+          <w:p>
+            <w:r>
+              <w:rPr>
+                <w:rFonts w:ascii="Arial" w:hAnsi="Arial"/>
+                <w:sz w:val="15"/>
+              </w:rPr>
+              <w:t>BCP, Cuadro 31 Cont. col C</w:t>
+            </w:r>
+          </w:p>
+        </w:tc>
+        <w:tc>
+          <w:tcPr>
+            <w:tcW w:type="dxa" w:w="1560"/>
+          </w:tcPr>
+          <w:p>
+            <w:r>
+              <w:rPr>
+                <w:rFonts w:ascii="Arial" w:hAnsi="Arial"/>
+                <w:sz w:val="15"/>
+              </w:rPr>
+              <w:t>promedio 3 meses</w:t>
+            </w:r>
+          </w:p>
+        </w:tc>
+        <w:tc>
+          <w:tcPr>
+            <w:tcW w:type="dxa" w:w="1560"/>
+          </w:tcPr>
+          <w:p>
+            <w:r>
+              <w:rPr>
+                <w:rFonts w:ascii="Arial" w:hAnsi="Arial"/>
+                <w:sz w:val="15"/>
+              </w:rPr>
+              <w:t>84/84</w:t>
+            </w:r>
+          </w:p>
+        </w:tc>
+      </w:tr>
+      <w:tr>
+        <w:tc>
+          <w:tcPr>
+            <w:tcW w:type="dxa" w:w="1560"/>
+          </w:tcPr>
+          <w:p>
+            <w:r>
+              <w:rPr>
+                <w:rFonts w:ascii="Arial" w:hAnsi="Arial"/>
+                <w:sz w:val="15"/>
+              </w:rPr>
+              <w:t>i_Gs_pond</w:t>
+            </w:r>
+          </w:p>
+        </w:tc>
+        <w:tc>
+          <w:tcPr>
+            <w:tcW w:type="dxa" w:w="1560"/>
+          </w:tcPr>
+          <w:p>
+            <w:r>
+              <w:rPr>
+                <w:rFonts w:ascii="Arial" w:hAnsi="Arial"/>
+                <w:sz w:val="15"/>
+              </w:rPr>
+              <w:t>CDA promedio ponderado MN (SENSIBILIDAD; empalme 2010/2011)</w:t>
+            </w:r>
+          </w:p>
+        </w:tc>
+        <w:tc>
+          <w:tcPr>
+            <w:tcW w:type="dxa" w:w="1560"/>
+          </w:tcPr>
+          <w:p>
+            <w:r>
+              <w:rPr>
+                <w:rFonts w:ascii="Arial" w:hAnsi="Arial"/>
+                <w:sz w:val="15"/>
+              </w:rPr>
+              <w:t>% anual</w:t>
+            </w:r>
+          </w:p>
+        </w:tc>
+        <w:tc>
+          <w:tcPr>
+            <w:tcW w:type="dxa" w:w="1560"/>
+          </w:tcPr>
+          <w:p>
+            <w:r>
+              <w:rPr>
+                <w:rFonts w:ascii="Arial" w:hAnsi="Arial"/>
+                <w:sz w:val="15"/>
+              </w:rPr>
+              <w:t>BCP: IF mensuales 2004-2010 + Cuadro 31 2011+</w:t>
+            </w:r>
+          </w:p>
+        </w:tc>
+        <w:tc>
+          <w:tcPr>
+            <w:tcW w:type="dxa" w:w="1560"/>
+          </w:tcPr>
+          <w:p>
+            <w:r>
+              <w:rPr>
+                <w:rFonts w:ascii="Arial" w:hAnsi="Arial"/>
+                <w:sz w:val="15"/>
+              </w:rPr>
+              <w:t>promedio 3 meses</w:t>
+            </w:r>
+          </w:p>
+        </w:tc>
+        <w:tc>
+          <w:tcPr>
+            <w:tcW w:type="dxa" w:w="1560"/>
+          </w:tcPr>
+          <w:p>
+            <w:r>
+              <w:rPr>
+                <w:rFonts w:ascii="Arial" w:hAnsi="Arial"/>
+                <w:sz w:val="15"/>
+              </w:rPr>
+              <w:t>83/84 (falta 2006Q4)</w:t>
+            </w:r>
+          </w:p>
+        </w:tc>
+      </w:tr>
+      <w:tr>
+        <w:tc>
+          <w:tcPr>
+            <w:tcW w:type="dxa" w:w="1560"/>
+          </w:tcPr>
+          <w:p>
+            <w:r>
+              <w:rPr>
+                <w:rFonts w:ascii="Arial" w:hAnsi="Arial"/>
+                <w:sz w:val="15"/>
+              </w:rPr>
+              <w:t>i_USD_pond</w:t>
+            </w:r>
+          </w:p>
+        </w:tc>
+        <w:tc>
+          <w:tcPr>
+            <w:tcW w:type="dxa" w:w="1560"/>
+          </w:tcPr>
+          <w:p>
+            <w:r>
+              <w:rPr>
+                <w:rFonts w:ascii="Arial" w:hAnsi="Arial"/>
+                <w:sz w:val="15"/>
+              </w:rPr>
+              <w:t>CDA promedio ponderado ME (SENSIBILIDAD)</w:t>
+            </w:r>
+          </w:p>
+        </w:tc>
+        <w:tc>
+          <w:tcPr>
+            <w:tcW w:type="dxa" w:w="1560"/>
+          </w:tcPr>
+          <w:p>
+            <w:r>
+              <w:rPr>
+                <w:rFonts w:ascii="Arial" w:hAnsi="Arial"/>
+                <w:sz w:val="15"/>
+              </w:rPr>
+              <w:t>% anual</w:t>
+            </w:r>
+          </w:p>
+        </w:tc>
+        <w:tc>
+          <w:tcPr>
+            <w:tcW w:type="dxa" w:w="1560"/>
+          </w:tcPr>
+          <w:p>
+            <w:r>
+              <w:rPr>
+                <w:rFonts w:ascii="Arial" w:hAnsi="Arial"/>
+                <w:sz w:val="15"/>
+              </w:rPr>
+              <w:t>ídem</w:t>
+            </w:r>
+          </w:p>
+        </w:tc>
+        <w:tc>
+          <w:tcPr>
+            <w:tcW w:type="dxa" w:w="1560"/>
+          </w:tcPr>
+          <w:p>
+            <w:r>
+              <w:rPr>
+                <w:rFonts w:ascii="Arial" w:hAnsi="Arial"/>
+                <w:sz w:val="15"/>
+              </w:rPr>
+              <w:t>promedio 3 meses</w:t>
+            </w:r>
+          </w:p>
+        </w:tc>
+        <w:tc>
+          <w:tcPr>
+            <w:tcW w:type="dxa" w:w="1560"/>
+          </w:tcPr>
+          <w:p>
+            <w:r>
+              <w:rPr>
+                <w:rFonts w:ascii="Arial" w:hAnsi="Arial"/>
+                <w:sz w:val="15"/>
+              </w:rPr>
+              <w:t>83/84</w:t>
+            </w:r>
+          </w:p>
+        </w:tc>
+      </w:tr>
+      <w:tr>
+        <w:tc>
+          <w:tcPr>
+            <w:tcW w:type="dxa" w:w="1560"/>
+          </w:tcPr>
+          <w:p>
+            <w:r>
+              <w:rPr>
+                <w:rFonts w:ascii="Arial" w:hAnsi="Arial"/>
+                <w:sz w:val="15"/>
+              </w:rPr>
+              <w:t>i_Gs_fdt_pond</w:t>
+            </w:r>
+          </w:p>
+        </w:tc>
+        <w:tc>
+          <w:tcPr>
+            <w:tcW w:type="dxa" w:w="1560"/>
+          </w:tcPr>
+          <w:p>
+            <w:r>
+              <w:rPr>
+                <w:rFonts w:ascii="Arial" w:hAnsi="Arial"/>
+                <w:sz w:val="15"/>
+              </w:rPr>
+              <w:t>Ponderada MN, fin de trimestre</w:t>
+            </w:r>
+          </w:p>
+        </w:tc>
+        <w:tc>
+          <w:tcPr>
+            <w:tcW w:type="dxa" w:w="1560"/>
+          </w:tcPr>
+          <w:p>
+            <w:r>
+              <w:rPr>
+                <w:rFonts w:ascii="Arial" w:hAnsi="Arial"/>
+                <w:sz w:val="15"/>
+              </w:rPr>
+              <w:t>% anual</w:t>
+            </w:r>
+          </w:p>
+        </w:tc>
+        <w:tc>
+          <w:tcPr>
+            <w:tcW w:type="dxa" w:w="1560"/>
+          </w:tcPr>
+          <w:p>
+            <w:r>
+              <w:rPr>
+                <w:rFonts w:ascii="Arial" w:hAnsi="Arial"/>
+                <w:sz w:val="15"/>
+              </w:rPr>
+              <w:t>ídem</w:t>
+            </w:r>
+          </w:p>
+        </w:tc>
+        <w:tc>
+          <w:tcPr>
+            <w:tcW w:type="dxa" w:w="1560"/>
+          </w:tcPr>
+          <w:p>
+            <w:r>
+              <w:rPr>
+                <w:rFonts w:ascii="Arial" w:hAnsi="Arial"/>
+                <w:sz w:val="15"/>
+              </w:rPr>
+              <w:t>último mes</w:t>
+            </w:r>
+          </w:p>
+        </w:tc>
+        <w:tc>
+          <w:tcPr>
+            <w:tcW w:type="dxa" w:w="1560"/>
+          </w:tcPr>
+          <w:p>
+            <w:r>
+              <w:rPr>
+                <w:rFonts w:ascii="Arial" w:hAnsi="Arial"/>
+                <w:sz w:val="15"/>
+              </w:rPr>
+              <w:t>83/84</w:t>
+            </w:r>
+          </w:p>
+        </w:tc>
+      </w:tr>
+      <w:tr>
+        <w:tc>
+          <w:tcPr>
+            <w:tcW w:type="dxa" w:w="1560"/>
+          </w:tcPr>
+          <w:p>
+            <w:r>
+              <w:rPr>
+                <w:rFonts w:ascii="Arial" w:hAnsi="Arial"/>
+                <w:sz w:val="15"/>
+              </w:rPr>
+              <w:t>i_USD_fdt_pond</w:t>
+            </w:r>
+          </w:p>
+        </w:tc>
+        <w:tc>
+          <w:tcPr>
+            <w:tcW w:type="dxa" w:w="1560"/>
+          </w:tcPr>
+          <w:p>
+            <w:r>
+              <w:rPr>
+                <w:rFonts w:ascii="Arial" w:hAnsi="Arial"/>
+                <w:sz w:val="15"/>
+              </w:rPr>
+              <w:t>Ponderada ME, fin de trimestre</w:t>
+            </w:r>
+          </w:p>
+        </w:tc>
+        <w:tc>
+          <w:tcPr>
+            <w:tcW w:type="dxa" w:w="1560"/>
+          </w:tcPr>
+          <w:p>
+            <w:r>
+              <w:rPr>
+                <w:rFonts w:ascii="Arial" w:hAnsi="Arial"/>
+                <w:sz w:val="15"/>
+              </w:rPr>
+              <w:t>% anual</w:t>
+            </w:r>
+          </w:p>
+        </w:tc>
+        <w:tc>
+          <w:tcPr>
+            <w:tcW w:type="dxa" w:w="1560"/>
+          </w:tcPr>
+          <w:p>
+            <w:r>
+              <w:rPr>
+                <w:rFonts w:ascii="Arial" w:hAnsi="Arial"/>
+                <w:sz w:val="15"/>
+              </w:rPr>
+              <w:t>ídem</w:t>
+            </w:r>
+          </w:p>
+        </w:tc>
+        <w:tc>
+          <w:tcPr>
+            <w:tcW w:type="dxa" w:w="1560"/>
+          </w:tcPr>
+          <w:p>
+            <w:r>
+              <w:rPr>
+                <w:rFonts w:ascii="Arial" w:hAnsi="Arial"/>
+                <w:sz w:val="15"/>
+              </w:rPr>
+              <w:t>último mes</w:t>
+            </w:r>
+          </w:p>
+        </w:tc>
+        <w:tc>
+          <w:tcPr>
+            <w:tcW w:type="dxa" w:w="1560"/>
+          </w:tcPr>
+          <w:p>
+            <w:r>
+              <w:rPr>
+                <w:rFonts w:ascii="Arial" w:hAnsi="Arial"/>
+                <w:sz w:val="15"/>
+              </w:rPr>
+              <w:t>83/84</w:t>
+            </w:r>
+          </w:p>
+        </w:tc>
+      </w:tr>
+      <w:tr>
+        <w:tc>
+          <w:tcPr>
+            <w:tcW w:type="dxa" w:w="1560"/>
+          </w:tcPr>
+          <w:p>
+            <w:r>
+              <w:rPr>
+                <w:rFonts w:ascii="Arial" w:hAnsi="Arial"/>
+                <w:sz w:val="15"/>
+              </w:rPr>
+              <w:t>encaje_mn</w:t>
+            </w:r>
+          </w:p>
+        </w:tc>
+        <w:tc>
+          <w:tcPr>
+            <w:tcW w:type="dxa" w:w="1560"/>
+          </w:tcPr>
+          <w:p>
+            <w:r>
+              <w:rPr>
+                <w:rFonts w:ascii="Arial" w:hAnsi="Arial"/>
+                <w:sz w:val="15"/>
+              </w:rPr>
+              <w:t>Tasa de encaje legal MN, tramo &lt;=360 días (base)</w:t>
+            </w:r>
+          </w:p>
+        </w:tc>
+        <w:tc>
+          <w:tcPr>
+            <w:tcW w:type="dxa" w:w="1560"/>
+          </w:tcPr>
+          <w:p>
+            <w:r>
+              <w:rPr>
+                <w:rFonts w:ascii="Arial" w:hAnsi="Arial"/>
+                <w:sz w:val="15"/>
+              </w:rPr>
+              <w:t>%</w:t>
+            </w:r>
+          </w:p>
+        </w:tc>
+        <w:tc>
+          <w:tcPr>
+            <w:tcW w:type="dxa" w:w="1560"/>
+          </w:tcPr>
+          <w:p>
+            <w:r>
+              <w:rPr>
+                <w:rFonts w:ascii="Arial" w:hAnsi="Arial"/>
+                <w:sz w:val="15"/>
+              </w:rPr>
+              <w:t>Resoluciones BCP (docs/11_encaje_fuentes.md)</w:t>
+            </w:r>
+          </w:p>
+        </w:tc>
+        <w:tc>
+          <w:tcPr>
+            <w:tcW w:type="dxa" w:w="1560"/>
+          </w:tcPr>
+          <w:p>
+            <w:r>
+              <w:rPr>
+                <w:rFonts w:ascii="Arial" w:hAnsi="Arial"/>
+                <w:sz w:val="15"/>
+              </w:rPr>
+              <w:t>vigente al cierre</w:t>
+            </w:r>
+          </w:p>
+        </w:tc>
+        <w:tc>
+          <w:tcPr>
+            <w:tcW w:type="dxa" w:w="1560"/>
+          </w:tcPr>
+          <w:p>
+            <w:r>
+              <w:rPr>
+                <w:rFonts w:ascii="Arial" w:hAnsi="Arial"/>
+                <w:sz w:val="15"/>
+              </w:rPr>
+              <w:t>49/84 (verificado 2012Q4+)</w:t>
+            </w:r>
+          </w:p>
+        </w:tc>
+      </w:tr>
+      <w:tr>
+        <w:tc>
+          <w:tcPr>
+            <w:tcW w:type="dxa" w:w="1560"/>
+          </w:tcPr>
+          <w:p>
+            <w:r>
+              <w:rPr>
+                <w:rFonts w:ascii="Arial" w:hAnsi="Arial"/>
+                <w:sz w:val="15"/>
+              </w:rPr>
+              <w:t>encaje_me</w:t>
+            </w:r>
+          </w:p>
+        </w:tc>
+        <w:tc>
+          <w:tcPr>
+            <w:tcW w:type="dxa" w:w="1560"/>
+          </w:tcPr>
+          <w:p>
+            <w:r>
+              <w:rPr>
+                <w:rFonts w:ascii="Arial" w:hAnsi="Arial"/>
+                <w:sz w:val="15"/>
+              </w:rPr>
+              <w:t>Tasa de encaje legal ME, tramo &lt;=360 días (base)</w:t>
+            </w:r>
+          </w:p>
+        </w:tc>
+        <w:tc>
+          <w:tcPr>
+            <w:tcW w:type="dxa" w:w="1560"/>
+          </w:tcPr>
+          <w:p>
+            <w:r>
+              <w:rPr>
+                <w:rFonts w:ascii="Arial" w:hAnsi="Arial"/>
+                <w:sz w:val="15"/>
+              </w:rPr>
+              <w:t>%</w:t>
+            </w:r>
+          </w:p>
+        </w:tc>
+        <w:tc>
+          <w:tcPr>
+            <w:tcW w:type="dxa" w:w="1560"/>
+          </w:tcPr>
+          <w:p>
+            <w:r>
+              <w:rPr>
+                <w:rFonts w:ascii="Arial" w:hAnsi="Arial"/>
+                <w:sz w:val="15"/>
+              </w:rPr>
+              <w:t>Resoluciones BCP</w:t>
+            </w:r>
+          </w:p>
+        </w:tc>
+        <w:tc>
+          <w:tcPr>
+            <w:tcW w:type="dxa" w:w="1560"/>
+          </w:tcPr>
+          <w:p>
+            <w:r>
+              <w:rPr>
+                <w:rFonts w:ascii="Arial" w:hAnsi="Arial"/>
+                <w:sz w:val="15"/>
+              </w:rPr>
+              <w:t>vigente al cierre</w:t>
+            </w:r>
+          </w:p>
+        </w:tc>
+        <w:tc>
+          <w:tcPr>
+            <w:tcW w:type="dxa" w:w="1560"/>
+          </w:tcPr>
+          <w:p>
+            <w:r>
+              <w:rPr>
+                <w:rFonts w:ascii="Arial" w:hAnsi="Arial"/>
+                <w:sz w:val="15"/>
+              </w:rPr>
+              <w:t>49/84</w:t>
+            </w:r>
+          </w:p>
+        </w:tc>
+      </w:tr>
+      <w:tr>
+        <w:tc>
+          <w:tcPr>
+            <w:tcW w:type="dxa" w:w="1560"/>
+          </w:tcPr>
+          <w:p>
+            <w:r>
+              <w:rPr>
+                <w:rFonts w:ascii="Arial" w:hAnsi="Arial"/>
+                <w:sz w:val="15"/>
+              </w:rPr>
+              <w:t>encaje_mn_efec</w:t>
+            </w:r>
+          </w:p>
+        </w:tc>
+        <w:tc>
+          <w:tcPr>
+            <w:tcW w:type="dxa" w:w="1560"/>
+          </w:tcPr>
+          <w:p>
+            <w:r>
+              <w:rPr>
+                <w:rFonts w:ascii="Arial" w:hAnsi="Arial"/>
+                <w:sz w:val="15"/>
+              </w:rPr>
+              <w:t>Encaje MN efectivo (incluye desencaje COVID 2020)</w:t>
+            </w:r>
+          </w:p>
+        </w:tc>
+        <w:tc>
+          <w:tcPr>
+            <w:tcW w:type="dxa" w:w="1560"/>
+          </w:tcPr>
+          <w:p>
+            <w:r>
+              <w:rPr>
+                <w:rFonts w:ascii="Arial" w:hAnsi="Arial"/>
+                <w:sz w:val="15"/>
+              </w:rPr>
+              <w:t>%</w:t>
+            </w:r>
+          </w:p>
+        </w:tc>
+        <w:tc>
+          <w:tcPr>
+            <w:tcW w:type="dxa" w:w="1560"/>
+          </w:tcPr>
+          <w:p>
+            <w:r>
+              <w:rPr>
+                <w:rFonts w:ascii="Arial" w:hAnsi="Arial"/>
+                <w:sz w:val="15"/>
+              </w:rPr>
+              <w:t>Resoluciones BCP</w:t>
+            </w:r>
+          </w:p>
+        </w:tc>
+        <w:tc>
+          <w:tcPr>
+            <w:tcW w:type="dxa" w:w="1560"/>
+          </w:tcPr>
+          <w:p>
+            <w:r>
+              <w:rPr>
+                <w:rFonts w:ascii="Arial" w:hAnsi="Arial"/>
+                <w:sz w:val="15"/>
+              </w:rPr>
+              <w:t>vigente al cierre</w:t>
+            </w:r>
+          </w:p>
+        </w:tc>
+        <w:tc>
+          <w:tcPr>
+            <w:tcW w:type="dxa" w:w="1560"/>
+          </w:tcPr>
+          <w:p>
+            <w:r>
+              <w:rPr>
+                <w:rFonts w:ascii="Arial" w:hAnsi="Arial"/>
+                <w:sz w:val="15"/>
+              </w:rPr>
+              <w:t>49/84</w:t>
+            </w:r>
+          </w:p>
+        </w:tc>
+      </w:tr>
+      <w:tr>
+        <w:tc>
+          <w:tcPr>
+            <w:tcW w:type="dxa" w:w="1560"/>
+          </w:tcPr>
+          <w:p>
+            <w:r>
+              <w:rPr>
+                <w:rFonts w:ascii="Arial" w:hAnsi="Arial"/>
+                <w:sz w:val="15"/>
+              </w:rPr>
+              <w:t>encaje_me_efec</w:t>
+            </w:r>
+          </w:p>
+        </w:tc>
+        <w:tc>
+          <w:tcPr>
+            <w:tcW w:type="dxa" w:w="1560"/>
+          </w:tcPr>
+          <w:p>
+            <w:r>
+              <w:rPr>
+                <w:rFonts w:ascii="Arial" w:hAnsi="Arial"/>
+                <w:sz w:val="15"/>
+              </w:rPr>
+              <w:t>Encaje ME efectivo</w:t>
+            </w:r>
+          </w:p>
+        </w:tc>
+        <w:tc>
+          <w:tcPr>
+            <w:tcW w:type="dxa" w:w="1560"/>
+          </w:tcPr>
+          <w:p>
+            <w:r>
+              <w:rPr>
+                <w:rFonts w:ascii="Arial" w:hAnsi="Arial"/>
+                <w:sz w:val="15"/>
+              </w:rPr>
+              <w:t>%</w:t>
+            </w:r>
+          </w:p>
+        </w:tc>
+        <w:tc>
+          <w:tcPr>
+            <w:tcW w:type="dxa" w:w="1560"/>
+          </w:tcPr>
+          <w:p>
+            <w:r>
+              <w:rPr>
+                <w:rFonts w:ascii="Arial" w:hAnsi="Arial"/>
+                <w:sz w:val="15"/>
+              </w:rPr>
+              <w:t>Resoluciones BCP</w:t>
+            </w:r>
+          </w:p>
+        </w:tc>
+        <w:tc>
+          <w:tcPr>
+            <w:tcW w:type="dxa" w:w="1560"/>
+          </w:tcPr>
+          <w:p>
+            <w:r>
+              <w:rPr>
+                <w:rFonts w:ascii="Arial" w:hAnsi="Arial"/>
+                <w:sz w:val="15"/>
+              </w:rPr>
+              <w:t>vigente al cierre</w:t>
+            </w:r>
+          </w:p>
+        </w:tc>
+        <w:tc>
+          <w:tcPr>
+            <w:tcW w:type="dxa" w:w="1560"/>
+          </w:tcPr>
+          <w:p>
+            <w:r>
+              <w:rPr>
+                <w:rFonts w:ascii="Arial" w:hAnsi="Arial"/>
+                <w:sz w:val="15"/>
+              </w:rPr>
+              <w:t>49/84</w:t>
+            </w:r>
+          </w:p>
+        </w:tc>
+      </w:tr>
+      <w:tr>
+        <w:tc>
+          <w:tcPr>
+            <w:tcW w:type="dxa" w:w="1560"/>
+          </w:tcPr>
+          <w:p>
+            <w:r>
+              <w:rPr>
+                <w:rFonts w:ascii="Arial" w:hAnsi="Arial"/>
+                <w:sz w:val="15"/>
+              </w:rPr>
+              <w:t>tpm</w:t>
+            </w:r>
+          </w:p>
+        </w:tc>
+        <w:tc>
+          <w:tcPr>
+            <w:tcW w:type="dxa" w:w="1560"/>
+          </w:tcPr>
+          <w:p>
+            <w:r>
+              <w:rPr>
+                <w:rFonts w:ascii="Arial" w:hAnsi="Arial"/>
+                <w:sz w:val="15"/>
+              </w:rPr>
+              <w:t>Tasa de Política Monetaria</w:t>
+            </w:r>
+          </w:p>
+        </w:tc>
+        <w:tc>
+          <w:tcPr>
+            <w:tcW w:type="dxa" w:w="1560"/>
+          </w:tcPr>
+          <w:p>
+            <w:r>
+              <w:rPr>
+                <w:rFonts w:ascii="Arial" w:hAnsi="Arial"/>
+                <w:sz w:val="15"/>
+              </w:rPr>
+              <w:t>% anual</w:t>
+            </w:r>
+          </w:p>
+        </w:tc>
+        <w:tc>
+          <w:tcPr>
+            <w:tcW w:type="dxa" w:w="1560"/>
+          </w:tcPr>
+          <w:p>
+            <w:r>
+              <w:rPr>
+                <w:rFonts w:ascii="Arial" w:hAnsi="Arial"/>
+                <w:sz w:val="15"/>
+              </w:rPr>
+              <w:t>BCP, TPM.xlsx oficial (data/raw/bcp/TPM.xlsx)</w:t>
+            </w:r>
+          </w:p>
+        </w:tc>
+        <w:tc>
+          <w:tcPr>
+            <w:tcW w:type="dxa" w:w="1560"/>
+          </w:tcPr>
+          <w:p>
+            <w:r>
+              <w:rPr>
+                <w:rFonts w:ascii="Arial" w:hAnsi="Arial"/>
+                <w:sz w:val="15"/>
+              </w:rPr>
+              <w:t>promedio de meses del trimestre</w:t>
+            </w:r>
+          </w:p>
+        </w:tc>
+        <w:tc>
+          <w:tcPr>
+            <w:tcW w:type="dxa" w:w="1560"/>
+          </w:tcPr>
+          <w:p>
+            <w:r>
+              <w:rPr>
+                <w:rFonts w:ascii="Arial" w:hAnsi="Arial"/>
+                <w:sz w:val="15"/>
+              </w:rPr>
+              <w:t>55/84 (la TPM nace en may-2011; pre-2011 no existe, no es hueco)</w:t>
+            </w:r>
+          </w:p>
+        </w:tc>
+      </w:tr>
+    </w:tbl>
+    <w:p>
+      <w:pPr>
+        <w:pStyle w:val="Heading2"/>
+      </w:pPr>
+      <w:r>
+        <w:t>Apéndice P. Trazabilidad de fuentes (procedencia por serie)</w:t>
+      </w:r>
+    </w:p>
+    <w:p>
+      <w:r>
+        <w:rPr>
+          <w:rFonts w:ascii="Arial" w:hAnsi="Arial"/>
+          <w:i w:val="0"/>
+          <w:sz w:val="20"/>
+        </w:rPr>
+        <w:t>Para cada serie: la fuente oficial exacta, la URL/archivo crudo, la fecha de extracción y las reglas o notas. Todos los datos se obtuvieron del Banco Central del Paraguay (BCP) y de la Reserva Federal de San Luis (FRED); ninguno fue inventado, estimado ni interpolado. Los archivos crudos se conservan en data/raw/.</w:t>
+      </w:r>
+    </w:p>
+    <w:tbl>
+      <w:tblPr>
+        <w:tblStyle w:val="TableGrid"/>
+        <w:tblW w:type="auto" w:w="0"/>
+        <w:tblLook w:firstColumn="1" w:firstRow="1" w:lastColumn="0" w:lastRow="0" w:noHBand="0" w:noVBand="1" w:val="04A0"/>
+      </w:tblPr>
+      <w:tblGrid>
+        <w:gridCol w:w="1872"/>
+        <w:gridCol w:w="1872"/>
+        <w:gridCol w:w="1872"/>
+        <w:gridCol w:w="1872"/>
+        <w:gridCol w:w="1872"/>
+      </w:tblGrid>
+      <w:tr>
+        <w:tc>
+          <w:tcPr>
+            <w:tcW w:type="dxa" w:w="1872"/>
+          </w:tcPr>
+          <w:p>
+            <w:r>
+              <w:rPr>
+                <w:rFonts w:ascii="Arial" w:hAnsi="Arial"/>
+                <w:b/>
+                <w:sz w:val="15"/>
+              </w:rPr>
+              <w:t>serie</w:t>
+            </w:r>
+          </w:p>
+        </w:tc>
+        <w:tc>
+          <w:tcPr>
+            <w:tcW w:type="dxa" w:w="1872"/>
+          </w:tcPr>
+          <w:p>
+            <w:r>
+              <w:rPr>
+                <w:rFonts w:ascii="Arial" w:hAnsi="Arial"/>
+                <w:b/>
+                <w:sz w:val="15"/>
+              </w:rPr>
+              <w:t>fuente_oficial_exacta</w:t>
+            </w:r>
+          </w:p>
+        </w:tc>
+        <w:tc>
+          <w:tcPr>
+            <w:tcW w:type="dxa" w:w="1872"/>
+          </w:tcPr>
+          <w:p>
+            <w:r>
+              <w:rPr>
+                <w:rFonts w:ascii="Arial" w:hAnsi="Arial"/>
+                <w:b/>
+                <w:sz w:val="15"/>
+              </w:rPr>
+              <w:t>url_y_archivo_crudo</w:t>
+            </w:r>
+          </w:p>
+        </w:tc>
+        <w:tc>
+          <w:tcPr>
+            <w:tcW w:type="dxa" w:w="1872"/>
+          </w:tcPr>
+          <w:p>
+            <w:r>
+              <w:rPr>
+                <w:rFonts w:ascii="Arial" w:hAnsi="Arial"/>
+                <w:b/>
+                <w:sz w:val="15"/>
+              </w:rPr>
+              <w:t>fecha_extraccion</w:t>
+            </w:r>
+          </w:p>
+        </w:tc>
+        <w:tc>
+          <w:tcPr>
+            <w:tcW w:type="dxa" w:w="1872"/>
+          </w:tcPr>
+          <w:p>
+            <w:r>
+              <w:rPr>
+                <w:rFonts w:ascii="Arial" w:hAnsi="Arial"/>
+                <w:b/>
+                <w:sz w:val="15"/>
+              </w:rPr>
+              <w:t>reglas_y_notas</w:t>
+            </w:r>
+          </w:p>
+        </w:tc>
+      </w:tr>
+      <w:tr>
+        <w:tc>
+          <w:tcPr>
+            <w:tcW w:type="dxa" w:w="1872"/>
+          </w:tcPr>
+          <w:p>
+            <w:r>
+              <w:rPr>
+                <w:rFonts w:ascii="Arial" w:hAnsi="Arial"/>
+                <w:sz w:val="15"/>
+              </w:rPr>
+              <w:t>i_Gs / i_USD (y fdt)</w:t>
+            </w:r>
+          </w:p>
+        </w:tc>
+        <w:tc>
+          <w:tcPr>
+            <w:tcW w:type="dxa" w:w="1872"/>
+          </w:tcPr>
+          <w:p>
+            <w:r>
+              <w:rPr>
+                <w:rFonts w:ascii="Arial" w:hAnsi="Arial"/>
+                <w:sz w:val="15"/>
+              </w:rPr>
+              <w:t>BCP - Superintendencia de Bancos, boletines mensuales 'Promedio de Tasas', fila 'CERTIFIC. DEP. DE AHORRO' tramo '&lt;=365 dias', tasa efectiva, Bancos</w:t>
+            </w:r>
+          </w:p>
+        </w:tc>
+        <w:tc>
+          <w:tcPr>
+            <w:tcW w:type="dxa" w:w="1872"/>
+          </w:tcPr>
+          <w:p>
+            <w:r>
+              <w:rPr>
+                <w:rFonts w:ascii="Arial" w:hAnsi="Arial"/>
+                <w:sz w:val="15"/>
+              </w:rPr>
+              <w:t>https://www.bcp.gov.py (Promedio de Tasas; 242 boletines descargados en data/raw/bcp/promedio_tasas/full/)</w:t>
+            </w:r>
+          </w:p>
+        </w:tc>
+        <w:tc>
+          <w:tcPr>
+            <w:tcW w:type="dxa" w:w="1872"/>
+          </w:tcPr>
+          <w:p>
+            <w:r>
+              <w:rPr>
+                <w:rFonts w:ascii="Arial" w:hAnsi="Arial"/>
+                <w:sz w:val="15"/>
+              </w:rPr>
+              <w:t>2026-07-13</w:t>
+            </w:r>
+          </w:p>
+        </w:tc>
+        <w:tc>
+          <w:tcPr>
+            <w:tcW w:type="dxa" w:w="1872"/>
+          </w:tcPr>
+          <w:p>
+            <w:r>
+              <w:rPr>
+                <w:rFonts w:ascii="Arial" w:hAnsi="Arial"/>
+                <w:sz w:val="15"/>
+              </w:rPr>
+              <w:t>Fuente única 2004-2024, sin empalme. 10 meses NO publicados por el BCP: 2005-07, 2006-03, 2006-11, 2006-12, 2007-01, 2007-05, 2007-07, 2013-04, 2013-05, 2014-04. Trimestre=promedio de meses publicados (meses_cobertura).</w:t>
+            </w:r>
+          </w:p>
+        </w:tc>
+      </w:tr>
+      <w:tr>
+        <w:tc>
+          <w:tcPr>
+            <w:tcW w:type="dxa" w:w="1872"/>
+          </w:tcPr>
+          <w:p>
+            <w:r>
+              <w:rPr>
+                <w:rFonts w:ascii="Arial" w:hAnsi="Arial"/>
+                <w:sz w:val="15"/>
+              </w:rPr>
+              <w:t>TC</w:t>
+            </w:r>
+          </w:p>
+        </w:tc>
+        <w:tc>
+          <w:tcPr>
+            <w:tcW w:type="dxa" w:w="1872"/>
+          </w:tcPr>
+          <w:p>
+            <w:r>
+              <w:rPr>
+                <w:rFonts w:ascii="Arial" w:hAnsi="Arial"/>
+                <w:sz w:val="15"/>
+              </w:rPr>
+              <w:t>BCP - Anexo Estadístico del Informe Económico, Cuadro 60a, col E</w:t>
+            </w:r>
+          </w:p>
+        </w:tc>
+        <w:tc>
+          <w:tcPr>
+            <w:tcW w:type="dxa" w:w="1872"/>
+          </w:tcPr>
+          <w:p>
+            <w:r>
+              <w:rPr>
+                <w:rFonts w:ascii="Arial" w:hAnsi="Arial"/>
+                <w:sz w:val="15"/>
+              </w:rPr>
+              <w:t>https://www.bcp.gov.py/anexo-estadistico-del-informe-economico-i365 (archivo en data/raw/bcp/Anexo_Estadistico_Informe_Economico.xlsx)</w:t>
+            </w:r>
+          </w:p>
+        </w:tc>
+        <w:tc>
+          <w:tcPr>
+            <w:tcW w:type="dxa" w:w="1872"/>
+          </w:tcPr>
+          <w:p>
+            <w:r>
+              <w:rPr>
+                <w:rFonts w:ascii="Arial" w:hAnsi="Arial"/>
+                <w:sz w:val="15"/>
+              </w:rPr>
+              <w:t>2026-06-30</w:t>
+            </w:r>
+          </w:p>
+        </w:tc>
+        <w:tc>
+          <w:tcPr>
+            <w:tcW w:type="dxa" w:w="1872"/>
+          </w:tcPr>
+          <w:p>
+            <w:r>
+              <w:rPr>
+                <w:rFonts w:ascii="Arial" w:hAnsi="Arial"/>
+                <w:sz w:val="15"/>
+              </w:rPr>
+              <w:t>Promedio mensual del mes de cierre del trimestre (la cotización diaria de cierre no existe homogénea 2004-2024).</w:t>
+            </w:r>
+          </w:p>
+        </w:tc>
+      </w:tr>
+      <w:tr>
+        <w:tc>
+          <w:tcPr>
+            <w:tcW w:type="dxa" w:w="1872"/>
+          </w:tcPr>
+          <w:p>
+            <w:r>
+              <w:rPr>
+                <w:rFonts w:ascii="Arial" w:hAnsi="Arial"/>
+                <w:sz w:val="15"/>
+              </w:rPr>
+              <w:t>dolariz</w:t>
+            </w:r>
+          </w:p>
+        </w:tc>
+        <w:tc>
+          <w:tcPr>
+            <w:tcW w:type="dxa" w:w="1872"/>
+          </w:tcPr>
+          <w:p>
+            <w:r>
+              <w:rPr>
+                <w:rFonts w:ascii="Arial" w:hAnsi="Arial"/>
+                <w:sz w:val="15"/>
+              </w:rPr>
+              <w:t>BCP - Anexo Estadístico, Cuadro 23a, col O (depósitos sector privado, participación ME)</w:t>
+            </w:r>
+          </w:p>
+        </w:tc>
+        <w:tc>
+          <w:tcPr>
+            <w:tcW w:type="dxa" w:w="1872"/>
+          </w:tcPr>
+          <w:p>
+            <w:r>
+              <w:rPr>
+                <w:rFonts w:ascii="Arial" w:hAnsi="Arial"/>
+                <w:sz w:val="15"/>
+              </w:rPr>
+              <w:t>ídem Anexo</w:t>
+            </w:r>
+          </w:p>
+        </w:tc>
+        <w:tc>
+          <w:tcPr>
+            <w:tcW w:type="dxa" w:w="1872"/>
+          </w:tcPr>
+          <w:p>
+            <w:r>
+              <w:rPr>
+                <w:rFonts w:ascii="Arial" w:hAnsi="Arial"/>
+                <w:sz w:val="15"/>
+              </w:rPr>
+              <w:t>2026-06-30</w:t>
+            </w:r>
+          </w:p>
+        </w:tc>
+        <w:tc>
+          <w:tcPr>
+            <w:tcW w:type="dxa" w:w="1872"/>
+          </w:tcPr>
+          <w:p>
+            <w:r>
+              <w:rPr>
+                <w:rFonts w:ascii="Arial" w:hAnsi="Arial"/>
+                <w:sz w:val="15"/>
+              </w:rPr>
+              <w:t>Mes de cierre. 2024Q2-Q4 marcados preliminares por la fuente.</w:t>
+            </w:r>
+          </w:p>
+        </w:tc>
+      </w:tr>
+      <w:tr>
+        <w:tc>
+          <w:tcPr>
+            <w:tcW w:type="dxa" w:w="1872"/>
+          </w:tcPr>
+          <w:p>
+            <w:r>
+              <w:rPr>
+                <w:rFonts w:ascii="Arial" w:hAnsi="Arial"/>
+                <w:sz w:val="15"/>
+              </w:rPr>
+              <w:t>IPC_PY / infl_PY_yoy</w:t>
+            </w:r>
+          </w:p>
+        </w:tc>
+        <w:tc>
+          <w:tcPr>
+            <w:tcW w:type="dxa" w:w="1872"/>
+          </w:tcPr>
+          <w:p>
+            <w:r>
+              <w:rPr>
+                <w:rFonts w:ascii="Arial" w:hAnsi="Arial"/>
+                <w:sz w:val="15"/>
+              </w:rPr>
+              <w:t>BCP - Anexo Estadístico, Cuadro 15, cols V (índice) e Y (interanual publicada)</w:t>
+            </w:r>
+          </w:p>
+        </w:tc>
+        <w:tc>
+          <w:tcPr>
+            <w:tcW w:type="dxa" w:w="1872"/>
+          </w:tcPr>
+          <w:p>
+            <w:r>
+              <w:rPr>
+                <w:rFonts w:ascii="Arial" w:hAnsi="Arial"/>
+                <w:sz w:val="15"/>
+              </w:rPr>
+              <w:t>ídem Anexo</w:t>
+            </w:r>
+          </w:p>
+        </w:tc>
+        <w:tc>
+          <w:tcPr>
+            <w:tcW w:type="dxa" w:w="1872"/>
+          </w:tcPr>
+          <w:p>
+            <w:r>
+              <w:rPr>
+                <w:rFonts w:ascii="Arial" w:hAnsi="Arial"/>
+                <w:sz w:val="15"/>
+              </w:rPr>
+              <w:t>2026-06-30</w:t>
+            </w:r>
+          </w:p>
+        </w:tc>
+        <w:tc>
+          <w:tcPr>
+            <w:tcW w:type="dxa" w:w="1872"/>
+          </w:tcPr>
+          <w:p>
+            <w:r>
+              <w:rPr>
+                <w:rFonts w:ascii="Arial" w:hAnsi="Arial"/>
+                <w:sz w:val="15"/>
+              </w:rPr>
+              <w:t>Mes de cierre; la inflación es la publicada por el BCP, no recalculada.</w:t>
+            </w:r>
+          </w:p>
+        </w:tc>
+      </w:tr>
+      <w:tr>
+        <w:tc>
+          <w:tcPr>
+            <w:tcW w:type="dxa" w:w="1872"/>
+          </w:tcPr>
+          <w:p>
+            <w:r>
+              <w:rPr>
+                <w:rFonts w:ascii="Arial" w:hAnsi="Arial"/>
+                <w:sz w:val="15"/>
+              </w:rPr>
+              <w:t>IPC_US / infl_US_yoy</w:t>
+            </w:r>
+          </w:p>
+        </w:tc>
+        <w:tc>
+          <w:tcPr>
+            <w:tcW w:type="dxa" w:w="1872"/>
+          </w:tcPr>
+          <w:p>
+            <w:r>
+              <w:rPr>
+                <w:rFonts w:ascii="Arial" w:hAnsi="Arial"/>
+                <w:sz w:val="15"/>
+              </w:rPr>
+              <w:t>FRED, serie CPIAUCSL</w:t>
+            </w:r>
+          </w:p>
+        </w:tc>
+        <w:tc>
+          <w:tcPr>
+            <w:tcW w:type="dxa" w:w="1872"/>
+          </w:tcPr>
+          <w:p>
+            <w:r>
+              <w:rPr>
+                <w:rFonts w:ascii="Arial" w:hAnsi="Arial"/>
+                <w:sz w:val="15"/>
+              </w:rPr>
+              <w:t>https://fred.stlouisfed.org/graph/fredgraph.csv?id=CPIAUCSL (data/raw/fred/CPIAUCSL.csv)</w:t>
+            </w:r>
+          </w:p>
+        </w:tc>
+        <w:tc>
+          <w:tcPr>
+            <w:tcW w:type="dxa" w:w="1872"/>
+          </w:tcPr>
+          <w:p>
+            <w:r>
+              <w:rPr>
+                <w:rFonts w:ascii="Arial" w:hAnsi="Arial"/>
+                <w:sz w:val="15"/>
+              </w:rPr>
+              <w:t>2026-06-30</w:t>
+            </w:r>
+          </w:p>
+        </w:tc>
+        <w:tc>
+          <w:tcPr>
+            <w:tcW w:type="dxa" w:w="1872"/>
+          </w:tcPr>
+          <w:p>
+            <w:r>
+              <w:rPr>
+                <w:rFonts w:ascii="Arial" w:hAnsi="Arial"/>
+                <w:sz w:val="15"/>
+              </w:rPr>
+              <w:t>Nivel del mes de cierre; interanual derivada (CPI_t/CPI_t-12 -1)x100.</w:t>
+            </w:r>
+          </w:p>
+        </w:tc>
+      </w:tr>
+      <w:tr>
+        <w:tc>
+          <w:tcPr>
+            <w:tcW w:type="dxa" w:w="1872"/>
+          </w:tcPr>
+          <w:p>
+            <w:r>
+              <w:rPr>
+                <w:rFonts w:ascii="Arial" w:hAnsi="Arial"/>
+                <w:sz w:val="15"/>
+              </w:rPr>
+              <w:t>FEDFUNDS</w:t>
+            </w:r>
+          </w:p>
+        </w:tc>
+        <w:tc>
+          <w:tcPr>
+            <w:tcW w:type="dxa" w:w="1872"/>
+          </w:tcPr>
+          <w:p>
+            <w:r>
+              <w:rPr>
+                <w:rFonts w:ascii="Arial" w:hAnsi="Arial"/>
+                <w:sz w:val="15"/>
+              </w:rPr>
+              <w:t>FRED, serie FEDFUNDS</w:t>
+            </w:r>
+          </w:p>
+        </w:tc>
+        <w:tc>
+          <w:tcPr>
+            <w:tcW w:type="dxa" w:w="1872"/>
+          </w:tcPr>
+          <w:p>
+            <w:r>
+              <w:rPr>
+                <w:rFonts w:ascii="Arial" w:hAnsi="Arial"/>
+                <w:sz w:val="15"/>
+              </w:rPr>
+              <w:t>https://fred.stlouisfed.org/graph/fredgraph.csv?id=FEDFUNDS (data/raw/fred/FEDFUNDS.csv)</w:t>
+            </w:r>
+          </w:p>
+        </w:tc>
+        <w:tc>
+          <w:tcPr>
+            <w:tcW w:type="dxa" w:w="1872"/>
+          </w:tcPr>
+          <w:p>
+            <w:r>
+              <w:rPr>
+                <w:rFonts w:ascii="Arial" w:hAnsi="Arial"/>
+                <w:sz w:val="15"/>
+              </w:rPr>
+              <w:t>2026-06-30</w:t>
+            </w:r>
+          </w:p>
+        </w:tc>
+        <w:tc>
+          <w:tcPr>
+            <w:tcW w:type="dxa" w:w="1872"/>
+          </w:tcPr>
+          <w:p>
+            <w:r>
+              <w:rPr>
+                <w:rFonts w:ascii="Arial" w:hAnsi="Arial"/>
+                <w:sz w:val="15"/>
+              </w:rPr>
+              <w:t>Promedio de los 3 meses del trimestre.</w:t>
+            </w:r>
+          </w:p>
+        </w:tc>
+      </w:tr>
+      <w:tr>
+        <w:tc>
+          <w:tcPr>
+            <w:tcW w:type="dxa" w:w="1872"/>
+          </w:tcPr>
+          <w:p>
+            <w:r>
+              <w:rPr>
+                <w:rFonts w:ascii="Arial" w:hAnsi="Arial"/>
+                <w:sz w:val="15"/>
+              </w:rPr>
+              <w:t>i_*_pond</w:t>
+            </w:r>
+          </w:p>
+        </w:tc>
+        <w:tc>
+          <w:tcPr>
+            <w:tcW w:type="dxa" w:w="1872"/>
+          </w:tcPr>
+          <w:p>
+            <w:r>
+              <w:rPr>
+                <w:rFonts w:ascii="Arial" w:hAnsi="Arial"/>
+                <w:sz w:val="15"/>
+              </w:rPr>
+              <w:t>BCP: Informes de Indicadores Financieros mensuales 2004-2010 (PDF, data/raw/bcp/if_pdfs/ + _INVENTARIO.csv con URL por archivo) empalmados con Cuadro 31 del Anexo 2011-2024</w:t>
+            </w:r>
+          </w:p>
+        </w:tc>
+        <w:tc>
+          <w:tcPr>
+            <w:tcW w:type="dxa" w:w="1872"/>
+          </w:tcPr>
+          <w:p>
+            <w:r>
+              <w:rPr>
+                <w:rFonts w:ascii="Arial" w:hAnsi="Arial"/>
+                <w:sz w:val="15"/>
+              </w:rPr>
+              <w:t>ver _INVENTARIO.csv y Anexo</w:t>
+            </w:r>
+          </w:p>
+        </w:tc>
+        <w:tc>
+          <w:tcPr>
+            <w:tcW w:type="dxa" w:w="1872"/>
+          </w:tcPr>
+          <w:p>
+            <w:r>
+              <w:rPr>
+                <w:rFonts w:ascii="Arial" w:hAnsi="Arial"/>
+                <w:sz w:val="15"/>
+              </w:rPr>
+              <w:t>2026-06-30</w:t>
+            </w:r>
+          </w:p>
+        </w:tc>
+        <w:tc>
+          <w:tcPr>
+            <w:tcW w:type="dxa" w:w="1872"/>
+          </w:tcPr>
+          <w:p>
+            <w:r>
+              <w:rPr>
+                <w:rFonts w:ascii="Arial" w:hAnsi="Arial"/>
+                <w:sz w:val="15"/>
+              </w:rPr>
+              <w:t>SOLO SENSIBILIDAD: empalme 2010/2011 (~0,7-0,8pp definicional) y composición de plazos variable. Hueco: 2006Q4 (PDF escaneado ilegible).</w:t>
+            </w:r>
+          </w:p>
+        </w:tc>
+      </w:tr>
+      <w:tr>
+        <w:tc>
+          <w:tcPr>
+            <w:tcW w:type="dxa" w:w="1872"/>
+          </w:tcPr>
+          <w:p>
+            <w:r>
+              <w:rPr>
+                <w:rFonts w:ascii="Arial" w:hAnsi="Arial"/>
+                <w:sz w:val="15"/>
+              </w:rPr>
+              <w:t>encaje_*</w:t>
+            </w:r>
+          </w:p>
+        </w:tc>
+        <w:tc>
+          <w:tcPr>
+            <w:tcW w:type="dxa" w:w="1872"/>
+          </w:tcPr>
+          <w:p>
+            <w:r>
+              <w:rPr>
+                <w:rFonts w:ascii="Arial" w:hAnsi="Arial"/>
+                <w:sz w:val="15"/>
+              </w:rPr>
+              <w:t>Resoluciones del BCP (Res. 30/2012 MN 18%, Res. 31/2012 ME 24%, tramo &lt;=360d; desencaje COVID 2020: MN 7 / ME 15)</w:t>
+            </w:r>
+          </w:p>
+        </w:tc>
+        <w:tc>
+          <w:tcPr>
+            <w:tcW w:type="dxa" w:w="1872"/>
+          </w:tcPr>
+          <w:p>
+            <w:r>
+              <w:rPr>
+                <w:rFonts w:ascii="Arial" w:hAnsi="Arial"/>
+                <w:sz w:val="15"/>
+              </w:rPr>
+              <w:t>detalle y enlaces en docs/11_encaje_fuentes.md</w:t>
+            </w:r>
+          </w:p>
+        </w:tc>
+        <w:tc>
+          <w:tcPr>
+            <w:tcW w:type="dxa" w:w="1872"/>
+          </w:tcPr>
+          <w:p>
+            <w:r>
+              <w:rPr>
+                <w:rFonts w:ascii="Arial" w:hAnsi="Arial"/>
+                <w:sz w:val="15"/>
+              </w:rPr>
+              <w:t>2026-07-13</w:t>
+            </w:r>
+          </w:p>
+        </w:tc>
+        <w:tc>
+          <w:tcPr>
+            <w:tcW w:type="dxa" w:w="1872"/>
+          </w:tcPr>
+          <w:p>
+            <w:r>
+              <w:rPr>
+                <w:rFonts w:ascii="Arial" w:hAnsi="Arial"/>
+                <w:sz w:val="15"/>
+              </w:rPr>
+              <w:t>Cobertura verificada 2012Q4-2024Q4; 2004-2012Q3 vacío (resoluciones escaneadas pendientes de OCR). Salvedad de tramo: encaje corta en 360d, CDA en 365d.</w:t>
+            </w:r>
+          </w:p>
+        </w:tc>
+      </w:tr>
+      <w:tr>
+        <w:tc>
+          <w:tcPr>
+            <w:tcW w:type="dxa" w:w="1872"/>
+          </w:tcPr>
+          <w:p>
+            <w:r>
+              <w:rPr>
+                <w:rFonts w:ascii="Arial" w:hAnsi="Arial"/>
+                <w:sz w:val="15"/>
+              </w:rPr>
+              <w:t>tpm</w:t>
+            </w:r>
+          </w:p>
+        </w:tc>
+        <w:tc>
+          <w:tcPr>
+            <w:tcW w:type="dxa" w:w="1872"/>
+          </w:tcPr>
+          <w:p>
+            <w:r>
+              <w:rPr>
+                <w:rFonts w:ascii="Arial" w:hAnsi="Arial"/>
+                <w:sz w:val="15"/>
+              </w:rPr>
+              <w:t>BCP - Tasa de Política Monetaria, archivo oficial TPM.xlsx (serie mensual desde may-2011)</w:t>
+            </w:r>
+          </w:p>
+        </w:tc>
+        <w:tc>
+          <w:tcPr>
+            <w:tcW w:type="dxa" w:w="1872"/>
+          </w:tcPr>
+          <w:p>
+            <w:r>
+              <w:rPr>
+                <w:rFonts w:ascii="Arial" w:hAnsi="Arial"/>
+                <w:sz w:val="15"/>
+              </w:rPr>
+              <w:t>https://www.bcp.gov.py/web/institucional/tasa-de-politica-monetaria (data/raw/bcp/TPM.xlsx; mensual intermedio en data/processed/tpm_mensual.csv)</w:t>
+            </w:r>
+          </w:p>
+        </w:tc>
+        <w:tc>
+          <w:tcPr>
+            <w:tcW w:type="dxa" w:w="1872"/>
+          </w:tcPr>
+          <w:p>
+            <w:r>
+              <w:rPr>
+                <w:rFonts w:ascii="Arial" w:hAnsi="Arial"/>
+                <w:sz w:val="15"/>
+              </w:rPr>
+              <w:t>2026-07-16</w:t>
+            </w:r>
+          </w:p>
+        </w:tc>
+        <w:tc>
+          <w:tcPr>
+            <w:tcW w:type="dxa" w:w="1872"/>
+          </w:tcPr>
+          <w:p>
+            <w:r>
+              <w:rPr>
+                <w:rFonts w:ascii="Arial" w:hAnsi="Arial"/>
+                <w:sz w:val="15"/>
+              </w:rPr>
+              <w:t>Trimestre = promedio de meses disponibles (2011Q2 = may+jun). Pre-2011: la TPM no existía (no es dato faltante).</w:t>
+            </w:r>
+          </w:p>
+        </w:tc>
+      </w:tr>
+    </w:tbl>
+    <w:p>
+      <w:r>
+        <w:br w:type="page"/>
+      </w:r>
+    </w:p>
+    <w:p>
+      <w:pPr>
+        <w:pStyle w:val="Heading2"/>
+      </w:pPr>
+      <w:r>
+        <w:t>Apéndice Q. Figura A1 — Diferencial de retorno trimestral DR (guaraníes vs. dólares), 2004–2024</w:t>
       </w:r>
     </w:p>
     <w:p>
@@ -1352,7 +4561,7 @@
         <w:pStyle w:val="Heading2"/>
       </w:pPr>
       <w:r>
-        <w:t>Apéndice P. Figura A2 — Descomposición de Fisher: prima de inflación vs. prima de riesgo</w:t>
+        <w:t>Apéndice R. Figura A2 — Descomposición de Fisher: prima de inflación vs. prima de riesgo</w:t>
       </w:r>
     </w:p>
     <w:p>
@@ -1409,7 +4618,7 @@
         <w:pStyle w:val="Heading2"/>
       </w:pPr>
       <w:r>
-        <w:t>Apéndice Q. Figura A3 — Composición de la prima de riesgo (ventana móvil de 20 trimestres)</w:t>
+        <w:t>Apéndice S. Figura A3 — Composición de la prima de riesgo (ventana móvil de 20 trimestres)</w:t>
       </w:r>
     </w:p>
     <w:p>

</xml_diff>